<commit_message>
Add comments to Szakdolgozat.docx
</commit_message>
<xml_diff>
--- a/docs/Szakdolgozat.DOCX
+++ b/docs/Szakdolgozat.DOCX
@@ -51,7 +51,7 @@
         </w:p>
         <w:p>
           <w:pPr>
-            <w:pStyle w:val="TJ1"/>
+            <w:pStyle w:val="TOC1"/>
             <w:tabs>
               <w:tab w:val="right" w:leader="dot" w:pos="8493"/>
             </w:tabs>
@@ -87,7 +87,7 @@
           <w:hyperlink w:anchor="_Toc194523602" w:history="1">
             <w:r>
               <w:rPr>
-                <w:rStyle w:val="Hiperhivatkozs"/>
+                <w:rStyle w:val="Hyperlink"/>
                 <w:rFonts w:ascii="Arial" w:eastAsiaTheme="majorEastAsia" w:hAnsi="Arial" w:cstheme="majorBidi"/>
                 <w:noProof/>
               </w:rPr>
@@ -145,7 +145,7 @@
         </w:p>
         <w:p>
           <w:pPr>
-            <w:pStyle w:val="TJ1"/>
+            <w:pStyle w:val="TOC1"/>
             <w:tabs>
               <w:tab w:val="right" w:leader="dot" w:pos="8493"/>
             </w:tabs>
@@ -160,7 +160,7 @@
           <w:hyperlink w:anchor="_Toc194523603" w:history="1">
             <w:r>
               <w:rPr>
-                <w:rStyle w:val="Hiperhivatkozs"/>
+                <w:rStyle w:val="Hyperlink"/>
                 <w:rFonts w:ascii="Arial" w:eastAsiaTheme="majorEastAsia" w:hAnsi="Arial" w:cstheme="majorBidi"/>
                 <w:noProof/>
               </w:rPr>
@@ -218,7 +218,7 @@
         </w:p>
         <w:p>
           <w:pPr>
-            <w:pStyle w:val="TJ1"/>
+            <w:pStyle w:val="TOC1"/>
             <w:tabs>
               <w:tab w:val="right" w:leader="dot" w:pos="8493"/>
             </w:tabs>
@@ -233,7 +233,7 @@
           <w:hyperlink w:anchor="_Toc194523604" w:history="1">
             <w:r>
               <w:rPr>
-                <w:rStyle w:val="Hiperhivatkozs"/>
+                <w:rStyle w:val="Hyperlink"/>
                 <w:rFonts w:ascii="Arial" w:eastAsiaTheme="majorEastAsia" w:hAnsi="Arial" w:cstheme="majorBidi"/>
                 <w:noProof/>
               </w:rPr>
@@ -291,7 +291,7 @@
         </w:p>
         <w:p>
           <w:pPr>
-            <w:pStyle w:val="TJ2"/>
+            <w:pStyle w:val="TOC2"/>
             <w:tabs>
               <w:tab w:val="right" w:leader="dot" w:pos="8493"/>
             </w:tabs>
@@ -306,7 +306,7 @@
           <w:hyperlink w:anchor="_Toc194523605" w:history="1">
             <w:r>
               <w:rPr>
-                <w:rStyle w:val="Hiperhivatkozs"/>
+                <w:rStyle w:val="Hyperlink"/>
                 <w:rFonts w:ascii="Courier New" w:eastAsiaTheme="majorEastAsia" w:hAnsi="Courier New" w:cstheme="majorBidi"/>
                 <w:noProof/>
               </w:rPr>
@@ -364,7 +364,7 @@
         </w:p>
         <w:p>
           <w:pPr>
-            <w:pStyle w:val="TJ2"/>
+            <w:pStyle w:val="TOC2"/>
             <w:tabs>
               <w:tab w:val="right" w:leader="dot" w:pos="8493"/>
             </w:tabs>
@@ -379,7 +379,7 @@
           <w:hyperlink w:anchor="_Toc194523606" w:history="1">
             <w:r>
               <w:rPr>
-                <w:rStyle w:val="Hiperhivatkozs"/>
+                <w:rStyle w:val="Hyperlink"/>
                 <w:rFonts w:ascii="Courier New" w:eastAsiaTheme="majorEastAsia" w:hAnsi="Courier New" w:cstheme="majorBidi"/>
                 <w:noProof/>
               </w:rPr>
@@ -437,7 +437,7 @@
         </w:p>
         <w:p>
           <w:pPr>
-            <w:pStyle w:val="TJ2"/>
+            <w:pStyle w:val="TOC2"/>
             <w:tabs>
               <w:tab w:val="right" w:leader="dot" w:pos="8493"/>
             </w:tabs>
@@ -452,7 +452,7 @@
           <w:hyperlink w:anchor="_Toc194523607" w:history="1">
             <w:r>
               <w:rPr>
-                <w:rStyle w:val="Hiperhivatkozs"/>
+                <w:rStyle w:val="Hyperlink"/>
                 <w:rFonts w:ascii="Courier New" w:eastAsiaTheme="majorEastAsia" w:hAnsi="Courier New" w:cstheme="majorBidi"/>
                 <w:noProof/>
               </w:rPr>
@@ -510,7 +510,7 @@
         </w:p>
         <w:p>
           <w:pPr>
-            <w:pStyle w:val="TJ2"/>
+            <w:pStyle w:val="TOC2"/>
             <w:tabs>
               <w:tab w:val="right" w:leader="dot" w:pos="8493"/>
             </w:tabs>
@@ -525,7 +525,7 @@
           <w:hyperlink w:anchor="_Toc194523608" w:history="1">
             <w:r>
               <w:rPr>
-                <w:rStyle w:val="Hiperhivatkozs"/>
+                <w:rStyle w:val="Hyperlink"/>
                 <w:rFonts w:ascii="Courier New" w:eastAsiaTheme="majorEastAsia" w:hAnsi="Courier New" w:cstheme="majorBidi"/>
                 <w:noProof/>
               </w:rPr>
@@ -725,8 +725,73 @@
           <w:rFonts w:ascii="Times New Roman" w:hAnsi="Times New Roman"/>
           <w:sz w:val="24"/>
         </w:rPr>
-        <w:t xml:space="preserve">A szerver és a kliens gépek közötti információátadásra nagyon sok technológia áll rendelkezésre, ilyenek például a </w:t>
-      </w:r>
+        <w:t xml:space="preserve">A </w:t>
+      </w:r>
+      <w:commentRangeStart w:id="3"/>
+      <w:r>
+        <w:rPr>
+          <w:rFonts w:ascii="Times New Roman" w:hAnsi="Times New Roman"/>
+          <w:sz w:val="24"/>
+        </w:rPr>
+        <w:t xml:space="preserve">szerver és </w:t>
+      </w:r>
+      <w:del w:id="4" w:author="Ősz Olivér" w:date="2025-04-06T12:45:00Z" w16du:dateUtc="2025-04-06T10:45:00Z">
+        <w:r>
+          <w:rPr>
+            <w:rFonts w:ascii="Times New Roman" w:hAnsi="Times New Roman"/>
+            <w:sz w:val="24"/>
+          </w:rPr>
+          <w:delText xml:space="preserve">a </w:delText>
+        </w:r>
+      </w:del>
+      <w:r>
+        <w:rPr>
+          <w:rFonts w:ascii="Times New Roman" w:hAnsi="Times New Roman"/>
+          <w:sz w:val="24"/>
+        </w:rPr>
+        <w:t xml:space="preserve">kliens </w:t>
+      </w:r>
+      <w:commentRangeEnd w:id="3"/>
+      <w:r>
+        <w:rPr>
+          <w:rStyle w:val="CommentReference"/>
+          <w:rFonts w:ascii="Times New Roman" w:hAnsi="Times New Roman"/>
+        </w:rPr>
+        <w:commentReference w:id="3"/>
+      </w:r>
+      <w:r>
+        <w:rPr>
+          <w:rFonts w:ascii="Times New Roman" w:hAnsi="Times New Roman"/>
+          <w:sz w:val="24"/>
+        </w:rPr>
+        <w:t xml:space="preserve">gépek közötti információátadásra </w:t>
+      </w:r>
+      <w:del w:id="5" w:author="Ősz Olivér" w:date="2025-04-06T12:15:00Z" w16du:dateUtc="2025-04-06T10:15:00Z">
+        <w:r>
+          <w:rPr>
+            <w:rFonts w:ascii="Times New Roman" w:hAnsi="Times New Roman"/>
+            <w:sz w:val="24"/>
+          </w:rPr>
+          <w:delText>nagyon sok technológia</w:delText>
+        </w:r>
+      </w:del>
+      <w:ins w:id="6" w:author="Ősz Olivér" w:date="2025-04-06T12:15:00Z" w16du:dateUtc="2025-04-06T10:15:00Z">
+        <w:r>
+          <w:rPr>
+            <w:rFonts w:ascii="Times New Roman" w:hAnsi="Times New Roman"/>
+            <w:sz w:val="24"/>
+          </w:rPr>
+          <w:t>többféle Python csomag</w:t>
+        </w:r>
+      </w:ins>
+      <w:r>
+        <w:rPr>
+          <w:rFonts w:ascii="Times New Roman" w:hAnsi="Times New Roman"/>
+          <w:sz w:val="24"/>
+        </w:rPr>
+        <w:t xml:space="preserve"> áll rendelkezésre, ilyenek például a </w:t>
+      </w:r>
+      <w:commentRangeStart w:id="7"/>
       <w:proofErr w:type="spellStart"/>
       <w:r>
         <w:rPr>
@@ -756,6 +821,18 @@
         <w:t>Flask-SocketIO</w:t>
       </w:r>
       <w:proofErr w:type="spellEnd"/>
+      <w:ins w:id="8" w:author="Ősz Olivér" w:date="2025-04-06T12:19:00Z" w16du:dateUtc="2025-04-06T10:19:00Z">
+        <w:r>
+          <w:rPr>
+            <w:rStyle w:val="FootnoteReference"/>
+            <w:rFonts w:ascii="Times New Roman" w:hAnsi="Times New Roman"/>
+            <w:i/>
+            <w:iCs/>
+            <w:sz w:val="24"/>
+          </w:rPr>
+          <w:footnoteReference w:id="1"/>
+        </w:r>
+      </w:ins>
       <w:r>
         <w:rPr>
           <w:rFonts w:ascii="Times New Roman" w:hAnsi="Times New Roman"/>
@@ -783,6 +860,14 @@
         </w:rPr>
         <w:t>.</w:t>
       </w:r>
+      <w:commentRangeEnd w:id="7"/>
+      <w:r>
+        <w:rPr>
+          <w:rStyle w:val="CommentReference"/>
+          <w:rFonts w:ascii="Times New Roman" w:hAnsi="Times New Roman"/>
+        </w:rPr>
+        <w:commentReference w:id="7"/>
+      </w:r>
     </w:p>
     <w:p>
       <w:pPr>
@@ -798,7 +883,23 @@
           <w:rFonts w:ascii="Times New Roman" w:hAnsi="Times New Roman"/>
           <w:sz w:val="24"/>
         </w:rPr>
-        <w:t xml:space="preserve">A megfelelő eszköz kiválasztásánál lényeges szempont a könnyű kezelhetőség, </w:t>
+        <w:t>A megfelelő eszköz kiválasztásánál lényeges szempont a könnyű kezelhetőség,</w:t>
+      </w:r>
+      <w:ins w:id="10" w:author="Ősz Olivér" w:date="2025-04-06T12:21:00Z" w16du:dateUtc="2025-04-06T10:21:00Z">
+        <w:r>
+          <w:rPr>
+            <w:rFonts w:ascii="Times New Roman" w:hAnsi="Times New Roman"/>
+            <w:sz w:val="24"/>
+          </w:rPr>
+          <w:t xml:space="preserve"> a</w:t>
+        </w:r>
+      </w:ins>
+      <w:r>
+        <w:rPr>
+          <w:rFonts w:ascii="Times New Roman" w:hAnsi="Times New Roman"/>
+          <w:sz w:val="24"/>
+        </w:rPr>
+        <w:t xml:space="preserve"> </w:t>
       </w:r>
       <w:proofErr w:type="spellStart"/>
       <w:r>
@@ -818,12 +919,30 @@
         <w:t>e</w:t>
       </w:r>
       <w:proofErr w:type="spellEnd"/>
-      <w:r>
-        <w:rPr>
-          <w:rFonts w:ascii="Times New Roman" w:hAnsi="Times New Roman"/>
-          <w:sz w:val="24"/>
-        </w:rPr>
-        <w:t>-környezettel való kompatibilitás, valamint a gyors és stabil adatáramlás.</w:t>
+      <w:del w:id="11" w:author="Ősz Olivér" w:date="2025-04-06T12:16:00Z" w16du:dateUtc="2025-04-06T10:16:00Z">
+        <w:r>
+          <w:rPr>
+            <w:rFonts w:ascii="Times New Roman" w:hAnsi="Times New Roman"/>
+            <w:sz w:val="24"/>
+          </w:rPr>
+          <w:delText>-</w:delText>
+        </w:r>
+      </w:del>
+      <w:ins w:id="12" w:author="Ősz Olivér" w:date="2025-04-06T12:16:00Z" w16du:dateUtc="2025-04-06T10:16:00Z">
+        <w:r>
+          <w:rPr>
+            <w:rFonts w:ascii="Times New Roman" w:hAnsi="Times New Roman"/>
+            <w:sz w:val="24"/>
+          </w:rPr>
+          <w:t xml:space="preserve"> </w:t>
+        </w:r>
+      </w:ins>
+      <w:r>
+        <w:rPr>
+          <w:rFonts w:ascii="Times New Roman" w:hAnsi="Times New Roman"/>
+          <w:sz w:val="24"/>
+        </w:rPr>
+        <w:t>környezettel való kompatibilitás, valamint a gyors és stabil adatáramlás.</w:t>
       </w:r>
     </w:p>
     <w:p>
@@ -839,7 +958,10 @@
           <w:szCs w:val="32"/>
         </w:rPr>
       </w:pPr>
-      <w:bookmarkStart w:id="3" w:name="_Toc194523605"/>
+      <w:bookmarkStart w:id="13" w:name="_Toc194523605"/>
+      <w:commentRangeStart w:id="14"/>
+      <w:commentRangeStart w:id="15"/>
+      <w:commentRangeStart w:id="16"/>
       <w:proofErr w:type="spellStart"/>
       <w:proofErr w:type="gramStart"/>
       <w:r>
@@ -902,7 +1024,31 @@
         </w:rPr>
         <w:t>):</w:t>
       </w:r>
-      <w:bookmarkEnd w:id="3"/>
+      <w:bookmarkEnd w:id="13"/>
+      <w:commentRangeEnd w:id="14"/>
+      <w:r>
+        <w:rPr>
+          <w:rStyle w:val="CommentReference"/>
+          <w:rFonts w:ascii="Times New Roman" w:hAnsi="Times New Roman"/>
+        </w:rPr>
+        <w:commentReference w:id="14"/>
+      </w:r>
+      <w:commentRangeEnd w:id="15"/>
+      <w:r>
+        <w:rPr>
+          <w:rStyle w:val="CommentReference"/>
+          <w:rFonts w:ascii="Times New Roman" w:hAnsi="Times New Roman"/>
+        </w:rPr>
+        <w:commentReference w:id="15"/>
+      </w:r>
+      <w:commentRangeEnd w:id="16"/>
+      <w:r>
+        <w:rPr>
+          <w:rStyle w:val="CommentReference"/>
+          <w:rFonts w:ascii="Times New Roman" w:hAnsi="Times New Roman"/>
+        </w:rPr>
+        <w:commentReference w:id="16"/>
+      </w:r>
     </w:p>
     <w:p>
       <w:pPr>
@@ -1276,6 +1422,7 @@
           <w:rFonts w:ascii="Times New Roman" w:hAnsi="Times New Roman"/>
           <w:sz w:val="24"/>
         </w:rPr>
+        <w:lastRenderedPageBreak/>
         <w:t xml:space="preserve">Bár egyszerű megvalósítani, de abból kifolyólag, hogy a kliens rendszeresen küld ellenőrző kéréseket a szervernek ez különböző problémákhoz vezethet. </w:t>
       </w:r>
     </w:p>
@@ -1293,8 +1440,23 @@
           <w:rFonts w:ascii="Times New Roman" w:hAnsi="Times New Roman"/>
           <w:sz w:val="24"/>
         </w:rPr>
-        <w:lastRenderedPageBreak/>
-        <w:t>Ha túl rövid időközönként küld a kliens a szervernek kérést az nagymértékben leterheli a hálózatot és a szervert, sok esetben feleslegesen, mivel minden egyes kérésre válaszolnia kell, akkor is, ha nincs új adat, és akkor is, ha van.</w:t>
+        <w:t>Ha túl rövid időközönként küld a kliens a szervernek kérést</w:t>
+      </w:r>
+      <w:ins w:id="17" w:author="Ősz Olivér" w:date="2025-04-06T12:51:00Z" w16du:dateUtc="2025-04-06T10:51:00Z">
+        <w:r>
+          <w:rPr>
+            <w:rFonts w:ascii="Times New Roman" w:hAnsi="Times New Roman"/>
+            <w:sz w:val="24"/>
+          </w:rPr>
+          <w:t>,</w:t>
+        </w:r>
+      </w:ins>
+      <w:r>
+        <w:rPr>
+          <w:rFonts w:ascii="Times New Roman" w:hAnsi="Times New Roman"/>
+          <w:sz w:val="24"/>
+        </w:rPr>
+        <w:t xml:space="preserve"> az nagymértékben leterheli a hálózatot és a szervert, sok esetben feleslegesen, mivel minden egyes kérésre válaszolnia kell, akkor is, ha nincs új adat, és akkor is, ha van.</w:t>
       </w:r>
     </w:p>
     <w:p>
@@ -1311,7 +1473,57 @@
           <w:rFonts w:ascii="Times New Roman" w:hAnsi="Times New Roman"/>
           <w:sz w:val="24"/>
         </w:rPr>
-        <w:t xml:space="preserve">Ha viszont a kliens túl hosszú időközönként kérdezi le a szervert, hogy van e változás. akkor előfordulhat, hogy késve kapja meg az új információkat, vagy egyes adatok el is </w:t>
+        <w:t>Ha viszont a kliens túl hosszú időközönként kérdezi le a szervert, hogy van</w:t>
+      </w:r>
+      <w:del w:id="18" w:author="Ősz Olivér" w:date="2025-04-06T12:51:00Z" w16du:dateUtc="2025-04-06T10:51:00Z">
+        <w:r>
+          <w:rPr>
+            <w:rFonts w:ascii="Times New Roman" w:hAnsi="Times New Roman"/>
+            <w:sz w:val="24"/>
+          </w:rPr>
+          <w:delText xml:space="preserve"> </w:delText>
+        </w:r>
+      </w:del>
+      <w:ins w:id="19" w:author="Ősz Olivér" w:date="2025-04-06T12:51:00Z" w16du:dateUtc="2025-04-06T10:51:00Z">
+        <w:r>
+          <w:rPr>
+            <w:rFonts w:ascii="Times New Roman" w:hAnsi="Times New Roman"/>
+            <w:sz w:val="24"/>
+          </w:rPr>
+          <w:t>-</w:t>
+        </w:r>
+      </w:ins>
+      <w:r>
+        <w:rPr>
+          <w:rFonts w:ascii="Times New Roman" w:hAnsi="Times New Roman"/>
+          <w:sz w:val="24"/>
+        </w:rPr>
+        <w:t>e változás</w:t>
+      </w:r>
+      <w:del w:id="20" w:author="Ősz Olivér" w:date="2025-04-06T12:51:00Z" w16du:dateUtc="2025-04-06T10:51:00Z">
+        <w:r>
+          <w:rPr>
+            <w:rFonts w:ascii="Times New Roman" w:hAnsi="Times New Roman"/>
+            <w:sz w:val="24"/>
+          </w:rPr>
+          <w:delText>.</w:delText>
+        </w:r>
+      </w:del>
+      <w:ins w:id="21" w:author="Ősz Olivér" w:date="2025-04-06T12:51:00Z" w16du:dateUtc="2025-04-06T10:51:00Z">
+        <w:r>
+          <w:rPr>
+            <w:rFonts w:ascii="Times New Roman" w:hAnsi="Times New Roman"/>
+            <w:sz w:val="24"/>
+          </w:rPr>
+          <w:t>,</w:t>
+        </w:r>
+      </w:ins>
+      <w:r>
+        <w:rPr>
+          <w:rFonts w:ascii="Times New Roman" w:hAnsi="Times New Roman"/>
+          <w:sz w:val="24"/>
+        </w:rPr>
+        <w:t xml:space="preserve"> akkor előfordulhat, hogy késve kapja meg az új információkat, vagy egyes adatok el is </w:t>
       </w:r>
       <w:proofErr w:type="spellStart"/>
       <w:r>
@@ -1345,7 +1557,23 @@
           <w:rFonts w:ascii="Times New Roman" w:hAnsi="Times New Roman"/>
           <w:sz w:val="24"/>
         </w:rPr>
-        <w:t xml:space="preserve"> két kérés között, akkor a kliens azokat csak a következő lekérdezésnél észleli.</w:t>
+        <w:t xml:space="preserve"> két kérés</w:t>
+      </w:r>
+      <w:ins w:id="22" w:author="Ősz Olivér" w:date="2025-04-06T12:51:00Z" w16du:dateUtc="2025-04-06T10:51:00Z">
+        <w:r>
+          <w:rPr>
+            <w:rFonts w:ascii="Times New Roman" w:hAnsi="Times New Roman"/>
+            <w:sz w:val="24"/>
+          </w:rPr>
+          <w:t>e</w:t>
+        </w:r>
+      </w:ins>
+      <w:r>
+        <w:rPr>
+          <w:rFonts w:ascii="Times New Roman" w:hAnsi="Times New Roman"/>
+          <w:sz w:val="24"/>
+        </w:rPr>
+        <w:t xml:space="preserve"> között, akkor a kliens azokat csak a következő lekérdezésnél észleli.</w:t>
       </w:r>
     </w:p>
     <w:p>
@@ -1452,7 +1680,55 @@
           <w:rFonts w:ascii="Times New Roman" w:hAnsi="Times New Roman"/>
           <w:sz w:val="24"/>
         </w:rPr>
-        <w:t xml:space="preserve"> amelynek működése során a kliens egyetlen kérést küld a szervernek, ami a kapcsolatot nyitva tartja addig amíg nem tud új adattal szolgálni. Ez azt jelenti, hogy a szerver nem válaszol azonnal, hanem vár amig valamilyen változás nem történik és azt küldi el a kliensnek. Ebből kifolyólag kevesebb hálózati erőforrást használ, mint az általános </w:t>
+        <w:t xml:space="preserve"> amelynek működése során a kliens egyetlen kérést küld a szervernek, ami a kapcsolatot nyitva tartja addig</w:t>
+      </w:r>
+      <w:ins w:id="23" w:author="Ősz Olivér" w:date="2025-04-06T12:51:00Z" w16du:dateUtc="2025-04-06T10:51:00Z">
+        <w:r>
+          <w:rPr>
+            <w:rFonts w:ascii="Times New Roman" w:hAnsi="Times New Roman"/>
+            <w:sz w:val="24"/>
+          </w:rPr>
+          <w:t>,</w:t>
+        </w:r>
+      </w:ins>
+      <w:r>
+        <w:rPr>
+          <w:rFonts w:ascii="Times New Roman" w:hAnsi="Times New Roman"/>
+          <w:sz w:val="24"/>
+        </w:rPr>
+        <w:t xml:space="preserve"> amíg nem tud új adattal szolgálni. Ez azt jelenti, hogy a szerver nem válaszol azonnal, hanem vár</w:t>
+      </w:r>
+      <w:ins w:id="24" w:author="Ősz Olivér" w:date="2025-04-06T12:52:00Z" w16du:dateUtc="2025-04-06T10:52:00Z">
+        <w:r>
+          <w:rPr>
+            <w:rFonts w:ascii="Times New Roman" w:hAnsi="Times New Roman"/>
+            <w:sz w:val="24"/>
+          </w:rPr>
+          <w:t>,</w:t>
+        </w:r>
+      </w:ins>
+      <w:r>
+        <w:rPr>
+          <w:rFonts w:ascii="Times New Roman" w:hAnsi="Times New Roman"/>
+          <w:sz w:val="24"/>
+        </w:rPr>
+        <w:t xml:space="preserve"> amig valamilyen változás nem történik</w:t>
+      </w:r>
+      <w:ins w:id="25" w:author="Ősz Olivér" w:date="2025-04-06T12:52:00Z" w16du:dateUtc="2025-04-06T10:52:00Z">
+        <w:r>
+          <w:rPr>
+            <w:rFonts w:ascii="Times New Roman" w:hAnsi="Times New Roman"/>
+            <w:sz w:val="24"/>
+          </w:rPr>
+          <w:t>,</w:t>
+        </w:r>
+      </w:ins>
+      <w:r>
+        <w:rPr>
+          <w:rFonts w:ascii="Times New Roman" w:hAnsi="Times New Roman"/>
+          <w:sz w:val="24"/>
+        </w:rPr>
+        <w:t xml:space="preserve"> és azt küldi el a kliensnek. Ebből kifolyólag kevesebb hálózati erőforrást használ, mint az általános </w:t>
       </w:r>
       <w:proofErr w:type="spellStart"/>
       <w:r>
@@ -1470,7 +1746,23 @@
           <w:rFonts w:ascii="Times New Roman" w:hAnsi="Times New Roman"/>
           <w:sz w:val="24"/>
         </w:rPr>
-        <w:t xml:space="preserve">. Emellett a kliens gyorsabban megkapja az új adatokat, mivel nem szükséges várnia a következő időzített kérésig. Hátránya viszont, hogy a szervernek hosszú ideig nyitva kell tartania a kapcsolatokat, ami, ha sok kliens van, akkor mégis jelentős terhelést jelenthet a szerver számára. </w:t>
+        <w:t xml:space="preserve">. Emellett a kliens gyorsabban megkapja az új adatokat, mivel nem szükséges várnia a következő időzített kérésig. Hátránya viszont, hogy a szervernek hosszú ideig nyitva kell tartania a kapcsolatokat, ami, ha sok kliens van, akkor </w:t>
+      </w:r>
+      <w:del w:id="26" w:author="Ősz Olivér" w:date="2025-04-06T12:52:00Z" w16du:dateUtc="2025-04-06T10:52:00Z">
+        <w:r>
+          <w:rPr>
+            <w:rFonts w:ascii="Times New Roman" w:hAnsi="Times New Roman"/>
+            <w:sz w:val="24"/>
+          </w:rPr>
+          <w:delText xml:space="preserve">mégis </w:delText>
+        </w:r>
+      </w:del>
+      <w:r>
+        <w:rPr>
+          <w:rFonts w:ascii="Times New Roman" w:hAnsi="Times New Roman"/>
+          <w:sz w:val="24"/>
+        </w:rPr>
+        <w:t xml:space="preserve">jelentős terhelést jelenthet a szerver számára. </w:t>
       </w:r>
     </w:p>
     <w:p>
@@ -1519,12 +1811,21 @@
         </w:rPr>
         <w:t>polling</w:t>
       </w:r>
-      <w:r>
-        <w:rPr>
-          <w:rFonts w:ascii="Times New Roman" w:hAnsi="Times New Roman"/>
-          <w:sz w:val="24"/>
-        </w:rPr>
-        <w:t>-nál</w:t>
+      <w:del w:id="27" w:author="Ősz Olivér" w:date="2025-04-06T12:52:00Z" w16du:dateUtc="2025-04-06T10:52:00Z">
+        <w:r>
+          <w:rPr>
+            <w:rFonts w:ascii="Times New Roman" w:hAnsi="Times New Roman"/>
+            <w:sz w:val="24"/>
+          </w:rPr>
+          <w:delText>-</w:delText>
+        </w:r>
+      </w:del>
+      <w:r>
+        <w:rPr>
+          <w:rFonts w:ascii="Times New Roman" w:hAnsi="Times New Roman"/>
+          <w:sz w:val="24"/>
+        </w:rPr>
+        <w:t>nál</w:t>
       </w:r>
       <w:proofErr w:type="spellEnd"/>
       <w:r>
@@ -1568,23 +1869,7 @@
           <w:rFonts w:ascii="Times New Roman" w:hAnsi="Times New Roman"/>
           <w:sz w:val="24"/>
         </w:rPr>
-        <w:t xml:space="preserve"> lehetővé teszi egy állandó, </w:t>
-      </w:r>
-      <w:proofErr w:type="spellStart"/>
-      <w:r>
-        <w:rPr>
-          <w:rFonts w:ascii="Times New Roman" w:hAnsi="Times New Roman"/>
-          <w:sz w:val="24"/>
-        </w:rPr>
-        <w:t>kétirányú</w:t>
-      </w:r>
-      <w:proofErr w:type="spellEnd"/>
-      <w:r>
-        <w:rPr>
-          <w:rFonts w:ascii="Times New Roman" w:hAnsi="Times New Roman"/>
-          <w:sz w:val="24"/>
-        </w:rPr>
-        <w:t xml:space="preserve"> </w:t>
+        <w:t xml:space="preserve"> lehetővé teszi egy állandó, kétirányú </w:t>
       </w:r>
       <w:r>
         <w:rPr>
@@ -1634,7 +1919,7 @@
           <w:szCs w:val="32"/>
         </w:rPr>
       </w:pPr>
-      <w:bookmarkStart w:id="4" w:name="_Toc194523606"/>
+      <w:bookmarkStart w:id="28" w:name="_Toc194523606"/>
       <w:proofErr w:type="spellStart"/>
       <w:r>
         <w:rPr>
@@ -1645,7 +1930,7 @@
         </w:rPr>
         <w:t>Socket</w:t>
       </w:r>
-      <w:bookmarkEnd w:id="4"/>
+      <w:bookmarkEnd w:id="28"/>
       <w:proofErr w:type="spellEnd"/>
     </w:p>
     <w:p>
@@ -1728,13 +2013,29 @@
         </w:rPr>
         <w:t>socket</w:t>
       </w:r>
-      <w:proofErr w:type="spellEnd"/>
-      <w:r>
-        <w:rPr>
-          <w:rFonts w:ascii="Times New Roman" w:hAnsi="Times New Roman"/>
-          <w:sz w:val="24"/>
-        </w:rPr>
-        <w:t xml:space="preserve">-ek segítségével közvetlenül kezelje a kommunikációt. </w:t>
+      <w:del w:id="29" w:author="Ősz Olivér" w:date="2025-04-06T12:53:00Z" w16du:dateUtc="2025-04-06T10:53:00Z">
+        <w:r>
+          <w:rPr>
+            <w:rFonts w:ascii="Times New Roman" w:hAnsi="Times New Roman"/>
+            <w:sz w:val="24"/>
+          </w:rPr>
+          <w:delText>-</w:delText>
+        </w:r>
+      </w:del>
+      <w:r>
+        <w:rPr>
+          <w:rFonts w:ascii="Times New Roman" w:hAnsi="Times New Roman"/>
+          <w:sz w:val="24"/>
+        </w:rPr>
+        <w:t>ek</w:t>
+      </w:r>
+      <w:proofErr w:type="spellEnd"/>
+      <w:r>
+        <w:rPr>
+          <w:rFonts w:ascii="Times New Roman" w:hAnsi="Times New Roman"/>
+          <w:sz w:val="24"/>
+        </w:rPr>
+        <w:t xml:space="preserve"> segítségével közvetlenül kezelje a kommunikációt. </w:t>
       </w:r>
       <w:r>
         <w:rPr>
@@ -1805,6 +2106,7 @@
           <w:rFonts w:ascii="Times New Roman" w:hAnsi="Times New Roman"/>
           <w:sz w:val="24"/>
         </w:rPr>
+        <w:lastRenderedPageBreak/>
         <w:t>Beépített, nincs szükség külső csomag telepítésére</w:t>
       </w:r>
     </w:p>
@@ -1849,7 +2151,6 @@
           <w:rFonts w:ascii="Times New Roman" w:hAnsi="Times New Roman"/>
           <w:sz w:val="24"/>
         </w:rPr>
-        <w:lastRenderedPageBreak/>
         <w:t>Teljes kontrollt ad a fejlesztőnek a hálózat kezelésére</w:t>
       </w:r>
     </w:p>
@@ -1911,17 +2212,17 @@
           <w:rFonts w:ascii="Times New Roman" w:hAnsi="Times New Roman"/>
           <w:sz w:val="24"/>
         </w:rPr>
-        <w:t xml:space="preserve">Több kódot </w:t>
-      </w:r>
-      <w:proofErr w:type="gramStart"/>
-      <w:r>
-        <w:rPr>
-          <w:rFonts w:ascii="Times New Roman" w:hAnsi="Times New Roman"/>
-          <w:sz w:val="24"/>
-        </w:rPr>
-        <w:t>igényel</w:t>
-      </w:r>
-      <w:proofErr w:type="gramEnd"/>
+        <w:t>Több kódot igényel</w:t>
+      </w:r>
+      <w:ins w:id="30" w:author="Ősz Olivér" w:date="2025-04-06T12:53:00Z" w16du:dateUtc="2025-04-06T10:53:00Z">
+        <w:r>
+          <w:rPr>
+            <w:rFonts w:ascii="Times New Roman" w:hAnsi="Times New Roman"/>
+            <w:sz w:val="24"/>
+          </w:rPr>
+          <w:t>,</w:t>
+        </w:r>
+      </w:ins>
       <w:r>
         <w:rPr>
           <w:rFonts w:ascii="Times New Roman" w:hAnsi="Times New Roman"/>
@@ -1961,21 +2262,21 @@
         </w:rPr>
         <w:t>Pygame</w:t>
       </w:r>
-      <w:proofErr w:type="spellEnd"/>
-      <w:r>
-        <w:rPr>
-          <w:rFonts w:ascii="Times New Roman" w:hAnsi="Times New Roman"/>
-          <w:sz w:val="24"/>
-        </w:rPr>
-        <w:t xml:space="preserve"> -</w:t>
-      </w:r>
-      <w:proofErr w:type="spellStart"/>
-      <w:r>
-        <w:rPr>
-          <w:rFonts w:ascii="Times New Roman" w:hAnsi="Times New Roman"/>
-          <w:sz w:val="24"/>
-        </w:rPr>
-        <w:t>mel</w:t>
+      <w:del w:id="31" w:author="Ősz Olivér" w:date="2025-04-06T12:53:00Z" w16du:dateUtc="2025-04-06T10:53:00Z">
+        <w:r>
+          <w:rPr>
+            <w:rFonts w:ascii="Times New Roman" w:hAnsi="Times New Roman"/>
+            <w:sz w:val="24"/>
+          </w:rPr>
+          <w:delText xml:space="preserve"> </w:delText>
+        </w:r>
+      </w:del>
+      <w:r>
+        <w:rPr>
+          <w:rFonts w:ascii="Times New Roman" w:hAnsi="Times New Roman"/>
+          <w:sz w:val="24"/>
+        </w:rPr>
+        <w:t>-mel</w:t>
       </w:r>
       <w:proofErr w:type="spellEnd"/>
       <w:r>
@@ -2205,27 +2506,47 @@
           <w:sz w:val="24"/>
         </w:rPr>
         <w:lastRenderedPageBreak/>
-        <w:t>Kód részlet:</w:t>
-      </w:r>
-    </w:p>
-    <w:p>
-      <w:pPr>
-        <w:spacing w:line="360" w:lineRule="auto"/>
-        <w:jc w:val="both"/>
+        <w:t>Kód</w:t>
+      </w:r>
+      <w:del w:id="32" w:author="Ősz Olivér" w:date="2025-04-06T13:06:00Z" w16du:dateUtc="2025-04-06T11:06:00Z">
+        <w:r>
+          <w:rPr>
+            <w:rFonts w:ascii="Times New Roman" w:hAnsi="Times New Roman" w:cs="Times New Roman"/>
+            <w:b/>
+            <w:bCs/>
+            <w:sz w:val="24"/>
+          </w:rPr>
+          <w:delText xml:space="preserve"> </w:delText>
+        </w:r>
+      </w:del>
+      <w:r>
         <w:rPr>
           <w:rFonts w:ascii="Times New Roman" w:hAnsi="Times New Roman" w:cs="Times New Roman"/>
           <w:b/>
           <w:bCs/>
           <w:sz w:val="24"/>
         </w:rPr>
-      </w:pPr>
-      <w:r>
+        <w:t>részlet:</w:t>
+      </w:r>
+    </w:p>
+    <w:p>
+      <w:pPr>
+        <w:spacing w:line="360" w:lineRule="auto"/>
+        <w:jc w:val="both"/>
         <w:rPr>
           <w:rFonts w:ascii="Times New Roman" w:hAnsi="Times New Roman" w:cs="Times New Roman"/>
           <w:b/>
           <w:bCs/>
           <w:sz w:val="24"/>
         </w:rPr>
+      </w:pPr>
+      <w:r>
+        <w:rPr>
+          <w:rFonts w:ascii="Times New Roman" w:hAnsi="Times New Roman" w:cs="Times New Roman"/>
+          <w:b/>
+          <w:bCs/>
+          <w:sz w:val="24"/>
+        </w:rPr>
         <w:t>Szerver oldal:</w:t>
       </w:r>
     </w:p>
@@ -2965,22 +3286,8 @@
           <w:lang w:eastAsia="hu-HU"/>
           <w14:ligatures w14:val="none"/>
         </w:rPr>
-        <w:t xml:space="preserve"> </w:t>
-      </w:r>
-      <w:proofErr w:type="spellStart"/>
-      <w:r>
-        <w:rPr>
-          <w:rFonts w:ascii="Consolas" w:eastAsia="+mn-ea" w:hAnsi="Consolas" w:cs="+mn-cs"/>
-          <w:color w:val="008000"/>
-          <w:kern w:val="24"/>
-          <w:sz w:val="21"/>
-          <w:szCs w:val="21"/>
-          <w:lang w:eastAsia="hu-HU"/>
-          <w14:ligatures w14:val="none"/>
-        </w:rPr>
-        <w:t>time</w:t>
-      </w:r>
-      <w:proofErr w:type="spellEnd"/>
+        <w:t xml:space="preserve"> time</w:t>
+      </w:r>
     </w:p>
     <w:p>
       <w:pPr>
@@ -4123,6 +4430,7 @@
         </w:rPr>
         <w:t xml:space="preserve">, _, _ = </w:t>
       </w:r>
+      <w:commentRangeStart w:id="33"/>
       <w:proofErr w:type="spellStart"/>
       <w:proofErr w:type="gramStart"/>
       <w:r>
@@ -4137,8 +4445,16 @@
         </w:rPr>
         <w:t>select.select</w:t>
       </w:r>
+      <w:commentRangeEnd w:id="33"/>
       <w:proofErr w:type="spellEnd"/>
       <w:proofErr w:type="gramEnd"/>
+      <w:r>
+        <w:rPr>
+          <w:rStyle w:val="CommentReference"/>
+          <w:rFonts w:ascii="Times New Roman" w:hAnsi="Times New Roman"/>
+        </w:rPr>
+        <w:commentReference w:id="33"/>
+      </w:r>
       <w:r>
         <w:rPr>
           <w:rFonts w:ascii="Consolas" w:eastAsia="+mn-ea" w:hAnsi="Consolas" w:cs="+mn-cs"/>
@@ -4370,33 +4686,7 @@
           <w:lang w:eastAsia="hu-HU"/>
           <w14:ligatures w14:val="none"/>
         </w:rPr>
-        <w:t xml:space="preserve"> </w:t>
-      </w:r>
-      <w:proofErr w:type="spellStart"/>
-      <w:r>
-        <w:rPr>
-          <w:rFonts w:ascii="Consolas" w:eastAsia="+mn-ea" w:hAnsi="Consolas" w:cs="+mn-cs"/>
-          <w:color w:val="000000"/>
-          <w:kern w:val="24"/>
-          <w:sz w:val="21"/>
-          <w:szCs w:val="21"/>
-          <w:lang w:eastAsia="hu-HU"/>
-          <w14:ligatures w14:val="none"/>
-        </w:rPr>
-        <w:t>sock</w:t>
-      </w:r>
-      <w:proofErr w:type="spellEnd"/>
-      <w:r>
-        <w:rPr>
-          <w:rFonts w:ascii="Consolas" w:eastAsia="+mn-ea" w:hAnsi="Consolas" w:cs="+mn-cs"/>
-          <w:color w:val="000000"/>
-          <w:kern w:val="24"/>
-          <w:sz w:val="21"/>
-          <w:szCs w:val="21"/>
-          <w:lang w:eastAsia="hu-HU"/>
-          <w14:ligatures w14:val="none"/>
-        </w:rPr>
-        <w:t xml:space="preserve"> </w:t>
+        <w:t xml:space="preserve"> sock </w:t>
       </w:r>
       <w:r>
         <w:rPr>
@@ -5188,14 +5478,32 @@
         </w:rPr>
         <w:t>socket</w:t>
       </w:r>
-      <w:r>
-        <w:rPr>
-          <w:rFonts w:ascii="Times New Roman" w:hAnsi="Times New Roman"/>
-          <w:sz w:val="24"/>
-        </w:rPr>
-        <w:t>-et</w:t>
-      </w:r>
-      <w:proofErr w:type="spellEnd"/>
+      <w:del w:id="34" w:author="Ősz Olivér" w:date="2025-04-06T13:00:00Z" w16du:dateUtc="2025-04-06T11:00:00Z">
+        <w:r>
+          <w:rPr>
+            <w:rFonts w:ascii="Times New Roman" w:hAnsi="Times New Roman"/>
+            <w:sz w:val="24"/>
+          </w:rPr>
+          <w:delText>-</w:delText>
+        </w:r>
+      </w:del>
+      <w:r>
+        <w:rPr>
+          <w:rFonts w:ascii="Times New Roman" w:hAnsi="Times New Roman"/>
+          <w:sz w:val="24"/>
+        </w:rPr>
+        <w:t>et</w:t>
+      </w:r>
+      <w:proofErr w:type="spellEnd"/>
+      <w:ins w:id="35" w:author="Ősz Olivér" w:date="2025-04-06T13:00:00Z" w16du:dateUtc="2025-04-06T11:00:00Z">
+        <w:r>
+          <w:rPr>
+            <w:rFonts w:ascii="Times New Roman" w:hAnsi="Times New Roman"/>
+            <w:sz w:val="24"/>
+          </w:rPr>
+          <w:t>,</w:t>
+        </w:r>
+      </w:ins>
       <w:r>
         <w:rPr>
           <w:rFonts w:ascii="Times New Roman" w:hAnsi="Times New Roman"/>
@@ -5229,13 +5537,29 @@
         </w:rPr>
         <w:t>polling</w:t>
       </w:r>
-      <w:proofErr w:type="spellEnd"/>
-      <w:r>
-        <w:rPr>
-          <w:rFonts w:ascii="Times New Roman" w:hAnsi="Times New Roman"/>
-          <w:sz w:val="24"/>
-        </w:rPr>
-        <w:t xml:space="preserve">-ot, mivel csak akkor reagál, amikor valamelyik kliens ténylegesen adatot küld.  Mivel a </w:t>
+      <w:del w:id="36" w:author="Ősz Olivér" w:date="2025-04-06T13:00:00Z" w16du:dateUtc="2025-04-06T11:00:00Z">
+        <w:r>
+          <w:rPr>
+            <w:rFonts w:ascii="Times New Roman" w:hAnsi="Times New Roman"/>
+            <w:sz w:val="24"/>
+          </w:rPr>
+          <w:delText>-</w:delText>
+        </w:r>
+      </w:del>
+      <w:r>
+        <w:rPr>
+          <w:rFonts w:ascii="Times New Roman" w:hAnsi="Times New Roman"/>
+          <w:sz w:val="24"/>
+        </w:rPr>
+        <w:t>ot</w:t>
+      </w:r>
+      <w:proofErr w:type="spellEnd"/>
+      <w:r>
+        <w:rPr>
+          <w:rFonts w:ascii="Times New Roman" w:hAnsi="Times New Roman"/>
+          <w:sz w:val="24"/>
+        </w:rPr>
+        <w:t xml:space="preserve">, mivel csak akkor reagál, amikor valamelyik kliens ténylegesen adatot küld.  Mivel a </w:t>
       </w:r>
       <w:proofErr w:type="spellStart"/>
       <w:r>
@@ -5247,29 +5571,29 @@
         </w:rPr>
         <w:t>socket</w:t>
       </w:r>
-      <w:proofErr w:type="spellEnd"/>
-      <w:r>
-        <w:rPr>
-          <w:rFonts w:ascii="Times New Roman" w:hAnsi="Times New Roman"/>
-          <w:sz w:val="24"/>
-        </w:rPr>
-        <w:t xml:space="preserve">-ek nem biztosítanak alapértelmezett módon </w:t>
-      </w:r>
-      <w:proofErr w:type="spellStart"/>
-      <w:r>
-        <w:rPr>
-          <w:rFonts w:ascii="Times New Roman" w:hAnsi="Times New Roman"/>
-          <w:sz w:val="24"/>
-        </w:rPr>
-        <w:t>kétirányú</w:t>
-      </w:r>
-      <w:proofErr w:type="spellEnd"/>
-      <w:r>
-        <w:rPr>
-          <w:rFonts w:ascii="Times New Roman" w:hAnsi="Times New Roman"/>
-          <w:sz w:val="24"/>
-        </w:rPr>
-        <w:t xml:space="preserve"> kapcsolatot, mint a </w:t>
+      <w:del w:id="37" w:author="Ősz Olivér" w:date="2025-04-06T13:00:00Z" w16du:dateUtc="2025-04-06T11:00:00Z">
+        <w:r>
+          <w:rPr>
+            <w:rFonts w:ascii="Times New Roman" w:hAnsi="Times New Roman"/>
+            <w:sz w:val="24"/>
+          </w:rPr>
+          <w:delText>-</w:delText>
+        </w:r>
+      </w:del>
+      <w:r>
+        <w:rPr>
+          <w:rFonts w:ascii="Times New Roman" w:hAnsi="Times New Roman"/>
+          <w:sz w:val="24"/>
+        </w:rPr>
+        <w:t>ek</w:t>
+      </w:r>
+      <w:proofErr w:type="spellEnd"/>
+      <w:r>
+        <w:rPr>
+          <w:rFonts w:ascii="Times New Roman" w:hAnsi="Times New Roman"/>
+          <w:sz w:val="24"/>
+        </w:rPr>
+        <w:t xml:space="preserve"> nem biztosítanak alapértelmezett módon kétirányú kapcsolatot, mint a </w:t>
       </w:r>
       <w:proofErr w:type="spellStart"/>
       <w:r>
@@ -5281,13 +5605,29 @@
         </w:rPr>
         <w:t>WebSocket</w:t>
       </w:r>
-      <w:proofErr w:type="spellEnd"/>
-      <w:r>
-        <w:rPr>
-          <w:rFonts w:ascii="Times New Roman" w:hAnsi="Times New Roman"/>
-          <w:sz w:val="24"/>
-        </w:rPr>
-        <w:t>-ek, ezért manuálisan kell megoldani az adatküldés és fogadás kezelését.</w:t>
+      <w:del w:id="38" w:author="Ősz Olivér" w:date="2025-04-06T13:00:00Z" w16du:dateUtc="2025-04-06T11:00:00Z">
+        <w:r>
+          <w:rPr>
+            <w:rFonts w:ascii="Times New Roman" w:hAnsi="Times New Roman"/>
+            <w:sz w:val="24"/>
+          </w:rPr>
+          <w:delText>-</w:delText>
+        </w:r>
+      </w:del>
+      <w:r>
+        <w:rPr>
+          <w:rFonts w:ascii="Times New Roman" w:hAnsi="Times New Roman"/>
+          <w:sz w:val="24"/>
+        </w:rPr>
+        <w:t>ek</w:t>
+      </w:r>
+      <w:proofErr w:type="spellEnd"/>
+      <w:r>
+        <w:rPr>
+          <w:rFonts w:ascii="Times New Roman" w:hAnsi="Times New Roman"/>
+          <w:sz w:val="24"/>
+        </w:rPr>
+        <w:t>, ezért manuálisan kell megoldani az adatküldés és fogadás kezelését.</w:t>
       </w:r>
     </w:p>
     <w:p>
@@ -5901,32 +6241,20 @@
       </w:r>
       <w:proofErr w:type="spellEnd"/>
       <w:proofErr w:type="gramEnd"/>
-      <w:r>
-        <w:rPr>
-          <w:rFonts w:ascii="Consolas" w:eastAsia="Times New Roman" w:hAnsi="Consolas" w:cs="Times New Roman"/>
-          <w:color w:val="000000"/>
-          <w:kern w:val="0"/>
-          <w:sz w:val="21"/>
-          <w:szCs w:val="21"/>
-          <w:lang w:eastAsia="hu-HU"/>
-          <w14:ligatures w14:val="none"/>
-        </w:rPr>
-        <w:t xml:space="preserve">: </w:t>
-      </w:r>
-      <w:proofErr w:type="spellStart"/>
-      <w:r>
-        <w:rPr>
-          <w:rFonts w:ascii="Consolas" w:eastAsia="Times New Roman" w:hAnsi="Consolas" w:cs="Times New Roman"/>
-          <w:color w:val="000000"/>
-          <w:kern w:val="0"/>
-          <w:sz w:val="21"/>
-          <w:szCs w:val="21"/>
-          <w:lang w:eastAsia="hu-HU"/>
-          <w14:ligatures w14:val="none"/>
-        </w:rPr>
-        <w:t>bool</w:t>
-      </w:r>
-      <w:proofErr w:type="spellEnd"/>
+      <w:del w:id="39" w:author="Ősz Olivér" w:date="2025-04-06T13:01:00Z" w16du:dateUtc="2025-04-06T11:01:00Z">
+        <w:r>
+          <w:rPr>
+            <w:rFonts w:ascii="Consolas" w:eastAsia="Times New Roman" w:hAnsi="Consolas" w:cs="Times New Roman"/>
+            <w:color w:val="000000"/>
+            <w:kern w:val="0"/>
+            <w:sz w:val="21"/>
+            <w:szCs w:val="21"/>
+            <w:lang w:eastAsia="hu-HU"/>
+            <w14:ligatures w14:val="none"/>
+          </w:rPr>
+          <w:delText>: bool</w:delText>
+        </w:r>
+      </w:del>
       <w:r>
         <w:rPr>
           <w:rFonts w:ascii="Consolas" w:eastAsia="Times New Roman" w:hAnsi="Consolas" w:cs="Times New Roman"/>
@@ -6354,7 +6682,99 @@
           <w:sz w:val="24"/>
           <w:lang w:eastAsia="hu-HU"/>
         </w:rPr>
-        <w:t xml:space="preserve">Amikor felcsatlakozik a kliens a szerverre indít egy külön szálat, amin fogadja szervertöl kapott adatokat. Igy nem fog </w:t>
+        <w:t>Amikor felcsatlakozik a kliens a szerverre</w:t>
+      </w:r>
+      <w:ins w:id="40" w:author="Ősz Olivér" w:date="2025-04-06T13:00:00Z" w16du:dateUtc="2025-04-06T11:00:00Z">
+        <w:r>
+          <w:rPr>
+            <w:rFonts w:ascii="Times New Roman" w:hAnsi="Times New Roman"/>
+            <w:sz w:val="24"/>
+            <w:lang w:eastAsia="hu-HU"/>
+          </w:rPr>
+          <w:t>,</w:t>
+        </w:r>
+      </w:ins>
+      <w:r>
+        <w:rPr>
+          <w:rFonts w:ascii="Times New Roman" w:hAnsi="Times New Roman"/>
+          <w:sz w:val="24"/>
+          <w:lang w:eastAsia="hu-HU"/>
+        </w:rPr>
+        <w:t xml:space="preserve"> indít egy külön szálat, amin fogadja</w:t>
+      </w:r>
+      <w:ins w:id="41" w:author="Ősz Olivér" w:date="2025-04-06T13:00:00Z" w16du:dateUtc="2025-04-06T11:00:00Z">
+        <w:r>
+          <w:rPr>
+            <w:rFonts w:ascii="Times New Roman" w:hAnsi="Times New Roman"/>
+            <w:sz w:val="24"/>
+            <w:lang w:eastAsia="hu-HU"/>
+          </w:rPr>
+          <w:t xml:space="preserve"> a</w:t>
+        </w:r>
+      </w:ins>
+      <w:r>
+        <w:rPr>
+          <w:rFonts w:ascii="Times New Roman" w:hAnsi="Times New Roman"/>
+          <w:sz w:val="24"/>
+          <w:lang w:eastAsia="hu-HU"/>
+        </w:rPr>
+        <w:t xml:space="preserve"> szervert</w:t>
+      </w:r>
+      <w:del w:id="42" w:author="Ősz Olivér" w:date="2025-04-06T13:01:00Z" w16du:dateUtc="2025-04-06T11:01:00Z">
+        <w:r>
+          <w:rPr>
+            <w:rFonts w:ascii="Times New Roman" w:hAnsi="Times New Roman"/>
+            <w:sz w:val="24"/>
+            <w:lang w:eastAsia="hu-HU"/>
+          </w:rPr>
+          <w:delText>ö</w:delText>
+        </w:r>
+      </w:del>
+      <w:ins w:id="43" w:author="Ősz Olivér" w:date="2025-04-06T13:01:00Z" w16du:dateUtc="2025-04-06T11:01:00Z">
+        <w:r>
+          <w:rPr>
+            <w:rFonts w:ascii="Times New Roman" w:hAnsi="Times New Roman"/>
+            <w:sz w:val="24"/>
+            <w:lang w:eastAsia="hu-HU"/>
+          </w:rPr>
+          <w:t>ő</w:t>
+        </w:r>
+      </w:ins>
+      <w:r>
+        <w:rPr>
+          <w:rFonts w:ascii="Times New Roman" w:hAnsi="Times New Roman"/>
+          <w:sz w:val="24"/>
+          <w:lang w:eastAsia="hu-HU"/>
+        </w:rPr>
+        <w:t xml:space="preserve">l kapott adatokat. </w:t>
+      </w:r>
+      <w:del w:id="44" w:author="Ősz Olivér" w:date="2025-04-06T13:01:00Z" w16du:dateUtc="2025-04-06T11:01:00Z">
+        <w:r>
+          <w:rPr>
+            <w:rFonts w:ascii="Times New Roman" w:hAnsi="Times New Roman"/>
+            <w:sz w:val="24"/>
+            <w:lang w:eastAsia="hu-HU"/>
+          </w:rPr>
+          <w:delText>I</w:delText>
+        </w:r>
+      </w:del>
+      <w:ins w:id="45" w:author="Ősz Olivér" w:date="2025-04-06T13:01:00Z" w16du:dateUtc="2025-04-06T11:01:00Z">
+        <w:r>
+          <w:rPr>
+            <w:rFonts w:ascii="Times New Roman" w:hAnsi="Times New Roman"/>
+            <w:sz w:val="24"/>
+            <w:lang w:eastAsia="hu-HU"/>
+          </w:rPr>
+          <w:t>Í</w:t>
+        </w:r>
+      </w:ins>
+      <w:r>
+        <w:rPr>
+          <w:rFonts w:ascii="Times New Roman" w:hAnsi="Times New Roman"/>
+          <w:sz w:val="24"/>
+          <w:lang w:eastAsia="hu-HU"/>
+        </w:rPr>
+        <w:t xml:space="preserve">gy nem fog </w:t>
       </w:r>
       <w:proofErr w:type="spellStart"/>
       <w:r>
@@ -6740,33 +7160,7 @@
           <w:lang w:eastAsia="hu-HU"/>
           <w14:ligatures w14:val="none"/>
         </w:rPr>
-        <w:t xml:space="preserve"> </w:t>
-      </w:r>
-      <w:proofErr w:type="spellStart"/>
-      <w:r>
-        <w:rPr>
-          <w:rFonts w:ascii="Consolas" w:eastAsia="Times New Roman" w:hAnsi="Consolas" w:cs="Times New Roman"/>
-          <w:color w:val="A31515"/>
-          <w:kern w:val="0"/>
-          <w:sz w:val="21"/>
-          <w:szCs w:val="21"/>
-          <w:lang w:eastAsia="hu-HU"/>
-          <w14:ligatures w14:val="none"/>
-        </w:rPr>
-        <w:t>on</w:t>
-      </w:r>
-      <w:proofErr w:type="spellEnd"/>
-      <w:r>
-        <w:rPr>
-          <w:rFonts w:ascii="Consolas" w:eastAsia="Times New Roman" w:hAnsi="Consolas" w:cs="Times New Roman"/>
-          <w:color w:val="A31515"/>
-          <w:kern w:val="0"/>
-          <w:sz w:val="21"/>
-          <w:szCs w:val="21"/>
-          <w:lang w:eastAsia="hu-HU"/>
-          <w14:ligatures w14:val="none"/>
-        </w:rPr>
-        <w:t xml:space="preserve"> </w:t>
+        <w:t xml:space="preserve"> on </w:t>
       </w:r>
       <w:proofErr w:type="spellStart"/>
       <w:r>
@@ -7487,33 +7881,7 @@
           <w:lang w:eastAsia="hu-HU"/>
           <w14:ligatures w14:val="none"/>
         </w:rPr>
-        <w:t xml:space="preserve"> </w:t>
-      </w:r>
-      <w:proofErr w:type="spellStart"/>
-      <w:r>
-        <w:rPr>
-          <w:rFonts w:ascii="Consolas" w:eastAsia="Times New Roman" w:hAnsi="Consolas" w:cs="Times New Roman"/>
-          <w:color w:val="000000"/>
-          <w:kern w:val="0"/>
-          <w:sz w:val="21"/>
-          <w:szCs w:val="21"/>
-          <w:lang w:eastAsia="hu-HU"/>
-          <w14:ligatures w14:val="none"/>
-        </w:rPr>
-        <w:t>message</w:t>
-      </w:r>
-      <w:proofErr w:type="spellEnd"/>
-      <w:r>
-        <w:rPr>
-          <w:rFonts w:ascii="Consolas" w:eastAsia="Times New Roman" w:hAnsi="Consolas" w:cs="Times New Roman"/>
-          <w:color w:val="000000"/>
-          <w:kern w:val="0"/>
-          <w:sz w:val="21"/>
-          <w:szCs w:val="21"/>
-          <w:lang w:eastAsia="hu-HU"/>
-          <w14:ligatures w14:val="none"/>
-        </w:rPr>
-        <w:t>:</w:t>
+        <w:t xml:space="preserve"> message:</w:t>
       </w:r>
     </w:p>
     <w:p>
@@ -7705,7 +8073,64 @@
           <w:rFonts w:ascii="Times New Roman" w:hAnsi="Times New Roman"/>
           <w:sz w:val="24"/>
         </w:rPr>
-        <w:t xml:space="preserve">Annak érdekében hogy elkerüljem a felesleges ellenőrző kérések elküldését a szervernek alkalmazom a </w:t>
+        <w:t>Annak érdekében</w:t>
+      </w:r>
+      <w:ins w:id="46" w:author="Ősz Olivér" w:date="2025-04-06T13:02:00Z" w16du:dateUtc="2025-04-06T11:02:00Z">
+        <w:r>
+          <w:rPr>
+            <w:rFonts w:ascii="Times New Roman" w:hAnsi="Times New Roman"/>
+            <w:sz w:val="24"/>
+          </w:rPr>
+          <w:t>,</w:t>
+        </w:r>
+      </w:ins>
+      <w:r>
+        <w:rPr>
+          <w:rFonts w:ascii="Times New Roman" w:hAnsi="Times New Roman"/>
+          <w:sz w:val="24"/>
+        </w:rPr>
+        <w:t xml:space="preserve"> hogy elkerüljem a felesleges ellenőrző kérések elküldését a szervernek</w:t>
+      </w:r>
+      <w:ins w:id="47" w:author="Ősz Olivér" w:date="2025-04-06T13:02:00Z" w16du:dateUtc="2025-04-06T11:02:00Z">
+        <w:r>
+          <w:rPr>
+            <w:rFonts w:ascii="Times New Roman" w:hAnsi="Times New Roman"/>
+            <w:sz w:val="24"/>
+          </w:rPr>
+          <w:t>,</w:t>
+        </w:r>
+      </w:ins>
+      <w:r>
+        <w:rPr>
+          <w:rFonts w:ascii="Times New Roman" w:hAnsi="Times New Roman"/>
+          <w:sz w:val="24"/>
+        </w:rPr>
+        <w:t xml:space="preserve"> </w:t>
+      </w:r>
+      <w:del w:id="48" w:author="Ősz Olivér" w:date="2025-04-06T13:04:00Z" w16du:dateUtc="2025-04-06T11:04:00Z">
+        <w:r>
+          <w:rPr>
+            <w:rFonts w:ascii="Times New Roman" w:hAnsi="Times New Roman"/>
+            <w:sz w:val="24"/>
+          </w:rPr>
+          <w:delText xml:space="preserve">alkalmazom </w:delText>
+        </w:r>
+      </w:del>
+      <w:ins w:id="49" w:author="Ősz Olivér" w:date="2025-04-06T13:04:00Z" w16du:dateUtc="2025-04-06T11:04:00Z">
+        <w:r>
+          <w:rPr>
+            <w:rFonts w:ascii="Times New Roman" w:hAnsi="Times New Roman"/>
+            <w:sz w:val="24"/>
+          </w:rPr>
+          <w:t xml:space="preserve">meghívom </w:t>
+        </w:r>
+      </w:ins>
+      <w:r>
+        <w:rPr>
+          <w:rFonts w:ascii="Times New Roman" w:hAnsi="Times New Roman"/>
+          <w:sz w:val="24"/>
+        </w:rPr>
+        <w:t xml:space="preserve">a </w:t>
       </w:r>
       <w:proofErr w:type="spellStart"/>
       <w:proofErr w:type="gramStart"/>
@@ -7749,12 +8174,77 @@
         </w:rPr>
         <w:t>()</w:t>
       </w:r>
-      <w:r>
-        <w:rPr>
-          <w:rFonts w:ascii="Times New Roman" w:hAnsi="Times New Roman"/>
-          <w:sz w:val="24"/>
-        </w:rPr>
-        <w:t>. Itt a program megáll és vár amíg a szerver küld neki adatot.</w:t>
+      <w:ins w:id="50" w:author="Ősz Olivér" w:date="2025-04-06T13:04:00Z" w16du:dateUtc="2025-04-06T11:04:00Z">
+        <w:r>
+          <w:rPr>
+            <w:rFonts w:ascii="Times New Roman" w:hAnsi="Times New Roman"/>
+            <w:sz w:val="24"/>
+            <w:rPrChange w:id="51" w:author="Ősz Olivér" w:date="2025-04-06T13:04:00Z" w16du:dateUtc="2025-04-06T11:04:00Z">
+              <w:rPr>
+                <w:rFonts w:ascii="Times New Roman" w:hAnsi="Times New Roman"/>
+                <w:i/>
+                <w:iCs/>
+                <w:sz w:val="24"/>
+              </w:rPr>
+            </w:rPrChange>
+          </w:rPr>
+          <w:t>-ot</w:t>
+        </w:r>
+      </w:ins>
+      <w:r>
+        <w:rPr>
+          <w:rFonts w:ascii="Times New Roman" w:hAnsi="Times New Roman"/>
+          <w:sz w:val="24"/>
+        </w:rPr>
+        <w:t xml:space="preserve">. Itt a </w:t>
+      </w:r>
+      <w:del w:id="52" w:author="Ősz Olivér" w:date="2025-04-06T13:04:00Z" w16du:dateUtc="2025-04-06T11:04:00Z">
+        <w:r>
+          <w:rPr>
+            <w:rFonts w:ascii="Times New Roman" w:hAnsi="Times New Roman"/>
+            <w:sz w:val="24"/>
+          </w:rPr>
+          <w:delText xml:space="preserve">program </w:delText>
+        </w:r>
+      </w:del>
+      <w:ins w:id="53" w:author="Ősz Olivér" w:date="2025-04-06T13:04:00Z" w16du:dateUtc="2025-04-06T11:04:00Z">
+        <w:r>
+          <w:rPr>
+            <w:rFonts w:ascii="Times New Roman" w:hAnsi="Times New Roman"/>
+            <w:sz w:val="24"/>
+          </w:rPr>
+          <w:t>szál végrehajtása</w:t>
+        </w:r>
+        <w:r>
+          <w:rPr>
+            <w:rFonts w:ascii="Times New Roman" w:hAnsi="Times New Roman"/>
+            <w:sz w:val="24"/>
+          </w:rPr>
+          <w:t xml:space="preserve"> </w:t>
+        </w:r>
+      </w:ins>
+      <w:r>
+        <w:rPr>
+          <w:rFonts w:ascii="Times New Roman" w:hAnsi="Times New Roman"/>
+          <w:sz w:val="24"/>
+        </w:rPr>
+        <w:t>megáll</w:t>
+      </w:r>
+      <w:ins w:id="54" w:author="Ősz Olivér" w:date="2025-04-06T13:04:00Z" w16du:dateUtc="2025-04-06T11:04:00Z">
+        <w:r>
+          <w:rPr>
+            <w:rFonts w:ascii="Times New Roman" w:hAnsi="Times New Roman"/>
+            <w:sz w:val="24"/>
+          </w:rPr>
+          <w:t>,</w:t>
+        </w:r>
+      </w:ins>
+      <w:r>
+        <w:rPr>
+          <w:rFonts w:ascii="Times New Roman" w:hAnsi="Times New Roman"/>
+          <w:sz w:val="24"/>
+        </w:rPr>
+        <w:t xml:space="preserve"> és vár amíg a szerver küld neki adatot.</w:t>
       </w:r>
     </w:p>
     <w:p>
@@ -7770,7 +8260,7 @@
           <w:szCs w:val="32"/>
         </w:rPr>
       </w:pPr>
-      <w:bookmarkStart w:id="5" w:name="_Toc194523607"/>
+      <w:bookmarkStart w:id="55" w:name="_Toc194523607"/>
       <w:proofErr w:type="spellStart"/>
       <w:r>
         <w:rPr>
@@ -7781,7 +8271,7 @@
         </w:rPr>
         <w:t>Flask-SocketIO</w:t>
       </w:r>
-      <w:bookmarkEnd w:id="5"/>
+      <w:bookmarkEnd w:id="55"/>
       <w:proofErr w:type="spellEnd"/>
     </w:p>
     <w:p>
@@ -7834,17 +8324,17 @@
           <w:rFonts w:ascii="Times New Roman" w:hAnsi="Times New Roman"/>
           <w:sz w:val="24"/>
         </w:rPr>
-        <w:t xml:space="preserve"> alapú </w:t>
-      </w:r>
-      <w:proofErr w:type="gramStart"/>
-      <w:r>
-        <w:rPr>
-          <w:rFonts w:ascii="Times New Roman" w:hAnsi="Times New Roman"/>
-          <w:sz w:val="24"/>
-        </w:rPr>
-        <w:t>csomag</w:t>
-      </w:r>
-      <w:proofErr w:type="gramEnd"/>
+        <w:t xml:space="preserve"> alapú csomag</w:t>
+      </w:r>
+      <w:ins w:id="56" w:author="Ősz Olivér" w:date="2025-04-06T13:05:00Z" w16du:dateUtc="2025-04-06T11:05:00Z">
+        <w:r>
+          <w:rPr>
+            <w:rFonts w:ascii="Times New Roman" w:hAnsi="Times New Roman"/>
+            <w:sz w:val="24"/>
+          </w:rPr>
+          <w:t>,</w:t>
+        </w:r>
+      </w:ins>
       <w:r>
         <w:rPr>
           <w:rFonts w:ascii="Times New Roman" w:hAnsi="Times New Roman"/>
@@ -7866,23 +8356,7 @@
           <w:rFonts w:ascii="Times New Roman" w:hAnsi="Times New Roman"/>
           <w:sz w:val="24"/>
         </w:rPr>
-        <w:t xml:space="preserve"> </w:t>
-      </w:r>
-      <w:proofErr w:type="spellStart"/>
-      <w:r>
-        <w:rPr>
-          <w:rFonts w:ascii="Times New Roman" w:hAnsi="Times New Roman"/>
-          <w:sz w:val="24"/>
-        </w:rPr>
-        <w:t>kétirányú</w:t>
-      </w:r>
-      <w:proofErr w:type="spellEnd"/>
-      <w:r>
-        <w:rPr>
-          <w:rFonts w:ascii="Times New Roman" w:hAnsi="Times New Roman"/>
-          <w:sz w:val="24"/>
-        </w:rPr>
-        <w:t xml:space="preserve"> kapcsolat kiépítését kliens és szerver között. </w:t>
+        <w:t xml:space="preserve"> kétirányú kapcsolat kiépítését kliens és szerver között. </w:t>
       </w:r>
     </w:p>
     <w:p>
@@ -7970,15 +8444,17 @@
           <w:sz w:val="24"/>
         </w:rPr>
         <w:lastRenderedPageBreak/>
-        <w:t>Egyszerű</w:t>
-      </w:r>
-      <w:r>
-        <w:rPr>
-          <w:rFonts w:ascii="Times New Roman" w:hAnsi="Times New Roman"/>
-          <w:sz w:val="24"/>
-        </w:rPr>
-        <w:t xml:space="preserve"> benne megoldani a szobák párhuzamos kezelését és a csoportos üzenet küldést</w:t>
-      </w:r>
+        <w:t>Egyszerű benne megoldani a szobák párhuzamos kezelését és a csoportos üzenet küldést</w:t>
+      </w:r>
+      <w:ins w:id="57" w:author="Ősz Olivér" w:date="2025-04-06T13:05:00Z" w16du:dateUtc="2025-04-06T11:05:00Z">
+        <w:r>
+          <w:rPr>
+            <w:rFonts w:ascii="Times New Roman" w:hAnsi="Times New Roman"/>
+            <w:sz w:val="24"/>
+          </w:rPr>
+          <w:t>.</w:t>
+        </w:r>
+      </w:ins>
     </w:p>
     <w:p>
       <w:pPr>
@@ -8033,21 +8509,58 @@
           <w:lang w:eastAsia="hu-HU"/>
           <w14:ligatures w14:val="none"/>
         </w:rPr>
-        <w:t xml:space="preserve">-alapú kommunikáció miatt kevésbé terheli le a szervert, mivel az egyszer létrehozott kapcsolat fenntartása kevesebb erőforrást igényel, mint ha folyamatosan </w:t>
-      </w:r>
+        <w:t>-alapú kommunikáció miatt kevésbé terheli le a szervert, mivel az egyszer létrehozott kapcsolat fenntartása kevesebb erőforrást igényel, mint</w:t>
+      </w:r>
+      <w:del w:id="58" w:author="Ősz Olivér" w:date="2025-04-06T13:05:00Z" w16du:dateUtc="2025-04-06T11:05:00Z">
+        <w:r>
+          <w:rPr>
+            <w:rFonts w:ascii="Times New Roman" w:eastAsia="Times New Roman" w:hAnsi="Times New Roman"/>
+            <w:kern w:val="0"/>
+            <w:sz w:val="24"/>
+            <w:szCs w:val="24"/>
+            <w:lang w:eastAsia="hu-HU"/>
+            <w14:ligatures w14:val="none"/>
+          </w:rPr>
+          <w:delText xml:space="preserve"> </w:delText>
+        </w:r>
+      </w:del>
       <w:r>
         <w:rPr>
           <w:rFonts w:ascii="Times New Roman" w:eastAsia="Times New Roman" w:hAnsi="Times New Roman"/>
-          <w:i/>
-          <w:iCs/>
           <w:kern w:val="0"/>
           <w:sz w:val="24"/>
           <w:szCs w:val="24"/>
           <w:lang w:eastAsia="hu-HU"/>
           <w14:ligatures w14:val="none"/>
         </w:rPr>
-        <w:t>http</w:t>
-      </w:r>
+        <w:t xml:space="preserve">ha folyamatosan </w:t>
+      </w:r>
+      <w:del w:id="59" w:author="Ősz Olivér" w:date="2025-04-06T13:05:00Z" w16du:dateUtc="2025-04-06T11:05:00Z">
+        <w:r>
+          <w:rPr>
+            <w:rFonts w:ascii="Times New Roman" w:eastAsia="Times New Roman" w:hAnsi="Times New Roman"/>
+            <w:i/>
+            <w:iCs/>
+            <w:kern w:val="0"/>
+            <w:sz w:val="24"/>
+            <w:szCs w:val="24"/>
+            <w:lang w:eastAsia="hu-HU"/>
+            <w14:ligatures w14:val="none"/>
+          </w:rPr>
+          <w:delText>http</w:delText>
+        </w:r>
+        <w:r>
+          <w:rPr>
+            <w:rFonts w:ascii="Times New Roman" w:eastAsia="Times New Roman" w:hAnsi="Times New Roman"/>
+            <w:kern w:val="0"/>
+            <w:sz w:val="24"/>
+            <w:szCs w:val="24"/>
+            <w:lang w:eastAsia="hu-HU"/>
+            <w14:ligatures w14:val="none"/>
+          </w:rPr>
+          <w:delText xml:space="preserve"> </w:delText>
+        </w:r>
+      </w:del>
       <w:r>
         <w:rPr>
           <w:rFonts w:ascii="Times New Roman" w:eastAsia="Times New Roman" w:hAnsi="Times New Roman"/>
@@ -8057,7 +8570,7 @@
           <w:lang w:eastAsia="hu-HU"/>
           <w14:ligatures w14:val="none"/>
         </w:rPr>
-        <w:t xml:space="preserve"> kéréseket küldenének.</w:t>
+        <w:t>kéréseket küldenének.</w:t>
       </w:r>
     </w:p>
     <w:p>
@@ -8089,6 +8602,19 @@
         </w:rPr>
         <w:t>A kliens és a szerver is képes aszinkron módon adatokat küldeni és fogadni</w:t>
       </w:r>
+      <w:ins w:id="60" w:author="Ősz Olivér" w:date="2025-04-06T13:05:00Z" w16du:dateUtc="2025-04-06T11:05:00Z">
+        <w:r>
+          <w:rPr>
+            <w:rFonts w:ascii="Times New Roman" w:eastAsia="Times New Roman" w:hAnsi="Times New Roman"/>
+            <w:kern w:val="0"/>
+            <w:sz w:val="24"/>
+            <w:szCs w:val="24"/>
+            <w:lang w:eastAsia="hu-HU"/>
+            <w14:ligatures w14:val="none"/>
+          </w:rPr>
+          <w:t>.</w:t>
+        </w:r>
+      </w:ins>
     </w:p>
     <w:p>
       <w:pPr>
@@ -8133,6 +8659,19 @@
         </w:rPr>
         <w:t>socket</w:t>
       </w:r>
+      <w:del w:id="61" w:author="Ősz Olivér" w:date="2025-04-06T13:05:00Z" w16du:dateUtc="2025-04-06T11:05:00Z">
+        <w:r>
+          <w:rPr>
+            <w:rFonts w:ascii="Times New Roman" w:eastAsia="Times New Roman" w:hAnsi="Times New Roman"/>
+            <w:kern w:val="0"/>
+            <w:sz w:val="24"/>
+            <w:szCs w:val="24"/>
+            <w:lang w:eastAsia="hu-HU"/>
+            <w14:ligatures w14:val="none"/>
+          </w:rPr>
+          <w:delText>-</w:delText>
+        </w:r>
+      </w:del>
       <w:r>
         <w:rPr>
           <w:rFonts w:ascii="Times New Roman" w:eastAsia="Times New Roman" w:hAnsi="Times New Roman"/>
@@ -8142,7 +8681,7 @@
           <w:lang w:eastAsia="hu-HU"/>
           <w14:ligatures w14:val="none"/>
         </w:rPr>
-        <w:t>-hez</w:t>
+        <w:t>hez</w:t>
       </w:r>
       <w:proofErr w:type="spellEnd"/>
       <w:r>
@@ -8154,7 +8693,31 @@
           <w:lang w:eastAsia="hu-HU"/>
           <w14:ligatures w14:val="none"/>
         </w:rPr>
-        <w:t xml:space="preserve"> képest jóval kevesebb kód sort igényel.</w:t>
+        <w:t xml:space="preserve"> képest jóval kevesebb kód</w:t>
+      </w:r>
+      <w:del w:id="62" w:author="Ősz Olivér" w:date="2025-04-06T13:05:00Z" w16du:dateUtc="2025-04-06T11:05:00Z">
+        <w:r>
+          <w:rPr>
+            <w:rFonts w:ascii="Times New Roman" w:eastAsia="Times New Roman" w:hAnsi="Times New Roman"/>
+            <w:kern w:val="0"/>
+            <w:sz w:val="24"/>
+            <w:szCs w:val="24"/>
+            <w:lang w:eastAsia="hu-HU"/>
+            <w14:ligatures w14:val="none"/>
+          </w:rPr>
+          <w:delText xml:space="preserve"> </w:delText>
+        </w:r>
+      </w:del>
+      <w:r>
+        <w:rPr>
+          <w:rFonts w:ascii="Times New Roman" w:eastAsia="Times New Roman" w:hAnsi="Times New Roman"/>
+          <w:kern w:val="0"/>
+          <w:sz w:val="24"/>
+          <w:szCs w:val="24"/>
+          <w:lang w:eastAsia="hu-HU"/>
+          <w14:ligatures w14:val="none"/>
+        </w:rPr>
+        <w:t>sort igényel.</w:t>
       </w:r>
     </w:p>
     <w:p>
@@ -8198,21 +8761,7 @@
           <w:rFonts w:ascii="Times New Roman" w:hAnsi="Times New Roman"/>
           <w:sz w:val="24"/>
         </w:rPr>
-        <w:t xml:space="preserve">(egyelőre nem találtam olyan </w:t>
-      </w:r>
-      <w:r>
-        <w:rPr>
-          <w:rFonts w:ascii="Times New Roman" w:hAnsi="Times New Roman"/>
-          <w:sz w:val="24"/>
-        </w:rPr>
-        <w:t>hátrányt,</w:t>
-      </w:r>
-      <w:r>
-        <w:rPr>
-          <w:rFonts w:ascii="Times New Roman" w:hAnsi="Times New Roman"/>
-          <w:sz w:val="24"/>
-        </w:rPr>
-        <w:t xml:space="preserve"> ami számomra releváns lenne)</w:t>
+        <w:t>(egyelőre nem találtam olyan hátrányt, ami számomra releváns lenne)</w:t>
       </w:r>
     </w:p>
     <w:p>
@@ -8233,613 +8782,642 @@
           <w:bCs/>
           <w:sz w:val="24"/>
         </w:rPr>
-        <w:t>Kód részlet:</w:t>
-      </w:r>
-    </w:p>
-    <w:p>
-      <w:pPr>
-        <w:spacing w:line="360" w:lineRule="auto"/>
-        <w:jc w:val="both"/>
-        <w:rPr>
-          <w:rFonts w:ascii="Times New Roman" w:hAnsi="Times New Roman"/>
-          <w:sz w:val="24"/>
-        </w:rPr>
-      </w:pPr>
-      <w:r>
-        <w:rPr>
-          <w:rFonts w:ascii="Times New Roman" w:hAnsi="Times New Roman"/>
-          <w:sz w:val="24"/>
-        </w:rPr>
-        <w:t xml:space="preserve">A </w:t>
-      </w:r>
-      <w:proofErr w:type="spellStart"/>
-      <w:r>
-        <w:rPr>
-          <w:rFonts w:ascii="Times New Roman" w:hAnsi="Times New Roman"/>
-          <w:i/>
-          <w:iCs/>
-          <w:sz w:val="24"/>
-        </w:rPr>
-        <w:t>join_room</w:t>
-      </w:r>
-      <w:proofErr w:type="spellEnd"/>
-      <w:r>
-        <w:rPr>
-          <w:rFonts w:ascii="Times New Roman" w:hAnsi="Times New Roman"/>
-          <w:sz w:val="24"/>
-        </w:rPr>
-        <w:t xml:space="preserve"> és </w:t>
-      </w:r>
-      <w:proofErr w:type="spellStart"/>
-      <w:r>
-        <w:rPr>
-          <w:rFonts w:ascii="Times New Roman" w:hAnsi="Times New Roman"/>
-          <w:i/>
-          <w:iCs/>
-          <w:sz w:val="24"/>
-        </w:rPr>
-        <w:t>leave_room</w:t>
-      </w:r>
-      <w:proofErr w:type="spellEnd"/>
-      <w:r>
-        <w:rPr>
-          <w:rFonts w:ascii="Times New Roman" w:hAnsi="Times New Roman"/>
-          <w:i/>
-          <w:iCs/>
-          <w:sz w:val="24"/>
-        </w:rPr>
-        <w:t xml:space="preserve"> </w:t>
-      </w:r>
-      <w:r>
-        <w:rPr>
-          <w:rFonts w:ascii="Times New Roman" w:hAnsi="Times New Roman"/>
-          <w:sz w:val="24"/>
-        </w:rPr>
-        <w:t xml:space="preserve">függvények segítenek abban, hogy a felhasználókat hozzáadjuk egy szobához, vagy eltávolítsuk őket, így csak azok a felhasználók kapják meg az üzenetet, akik egy adott szobában tartózkodnak. </w:t>
-      </w:r>
-    </w:p>
-    <w:p>
-      <w:pPr>
-        <w:spacing w:line="360" w:lineRule="auto"/>
-        <w:jc w:val="both"/>
+        <w:t>Kód</w:t>
+      </w:r>
+      <w:del w:id="63" w:author="Ősz Olivér" w:date="2025-04-06T13:06:00Z" w16du:dateUtc="2025-04-06T11:06:00Z">
+        <w:r>
+          <w:rPr>
+            <w:rFonts w:ascii="Times New Roman" w:hAnsi="Times New Roman" w:cs="Times New Roman"/>
+            <w:b/>
+            <w:bCs/>
+            <w:sz w:val="24"/>
+          </w:rPr>
+          <w:delText xml:space="preserve"> </w:delText>
+        </w:r>
+      </w:del>
+      <w:r>
         <w:rPr>
           <w:rFonts w:ascii="Times New Roman" w:hAnsi="Times New Roman" w:cs="Times New Roman"/>
           <w:b/>
           <w:bCs/>
           <w:sz w:val="24"/>
         </w:rPr>
-      </w:pPr>
-      <w:r>
+        <w:t>részlet:</w:t>
+      </w:r>
+    </w:p>
+    <w:p>
+      <w:pPr>
+        <w:spacing w:line="360" w:lineRule="auto"/>
+        <w:jc w:val="both"/>
+        <w:rPr>
+          <w:rFonts w:ascii="Times New Roman" w:hAnsi="Times New Roman"/>
+          <w:sz w:val="24"/>
+        </w:rPr>
+      </w:pPr>
+      <w:r>
+        <w:rPr>
+          <w:rFonts w:ascii="Times New Roman" w:hAnsi="Times New Roman"/>
+          <w:sz w:val="24"/>
+        </w:rPr>
+        <w:t xml:space="preserve">A </w:t>
+      </w:r>
+      <w:proofErr w:type="spellStart"/>
+      <w:r>
+        <w:rPr>
+          <w:rFonts w:ascii="Times New Roman" w:hAnsi="Times New Roman"/>
+          <w:i/>
+          <w:iCs/>
+          <w:sz w:val="24"/>
+        </w:rPr>
+        <w:t>join_room</w:t>
+      </w:r>
+      <w:proofErr w:type="spellEnd"/>
+      <w:r>
+        <w:rPr>
+          <w:rFonts w:ascii="Times New Roman" w:hAnsi="Times New Roman"/>
+          <w:sz w:val="24"/>
+        </w:rPr>
+        <w:t xml:space="preserve"> és </w:t>
+      </w:r>
+      <w:proofErr w:type="spellStart"/>
+      <w:r>
+        <w:rPr>
+          <w:rFonts w:ascii="Times New Roman" w:hAnsi="Times New Roman"/>
+          <w:i/>
+          <w:iCs/>
+          <w:sz w:val="24"/>
+        </w:rPr>
+        <w:t>leave_room</w:t>
+      </w:r>
+      <w:proofErr w:type="spellEnd"/>
+      <w:r>
+        <w:rPr>
+          <w:rFonts w:ascii="Times New Roman" w:hAnsi="Times New Roman"/>
+          <w:i/>
+          <w:iCs/>
+          <w:sz w:val="24"/>
+        </w:rPr>
+        <w:t xml:space="preserve"> </w:t>
+      </w:r>
+      <w:r>
+        <w:rPr>
+          <w:rFonts w:ascii="Times New Roman" w:hAnsi="Times New Roman"/>
+          <w:sz w:val="24"/>
+        </w:rPr>
+        <w:t xml:space="preserve">függvények segítenek abban, hogy a felhasználókat hozzáadjuk egy szobához, vagy eltávolítsuk őket, így csak azok a felhasználók kapják meg az üzenetet, akik egy adott szobában tartózkodnak. </w:t>
+      </w:r>
+    </w:p>
+    <w:p>
+      <w:pPr>
+        <w:spacing w:line="360" w:lineRule="auto"/>
+        <w:jc w:val="both"/>
         <w:rPr>
           <w:rFonts w:ascii="Times New Roman" w:hAnsi="Times New Roman" w:cs="Times New Roman"/>
           <w:b/>
           <w:bCs/>
           <w:sz w:val="24"/>
         </w:rPr>
-        <w:t>Szerver oldali kód részlet:</w:t>
-      </w:r>
-    </w:p>
-    <w:p>
-      <w:pPr>
-        <w:shd w:val="clear" w:color="auto" w:fill="FFFFFF"/>
-        <w:spacing w:after="0" w:line="285" w:lineRule="atLeast"/>
-        <w:rPr>
-          <w:rFonts w:ascii="Consolas" w:eastAsia="Times New Roman" w:hAnsi="Consolas" w:cs="Times New Roman"/>
-          <w:color w:val="000000"/>
-          <w:kern w:val="0"/>
-          <w:sz w:val="21"/>
-          <w:szCs w:val="21"/>
-          <w:lang w:eastAsia="hu-HU"/>
-          <w14:ligatures w14:val="none"/>
-        </w:rPr>
-      </w:pPr>
-      <w:proofErr w:type="spellStart"/>
-      <w:proofErr w:type="gramStart"/>
-      <w:r>
-        <w:rPr>
-          <w:rFonts w:ascii="Consolas" w:eastAsia="Times New Roman" w:hAnsi="Consolas" w:cs="Times New Roman"/>
-          <w:color w:val="000000"/>
-          <w:kern w:val="0"/>
-          <w:sz w:val="21"/>
-          <w:szCs w:val="21"/>
-          <w:lang w:eastAsia="hu-HU"/>
-          <w14:ligatures w14:val="none"/>
-        </w:rPr>
-        <w:t>emit</w:t>
-      </w:r>
-      <w:proofErr w:type="spellEnd"/>
-      <w:r>
-        <w:rPr>
-          <w:rFonts w:ascii="Consolas" w:eastAsia="Times New Roman" w:hAnsi="Consolas" w:cs="Times New Roman"/>
-          <w:color w:val="000000"/>
-          <w:kern w:val="0"/>
-          <w:sz w:val="21"/>
-          <w:szCs w:val="21"/>
-          <w:lang w:eastAsia="hu-HU"/>
-          <w14:ligatures w14:val="none"/>
-        </w:rPr>
-        <w:t>(</w:t>
-      </w:r>
-      <w:proofErr w:type="gramEnd"/>
-    </w:p>
-    <w:p>
-      <w:pPr>
-        <w:shd w:val="clear" w:color="auto" w:fill="FFFFFF"/>
-        <w:spacing w:after="0" w:line="285" w:lineRule="atLeast"/>
-        <w:rPr>
-          <w:rFonts w:ascii="Consolas" w:eastAsia="Times New Roman" w:hAnsi="Consolas" w:cs="Times New Roman"/>
-          <w:color w:val="000000"/>
-          <w:kern w:val="0"/>
-          <w:sz w:val="21"/>
-          <w:szCs w:val="21"/>
-          <w:lang w:eastAsia="hu-HU"/>
-          <w14:ligatures w14:val="none"/>
-        </w:rPr>
-      </w:pPr>
-      <w:r>
-        <w:rPr>
-          <w:rFonts w:ascii="Consolas" w:eastAsia="Times New Roman" w:hAnsi="Consolas" w:cs="Times New Roman"/>
-          <w:color w:val="000000"/>
-          <w:kern w:val="0"/>
-          <w:sz w:val="21"/>
-          <w:szCs w:val="21"/>
-          <w:lang w:eastAsia="hu-HU"/>
-          <w14:ligatures w14:val="none"/>
-        </w:rPr>
-        <w:t xml:space="preserve">        </w:t>
-      </w:r>
-      <w:r>
-        <w:rPr>
-          <w:rFonts w:ascii="Consolas" w:eastAsia="Times New Roman" w:hAnsi="Consolas" w:cs="Times New Roman"/>
-          <w:color w:val="A31515"/>
-          <w:kern w:val="0"/>
-          <w:sz w:val="21"/>
-          <w:szCs w:val="21"/>
-          <w:lang w:eastAsia="hu-HU"/>
-          <w14:ligatures w14:val="none"/>
-        </w:rPr>
-        <w:t>"</w:t>
-      </w:r>
-      <w:proofErr w:type="spellStart"/>
-      <w:r>
-        <w:rPr>
-          <w:rFonts w:ascii="Consolas" w:eastAsia="Times New Roman" w:hAnsi="Consolas" w:cs="Times New Roman"/>
-          <w:color w:val="A31515"/>
-          <w:kern w:val="0"/>
-          <w:sz w:val="21"/>
-          <w:szCs w:val="21"/>
-          <w:lang w:eastAsia="hu-HU"/>
-          <w14:ligatures w14:val="none"/>
-        </w:rPr>
-        <w:t>player_joined</w:t>
-      </w:r>
-      <w:proofErr w:type="spellEnd"/>
-      <w:r>
-        <w:rPr>
-          <w:rFonts w:ascii="Consolas" w:eastAsia="Times New Roman" w:hAnsi="Consolas" w:cs="Times New Roman"/>
-          <w:color w:val="A31515"/>
-          <w:kern w:val="0"/>
-          <w:sz w:val="21"/>
-          <w:szCs w:val="21"/>
-          <w:lang w:eastAsia="hu-HU"/>
-          <w14:ligatures w14:val="none"/>
-        </w:rPr>
-        <w:t>"</w:t>
-      </w:r>
-      <w:r>
-        <w:rPr>
-          <w:rFonts w:ascii="Consolas" w:eastAsia="Times New Roman" w:hAnsi="Consolas" w:cs="Times New Roman"/>
-          <w:color w:val="000000"/>
-          <w:kern w:val="0"/>
-          <w:sz w:val="21"/>
-          <w:szCs w:val="21"/>
-          <w:lang w:eastAsia="hu-HU"/>
-          <w14:ligatures w14:val="none"/>
-        </w:rPr>
-        <w:t>,</w:t>
-      </w:r>
-    </w:p>
-    <w:p>
-      <w:pPr>
-        <w:shd w:val="clear" w:color="auto" w:fill="FFFFFF"/>
-        <w:spacing w:after="0" w:line="285" w:lineRule="atLeast"/>
-        <w:rPr>
-          <w:rFonts w:ascii="Consolas" w:eastAsia="Times New Roman" w:hAnsi="Consolas" w:cs="Times New Roman"/>
-          <w:color w:val="000000"/>
-          <w:kern w:val="0"/>
-          <w:sz w:val="21"/>
-          <w:szCs w:val="21"/>
-          <w:lang w:eastAsia="hu-HU"/>
-          <w14:ligatures w14:val="none"/>
-        </w:rPr>
-      </w:pPr>
-      <w:r>
-        <w:rPr>
-          <w:rFonts w:ascii="Consolas" w:eastAsia="Times New Roman" w:hAnsi="Consolas" w:cs="Times New Roman"/>
-          <w:color w:val="000000"/>
-          <w:kern w:val="0"/>
-          <w:sz w:val="21"/>
-          <w:szCs w:val="21"/>
-          <w:lang w:eastAsia="hu-HU"/>
-          <w14:ligatures w14:val="none"/>
-        </w:rPr>
-        <w:t>        {</w:t>
-      </w:r>
-    </w:p>
-    <w:p>
-      <w:pPr>
-        <w:shd w:val="clear" w:color="auto" w:fill="FFFFFF"/>
-        <w:spacing w:after="0" w:line="285" w:lineRule="atLeast"/>
-        <w:rPr>
-          <w:rFonts w:ascii="Consolas" w:eastAsia="Times New Roman" w:hAnsi="Consolas" w:cs="Times New Roman"/>
-          <w:color w:val="000000"/>
-          <w:kern w:val="0"/>
-          <w:sz w:val="21"/>
-          <w:szCs w:val="21"/>
-          <w:lang w:eastAsia="hu-HU"/>
-          <w14:ligatures w14:val="none"/>
-        </w:rPr>
-      </w:pPr>
-      <w:r>
-        <w:rPr>
-          <w:rFonts w:ascii="Consolas" w:eastAsia="Times New Roman" w:hAnsi="Consolas" w:cs="Times New Roman"/>
-          <w:color w:val="000000"/>
-          <w:kern w:val="0"/>
-          <w:sz w:val="21"/>
-          <w:szCs w:val="21"/>
-          <w:lang w:eastAsia="hu-HU"/>
-          <w14:ligatures w14:val="none"/>
-        </w:rPr>
-        <w:t xml:space="preserve">            </w:t>
-      </w:r>
-      <w:r>
-        <w:rPr>
-          <w:rFonts w:ascii="Consolas" w:eastAsia="Times New Roman" w:hAnsi="Consolas" w:cs="Times New Roman"/>
-          <w:color w:val="A31515"/>
-          <w:kern w:val="0"/>
-          <w:sz w:val="21"/>
-          <w:szCs w:val="21"/>
-          <w:lang w:eastAsia="hu-HU"/>
-          <w14:ligatures w14:val="none"/>
-        </w:rPr>
-        <w:t>"</w:t>
-      </w:r>
-      <w:proofErr w:type="spellStart"/>
-      <w:r>
-        <w:rPr>
-          <w:rFonts w:ascii="Consolas" w:eastAsia="Times New Roman" w:hAnsi="Consolas" w:cs="Times New Roman"/>
-          <w:color w:val="A31515"/>
-          <w:kern w:val="0"/>
-          <w:sz w:val="21"/>
-          <w:szCs w:val="21"/>
-          <w:lang w:eastAsia="hu-HU"/>
-          <w14:ligatures w14:val="none"/>
-        </w:rPr>
-        <w:t>players</w:t>
-      </w:r>
-      <w:proofErr w:type="spellEnd"/>
-      <w:r>
-        <w:rPr>
-          <w:rFonts w:ascii="Consolas" w:eastAsia="Times New Roman" w:hAnsi="Consolas" w:cs="Times New Roman"/>
-          <w:color w:val="A31515"/>
-          <w:kern w:val="0"/>
-          <w:sz w:val="21"/>
-          <w:szCs w:val="21"/>
-          <w:lang w:eastAsia="hu-HU"/>
-          <w14:ligatures w14:val="none"/>
-        </w:rPr>
-        <w:t>"</w:t>
-      </w:r>
-      <w:r>
-        <w:rPr>
-          <w:rFonts w:ascii="Consolas" w:eastAsia="Times New Roman" w:hAnsi="Consolas" w:cs="Times New Roman"/>
-          <w:color w:val="000000"/>
-          <w:kern w:val="0"/>
-          <w:sz w:val="21"/>
-          <w:szCs w:val="21"/>
-          <w:lang w:eastAsia="hu-HU"/>
-          <w14:ligatures w14:val="none"/>
-        </w:rPr>
-        <w:t xml:space="preserve">: </w:t>
-      </w:r>
-      <w:proofErr w:type="spellStart"/>
-      <w:r>
-        <w:rPr>
-          <w:rFonts w:ascii="Consolas" w:eastAsia="Times New Roman" w:hAnsi="Consolas" w:cs="Times New Roman"/>
-          <w:color w:val="000000"/>
-          <w:kern w:val="0"/>
-          <w:sz w:val="21"/>
-          <w:szCs w:val="21"/>
-          <w:lang w:eastAsia="hu-HU"/>
-          <w14:ligatures w14:val="none"/>
-        </w:rPr>
-        <w:t>player_names</w:t>
-      </w:r>
-      <w:proofErr w:type="spellEnd"/>
-      <w:r>
-        <w:rPr>
-          <w:rFonts w:ascii="Consolas" w:eastAsia="Times New Roman" w:hAnsi="Consolas" w:cs="Times New Roman"/>
-          <w:color w:val="000000"/>
-          <w:kern w:val="0"/>
-          <w:sz w:val="21"/>
-          <w:szCs w:val="21"/>
-          <w:lang w:eastAsia="hu-HU"/>
-          <w14:ligatures w14:val="none"/>
-        </w:rPr>
-        <w:t>,</w:t>
-      </w:r>
-    </w:p>
-    <w:p>
-      <w:pPr>
-        <w:shd w:val="clear" w:color="auto" w:fill="FFFFFF"/>
-        <w:spacing w:after="0" w:line="285" w:lineRule="atLeast"/>
-        <w:rPr>
-          <w:rFonts w:ascii="Consolas" w:eastAsia="Times New Roman" w:hAnsi="Consolas" w:cs="Times New Roman"/>
-          <w:color w:val="000000"/>
-          <w:kern w:val="0"/>
-          <w:sz w:val="21"/>
-          <w:szCs w:val="21"/>
-          <w:lang w:eastAsia="hu-HU"/>
-          <w14:ligatures w14:val="none"/>
-        </w:rPr>
-      </w:pPr>
-      <w:r>
-        <w:rPr>
-          <w:rFonts w:ascii="Consolas" w:eastAsia="Times New Roman" w:hAnsi="Consolas" w:cs="Times New Roman"/>
-          <w:color w:val="000000"/>
-          <w:kern w:val="0"/>
-          <w:sz w:val="21"/>
-          <w:szCs w:val="21"/>
-          <w:lang w:eastAsia="hu-HU"/>
-          <w14:ligatures w14:val="none"/>
-        </w:rPr>
-        <w:t xml:space="preserve">            </w:t>
-      </w:r>
-      <w:r>
-        <w:rPr>
-          <w:rFonts w:ascii="Consolas" w:eastAsia="Times New Roman" w:hAnsi="Consolas" w:cs="Times New Roman"/>
-          <w:color w:val="A31515"/>
-          <w:kern w:val="0"/>
-          <w:sz w:val="21"/>
-          <w:szCs w:val="21"/>
-          <w:lang w:eastAsia="hu-HU"/>
-          <w14:ligatures w14:val="none"/>
-        </w:rPr>
-        <w:t>"</w:t>
-      </w:r>
-      <w:proofErr w:type="spellStart"/>
-      <w:r>
-        <w:rPr>
-          <w:rFonts w:ascii="Consolas" w:eastAsia="Times New Roman" w:hAnsi="Consolas" w:cs="Times New Roman"/>
-          <w:color w:val="A31515"/>
-          <w:kern w:val="0"/>
-          <w:sz w:val="21"/>
-          <w:szCs w:val="21"/>
-          <w:lang w:eastAsia="hu-HU"/>
-          <w14:ligatures w14:val="none"/>
-        </w:rPr>
-        <w:t>joined_player</w:t>
-      </w:r>
-      <w:proofErr w:type="spellEnd"/>
-      <w:r>
-        <w:rPr>
-          <w:rFonts w:ascii="Consolas" w:eastAsia="Times New Roman" w:hAnsi="Consolas" w:cs="Times New Roman"/>
-          <w:color w:val="A31515"/>
-          <w:kern w:val="0"/>
-          <w:sz w:val="21"/>
-          <w:szCs w:val="21"/>
-          <w:lang w:eastAsia="hu-HU"/>
-          <w14:ligatures w14:val="none"/>
-        </w:rPr>
-        <w:t>"</w:t>
-      </w:r>
-      <w:r>
-        <w:rPr>
-          <w:rFonts w:ascii="Consolas" w:eastAsia="Times New Roman" w:hAnsi="Consolas" w:cs="Times New Roman"/>
-          <w:color w:val="000000"/>
-          <w:kern w:val="0"/>
-          <w:sz w:val="21"/>
-          <w:szCs w:val="21"/>
-          <w:lang w:eastAsia="hu-HU"/>
-          <w14:ligatures w14:val="none"/>
-        </w:rPr>
-        <w:t xml:space="preserve">: </w:t>
-      </w:r>
-      <w:proofErr w:type="spellStart"/>
-      <w:r>
-        <w:rPr>
-          <w:rFonts w:ascii="Consolas" w:eastAsia="Times New Roman" w:hAnsi="Consolas" w:cs="Times New Roman"/>
-          <w:color w:val="000000"/>
-          <w:kern w:val="0"/>
-          <w:sz w:val="21"/>
-          <w:szCs w:val="21"/>
-          <w:lang w:eastAsia="hu-HU"/>
-          <w14:ligatures w14:val="none"/>
-        </w:rPr>
-        <w:t>username</w:t>
-      </w:r>
-      <w:proofErr w:type="spellEnd"/>
-      <w:r>
-        <w:rPr>
-          <w:rFonts w:ascii="Consolas" w:eastAsia="Times New Roman" w:hAnsi="Consolas" w:cs="Times New Roman"/>
-          <w:color w:val="000000"/>
-          <w:kern w:val="0"/>
-          <w:sz w:val="21"/>
-          <w:szCs w:val="21"/>
-          <w:lang w:eastAsia="hu-HU"/>
-          <w14:ligatures w14:val="none"/>
-        </w:rPr>
-        <w:t>,</w:t>
-      </w:r>
-    </w:p>
-    <w:p>
-      <w:pPr>
-        <w:shd w:val="clear" w:color="auto" w:fill="FFFFFF"/>
-        <w:spacing w:after="0" w:line="285" w:lineRule="atLeast"/>
-        <w:rPr>
-          <w:rFonts w:ascii="Consolas" w:eastAsia="Times New Roman" w:hAnsi="Consolas" w:cs="Times New Roman"/>
-          <w:color w:val="000000"/>
-          <w:kern w:val="0"/>
-          <w:sz w:val="21"/>
-          <w:szCs w:val="21"/>
-          <w:lang w:eastAsia="hu-HU"/>
-          <w14:ligatures w14:val="none"/>
-        </w:rPr>
-      </w:pPr>
-      <w:r>
-        <w:rPr>
-          <w:rFonts w:ascii="Consolas" w:eastAsia="Times New Roman" w:hAnsi="Consolas" w:cs="Times New Roman"/>
-          <w:color w:val="000000"/>
-          <w:kern w:val="0"/>
-          <w:sz w:val="21"/>
-          <w:szCs w:val="21"/>
-          <w:lang w:eastAsia="hu-HU"/>
-          <w14:ligatures w14:val="none"/>
-        </w:rPr>
-        <w:t>        },</w:t>
-      </w:r>
-    </w:p>
-    <w:p>
-      <w:pPr>
-        <w:shd w:val="clear" w:color="auto" w:fill="FFFFFF"/>
-        <w:spacing w:after="0" w:line="285" w:lineRule="atLeast"/>
-        <w:rPr>
-          <w:rFonts w:ascii="Consolas" w:eastAsia="Times New Roman" w:hAnsi="Consolas" w:cs="Times New Roman"/>
-          <w:color w:val="000000"/>
-          <w:kern w:val="0"/>
-          <w:sz w:val="21"/>
-          <w:szCs w:val="21"/>
-          <w:lang w:eastAsia="hu-HU"/>
-          <w14:ligatures w14:val="none"/>
-        </w:rPr>
-      </w:pPr>
-      <w:r>
-        <w:rPr>
-          <w:rFonts w:ascii="Consolas" w:eastAsia="Times New Roman" w:hAnsi="Consolas" w:cs="Times New Roman"/>
-          <w:color w:val="000000"/>
-          <w:kern w:val="0"/>
-          <w:sz w:val="21"/>
-          <w:szCs w:val="21"/>
-          <w:lang w:eastAsia="hu-HU"/>
-          <w14:ligatures w14:val="none"/>
-        </w:rPr>
-        <w:t xml:space="preserve">        </w:t>
-      </w:r>
-      <w:proofErr w:type="spellStart"/>
-      <w:r>
-        <w:rPr>
-          <w:rFonts w:ascii="Consolas" w:eastAsia="Times New Roman" w:hAnsi="Consolas" w:cs="Times New Roman"/>
-          <w:color w:val="000000"/>
-          <w:kern w:val="0"/>
-          <w:sz w:val="21"/>
-          <w:szCs w:val="21"/>
-          <w:lang w:eastAsia="hu-HU"/>
-          <w14:ligatures w14:val="none"/>
-        </w:rPr>
-        <w:t>room</w:t>
-      </w:r>
-      <w:proofErr w:type="spellEnd"/>
-      <w:r>
-        <w:rPr>
-          <w:rFonts w:ascii="Consolas" w:eastAsia="Times New Roman" w:hAnsi="Consolas" w:cs="Times New Roman"/>
-          <w:color w:val="000000"/>
-          <w:kern w:val="0"/>
-          <w:sz w:val="21"/>
-          <w:szCs w:val="21"/>
-          <w:lang w:eastAsia="hu-HU"/>
-          <w14:ligatures w14:val="none"/>
-        </w:rPr>
-        <w:t>=</w:t>
-      </w:r>
-      <w:proofErr w:type="spellStart"/>
-      <w:r>
-        <w:rPr>
-          <w:rFonts w:ascii="Consolas" w:eastAsia="Times New Roman" w:hAnsi="Consolas" w:cs="Times New Roman"/>
-          <w:color w:val="000000"/>
-          <w:kern w:val="0"/>
-          <w:sz w:val="21"/>
-          <w:szCs w:val="21"/>
-          <w:lang w:eastAsia="hu-HU"/>
-          <w14:ligatures w14:val="none"/>
-        </w:rPr>
-        <w:t>room_id</w:t>
-      </w:r>
-      <w:proofErr w:type="spellEnd"/>
-      <w:r>
-        <w:rPr>
-          <w:rFonts w:ascii="Consolas" w:eastAsia="Times New Roman" w:hAnsi="Consolas" w:cs="Times New Roman"/>
-          <w:color w:val="000000"/>
-          <w:kern w:val="0"/>
-          <w:sz w:val="21"/>
-          <w:szCs w:val="21"/>
-          <w:lang w:eastAsia="hu-HU"/>
-          <w14:ligatures w14:val="none"/>
-        </w:rPr>
-        <w:t>,</w:t>
-      </w:r>
-    </w:p>
-    <w:p>
-      <w:pPr>
-        <w:shd w:val="clear" w:color="auto" w:fill="FFFFFF"/>
-        <w:spacing w:after="0" w:line="285" w:lineRule="atLeast"/>
-        <w:rPr>
-          <w:rFonts w:ascii="Consolas" w:eastAsia="Times New Roman" w:hAnsi="Consolas" w:cs="Times New Roman"/>
-          <w:color w:val="000000"/>
-          <w:kern w:val="0"/>
-          <w:sz w:val="21"/>
-          <w:szCs w:val="21"/>
-          <w:lang w:eastAsia="hu-HU"/>
-          <w14:ligatures w14:val="none"/>
-        </w:rPr>
-      </w:pPr>
-      <w:r>
-        <w:rPr>
-          <w:rFonts w:ascii="Consolas" w:eastAsia="Times New Roman" w:hAnsi="Consolas" w:cs="Times New Roman"/>
-          <w:color w:val="000000"/>
-          <w:kern w:val="0"/>
-          <w:sz w:val="21"/>
-          <w:szCs w:val="21"/>
-          <w:lang w:eastAsia="hu-HU"/>
-          <w14:ligatures w14:val="none"/>
-        </w:rPr>
-        <w:t>    )</w:t>
-      </w:r>
-    </w:p>
-    <w:p>
-      <w:pPr>
-        <w:shd w:val="clear" w:color="auto" w:fill="FFFFFF"/>
-        <w:spacing w:after="0" w:line="285" w:lineRule="atLeast"/>
-        <w:rPr>
-          <w:rFonts w:ascii="Consolas" w:eastAsia="Times New Roman" w:hAnsi="Consolas" w:cs="Times New Roman"/>
-          <w:b/>
-          <w:bCs/>
-          <w:color w:val="000000"/>
-          <w:kern w:val="0"/>
-          <w:sz w:val="21"/>
-          <w:szCs w:val="21"/>
-          <w:lang w:eastAsia="hu-HU"/>
-          <w14:ligatures w14:val="none"/>
-        </w:rPr>
-      </w:pPr>
-    </w:p>
-    <w:p>
-      <w:pPr>
-        <w:spacing w:line="360" w:lineRule="auto"/>
-        <w:jc w:val="both"/>
+      </w:pPr>
+      <w:r>
         <w:rPr>
           <w:rFonts w:ascii="Times New Roman" w:hAnsi="Times New Roman" w:cs="Times New Roman"/>
           <w:b/>
           <w:bCs/>
           <w:sz w:val="24"/>
         </w:rPr>
-      </w:pPr>
-      <w:r>
+        <w:t>Szerver oldali kód részlet:</w:t>
+      </w:r>
+    </w:p>
+    <w:p>
+      <w:pPr>
+        <w:shd w:val="clear" w:color="auto" w:fill="FFFFFF"/>
+        <w:spacing w:after="0" w:line="285" w:lineRule="atLeast"/>
+        <w:rPr>
+          <w:rFonts w:ascii="Consolas" w:eastAsia="Times New Roman" w:hAnsi="Consolas" w:cs="Times New Roman"/>
+          <w:color w:val="000000"/>
+          <w:kern w:val="0"/>
+          <w:sz w:val="21"/>
+          <w:szCs w:val="21"/>
+          <w:lang w:eastAsia="hu-HU"/>
+          <w14:ligatures w14:val="none"/>
+        </w:rPr>
+      </w:pPr>
+      <w:proofErr w:type="spellStart"/>
+      <w:proofErr w:type="gramStart"/>
+      <w:r>
+        <w:rPr>
+          <w:rFonts w:ascii="Consolas" w:eastAsia="Times New Roman" w:hAnsi="Consolas" w:cs="Times New Roman"/>
+          <w:color w:val="000000"/>
+          <w:kern w:val="0"/>
+          <w:sz w:val="21"/>
+          <w:szCs w:val="21"/>
+          <w:lang w:eastAsia="hu-HU"/>
+          <w14:ligatures w14:val="none"/>
+        </w:rPr>
+        <w:t>emit</w:t>
+      </w:r>
+      <w:proofErr w:type="spellEnd"/>
+      <w:r>
+        <w:rPr>
+          <w:rFonts w:ascii="Consolas" w:eastAsia="Times New Roman" w:hAnsi="Consolas" w:cs="Times New Roman"/>
+          <w:color w:val="000000"/>
+          <w:kern w:val="0"/>
+          <w:sz w:val="21"/>
+          <w:szCs w:val="21"/>
+          <w:lang w:eastAsia="hu-HU"/>
+          <w14:ligatures w14:val="none"/>
+        </w:rPr>
+        <w:t>(</w:t>
+      </w:r>
+      <w:proofErr w:type="gramEnd"/>
+    </w:p>
+    <w:p>
+      <w:pPr>
+        <w:shd w:val="clear" w:color="auto" w:fill="FFFFFF"/>
+        <w:spacing w:after="0" w:line="285" w:lineRule="atLeast"/>
+        <w:rPr>
+          <w:rFonts w:ascii="Consolas" w:eastAsia="Times New Roman" w:hAnsi="Consolas" w:cs="Times New Roman"/>
+          <w:color w:val="000000"/>
+          <w:kern w:val="0"/>
+          <w:sz w:val="21"/>
+          <w:szCs w:val="21"/>
+          <w:lang w:eastAsia="hu-HU"/>
+          <w14:ligatures w14:val="none"/>
+        </w:rPr>
+      </w:pPr>
+      <w:r>
+        <w:rPr>
+          <w:rFonts w:ascii="Consolas" w:eastAsia="Times New Roman" w:hAnsi="Consolas" w:cs="Times New Roman"/>
+          <w:color w:val="000000"/>
+          <w:kern w:val="0"/>
+          <w:sz w:val="21"/>
+          <w:szCs w:val="21"/>
+          <w:lang w:eastAsia="hu-HU"/>
+          <w14:ligatures w14:val="none"/>
+        </w:rPr>
+        <w:t xml:space="preserve">        </w:t>
+      </w:r>
+      <w:commentRangeStart w:id="64"/>
+      <w:r>
+        <w:rPr>
+          <w:rFonts w:ascii="Consolas" w:eastAsia="Times New Roman" w:hAnsi="Consolas" w:cs="Times New Roman"/>
+          <w:color w:val="A31515"/>
+          <w:kern w:val="0"/>
+          <w:sz w:val="21"/>
+          <w:szCs w:val="21"/>
+          <w:lang w:eastAsia="hu-HU"/>
+          <w14:ligatures w14:val="none"/>
+        </w:rPr>
+        <w:t>"</w:t>
+      </w:r>
+      <w:proofErr w:type="spellStart"/>
+      <w:r>
+        <w:rPr>
+          <w:rFonts w:ascii="Consolas" w:eastAsia="Times New Roman" w:hAnsi="Consolas" w:cs="Times New Roman"/>
+          <w:color w:val="A31515"/>
+          <w:kern w:val="0"/>
+          <w:sz w:val="21"/>
+          <w:szCs w:val="21"/>
+          <w:lang w:eastAsia="hu-HU"/>
+          <w14:ligatures w14:val="none"/>
+        </w:rPr>
+        <w:t>player_joined</w:t>
+      </w:r>
+      <w:proofErr w:type="spellEnd"/>
+      <w:r>
+        <w:rPr>
+          <w:rFonts w:ascii="Consolas" w:eastAsia="Times New Roman" w:hAnsi="Consolas" w:cs="Times New Roman"/>
+          <w:color w:val="A31515"/>
+          <w:kern w:val="0"/>
+          <w:sz w:val="21"/>
+          <w:szCs w:val="21"/>
+          <w:lang w:eastAsia="hu-HU"/>
+          <w14:ligatures w14:val="none"/>
+        </w:rPr>
+        <w:t>"</w:t>
+      </w:r>
+      <w:r>
+        <w:rPr>
+          <w:rFonts w:ascii="Consolas" w:eastAsia="Times New Roman" w:hAnsi="Consolas" w:cs="Times New Roman"/>
+          <w:color w:val="000000"/>
+          <w:kern w:val="0"/>
+          <w:sz w:val="21"/>
+          <w:szCs w:val="21"/>
+          <w:lang w:eastAsia="hu-HU"/>
+          <w14:ligatures w14:val="none"/>
+        </w:rPr>
+        <w:t>,</w:t>
+      </w:r>
+      <w:commentRangeEnd w:id="64"/>
+      <w:r>
+        <w:rPr>
+          <w:rStyle w:val="CommentReference"/>
+          <w:rFonts w:ascii="Times New Roman" w:hAnsi="Times New Roman"/>
+        </w:rPr>
+        <w:commentReference w:id="64"/>
+      </w:r>
+    </w:p>
+    <w:p>
+      <w:pPr>
+        <w:shd w:val="clear" w:color="auto" w:fill="FFFFFF"/>
+        <w:spacing w:after="0" w:line="285" w:lineRule="atLeast"/>
+        <w:rPr>
+          <w:rFonts w:ascii="Consolas" w:eastAsia="Times New Roman" w:hAnsi="Consolas" w:cs="Times New Roman"/>
+          <w:color w:val="000000"/>
+          <w:kern w:val="0"/>
+          <w:sz w:val="21"/>
+          <w:szCs w:val="21"/>
+          <w:lang w:eastAsia="hu-HU"/>
+          <w14:ligatures w14:val="none"/>
+        </w:rPr>
+      </w:pPr>
+      <w:r>
+        <w:rPr>
+          <w:rFonts w:ascii="Consolas" w:eastAsia="Times New Roman" w:hAnsi="Consolas" w:cs="Times New Roman"/>
+          <w:color w:val="000000"/>
+          <w:kern w:val="0"/>
+          <w:sz w:val="21"/>
+          <w:szCs w:val="21"/>
+          <w:lang w:eastAsia="hu-HU"/>
+          <w14:ligatures w14:val="none"/>
+        </w:rPr>
+        <w:t>        {</w:t>
+      </w:r>
+    </w:p>
+    <w:p>
+      <w:pPr>
+        <w:shd w:val="clear" w:color="auto" w:fill="FFFFFF"/>
+        <w:spacing w:after="0" w:line="285" w:lineRule="atLeast"/>
+        <w:rPr>
+          <w:rFonts w:ascii="Consolas" w:eastAsia="Times New Roman" w:hAnsi="Consolas" w:cs="Times New Roman"/>
+          <w:color w:val="000000"/>
+          <w:kern w:val="0"/>
+          <w:sz w:val="21"/>
+          <w:szCs w:val="21"/>
+          <w:lang w:eastAsia="hu-HU"/>
+          <w14:ligatures w14:val="none"/>
+        </w:rPr>
+      </w:pPr>
+      <w:r>
+        <w:rPr>
+          <w:rFonts w:ascii="Consolas" w:eastAsia="Times New Roman" w:hAnsi="Consolas" w:cs="Times New Roman"/>
+          <w:color w:val="000000"/>
+          <w:kern w:val="0"/>
+          <w:sz w:val="21"/>
+          <w:szCs w:val="21"/>
+          <w:lang w:eastAsia="hu-HU"/>
+          <w14:ligatures w14:val="none"/>
+        </w:rPr>
+        <w:t xml:space="preserve">            </w:t>
+      </w:r>
+      <w:r>
+        <w:rPr>
+          <w:rFonts w:ascii="Consolas" w:eastAsia="Times New Roman" w:hAnsi="Consolas" w:cs="Times New Roman"/>
+          <w:color w:val="A31515"/>
+          <w:kern w:val="0"/>
+          <w:sz w:val="21"/>
+          <w:szCs w:val="21"/>
+          <w:lang w:eastAsia="hu-HU"/>
+          <w14:ligatures w14:val="none"/>
+        </w:rPr>
+        <w:t>"</w:t>
+      </w:r>
+      <w:proofErr w:type="spellStart"/>
+      <w:r>
+        <w:rPr>
+          <w:rFonts w:ascii="Consolas" w:eastAsia="Times New Roman" w:hAnsi="Consolas" w:cs="Times New Roman"/>
+          <w:color w:val="A31515"/>
+          <w:kern w:val="0"/>
+          <w:sz w:val="21"/>
+          <w:szCs w:val="21"/>
+          <w:lang w:eastAsia="hu-HU"/>
+          <w14:ligatures w14:val="none"/>
+        </w:rPr>
+        <w:t>players</w:t>
+      </w:r>
+      <w:proofErr w:type="spellEnd"/>
+      <w:r>
+        <w:rPr>
+          <w:rFonts w:ascii="Consolas" w:eastAsia="Times New Roman" w:hAnsi="Consolas" w:cs="Times New Roman"/>
+          <w:color w:val="A31515"/>
+          <w:kern w:val="0"/>
+          <w:sz w:val="21"/>
+          <w:szCs w:val="21"/>
+          <w:lang w:eastAsia="hu-HU"/>
+          <w14:ligatures w14:val="none"/>
+        </w:rPr>
+        <w:t>"</w:t>
+      </w:r>
+      <w:r>
+        <w:rPr>
+          <w:rFonts w:ascii="Consolas" w:eastAsia="Times New Roman" w:hAnsi="Consolas" w:cs="Times New Roman"/>
+          <w:color w:val="000000"/>
+          <w:kern w:val="0"/>
+          <w:sz w:val="21"/>
+          <w:szCs w:val="21"/>
+          <w:lang w:eastAsia="hu-HU"/>
+          <w14:ligatures w14:val="none"/>
+        </w:rPr>
+        <w:t xml:space="preserve">: </w:t>
+      </w:r>
+      <w:proofErr w:type="spellStart"/>
+      <w:r>
+        <w:rPr>
+          <w:rFonts w:ascii="Consolas" w:eastAsia="Times New Roman" w:hAnsi="Consolas" w:cs="Times New Roman"/>
+          <w:color w:val="000000"/>
+          <w:kern w:val="0"/>
+          <w:sz w:val="21"/>
+          <w:szCs w:val="21"/>
+          <w:lang w:eastAsia="hu-HU"/>
+          <w14:ligatures w14:val="none"/>
+        </w:rPr>
+        <w:t>player_names</w:t>
+      </w:r>
+      <w:proofErr w:type="spellEnd"/>
+      <w:r>
+        <w:rPr>
+          <w:rFonts w:ascii="Consolas" w:eastAsia="Times New Roman" w:hAnsi="Consolas" w:cs="Times New Roman"/>
+          <w:color w:val="000000"/>
+          <w:kern w:val="0"/>
+          <w:sz w:val="21"/>
+          <w:szCs w:val="21"/>
+          <w:lang w:eastAsia="hu-HU"/>
+          <w14:ligatures w14:val="none"/>
+        </w:rPr>
+        <w:t>,</w:t>
+      </w:r>
+    </w:p>
+    <w:p>
+      <w:pPr>
+        <w:shd w:val="clear" w:color="auto" w:fill="FFFFFF"/>
+        <w:spacing w:after="0" w:line="285" w:lineRule="atLeast"/>
+        <w:rPr>
+          <w:rFonts w:ascii="Consolas" w:eastAsia="Times New Roman" w:hAnsi="Consolas" w:cs="Times New Roman"/>
+          <w:color w:val="000000"/>
+          <w:kern w:val="0"/>
+          <w:sz w:val="21"/>
+          <w:szCs w:val="21"/>
+          <w:lang w:eastAsia="hu-HU"/>
+          <w14:ligatures w14:val="none"/>
+        </w:rPr>
+      </w:pPr>
+      <w:r>
+        <w:rPr>
+          <w:rFonts w:ascii="Consolas" w:eastAsia="Times New Roman" w:hAnsi="Consolas" w:cs="Times New Roman"/>
+          <w:color w:val="000000"/>
+          <w:kern w:val="0"/>
+          <w:sz w:val="21"/>
+          <w:szCs w:val="21"/>
+          <w:lang w:eastAsia="hu-HU"/>
+          <w14:ligatures w14:val="none"/>
+        </w:rPr>
+        <w:t xml:space="preserve">            </w:t>
+      </w:r>
+      <w:r>
+        <w:rPr>
+          <w:rFonts w:ascii="Consolas" w:eastAsia="Times New Roman" w:hAnsi="Consolas" w:cs="Times New Roman"/>
+          <w:color w:val="A31515"/>
+          <w:kern w:val="0"/>
+          <w:sz w:val="21"/>
+          <w:szCs w:val="21"/>
+          <w:lang w:eastAsia="hu-HU"/>
+          <w14:ligatures w14:val="none"/>
+        </w:rPr>
+        <w:t>"</w:t>
+      </w:r>
+      <w:proofErr w:type="spellStart"/>
+      <w:r>
+        <w:rPr>
+          <w:rFonts w:ascii="Consolas" w:eastAsia="Times New Roman" w:hAnsi="Consolas" w:cs="Times New Roman"/>
+          <w:color w:val="A31515"/>
+          <w:kern w:val="0"/>
+          <w:sz w:val="21"/>
+          <w:szCs w:val="21"/>
+          <w:lang w:eastAsia="hu-HU"/>
+          <w14:ligatures w14:val="none"/>
+        </w:rPr>
+        <w:t>joined_player</w:t>
+      </w:r>
+      <w:proofErr w:type="spellEnd"/>
+      <w:r>
+        <w:rPr>
+          <w:rFonts w:ascii="Consolas" w:eastAsia="Times New Roman" w:hAnsi="Consolas" w:cs="Times New Roman"/>
+          <w:color w:val="A31515"/>
+          <w:kern w:val="0"/>
+          <w:sz w:val="21"/>
+          <w:szCs w:val="21"/>
+          <w:lang w:eastAsia="hu-HU"/>
+          <w14:ligatures w14:val="none"/>
+        </w:rPr>
+        <w:t>"</w:t>
+      </w:r>
+      <w:r>
+        <w:rPr>
+          <w:rFonts w:ascii="Consolas" w:eastAsia="Times New Roman" w:hAnsi="Consolas" w:cs="Times New Roman"/>
+          <w:color w:val="000000"/>
+          <w:kern w:val="0"/>
+          <w:sz w:val="21"/>
+          <w:szCs w:val="21"/>
+          <w:lang w:eastAsia="hu-HU"/>
+          <w14:ligatures w14:val="none"/>
+        </w:rPr>
+        <w:t xml:space="preserve">: </w:t>
+      </w:r>
+      <w:proofErr w:type="spellStart"/>
+      <w:r>
+        <w:rPr>
+          <w:rFonts w:ascii="Consolas" w:eastAsia="Times New Roman" w:hAnsi="Consolas" w:cs="Times New Roman"/>
+          <w:color w:val="000000"/>
+          <w:kern w:val="0"/>
+          <w:sz w:val="21"/>
+          <w:szCs w:val="21"/>
+          <w:lang w:eastAsia="hu-HU"/>
+          <w14:ligatures w14:val="none"/>
+        </w:rPr>
+        <w:t>username</w:t>
+      </w:r>
+      <w:proofErr w:type="spellEnd"/>
+      <w:r>
+        <w:rPr>
+          <w:rFonts w:ascii="Consolas" w:eastAsia="Times New Roman" w:hAnsi="Consolas" w:cs="Times New Roman"/>
+          <w:color w:val="000000"/>
+          <w:kern w:val="0"/>
+          <w:sz w:val="21"/>
+          <w:szCs w:val="21"/>
+          <w:lang w:eastAsia="hu-HU"/>
+          <w14:ligatures w14:val="none"/>
+        </w:rPr>
+        <w:t>,</w:t>
+      </w:r>
+    </w:p>
+    <w:p>
+      <w:pPr>
+        <w:shd w:val="clear" w:color="auto" w:fill="FFFFFF"/>
+        <w:spacing w:after="0" w:line="285" w:lineRule="atLeast"/>
+        <w:rPr>
+          <w:rFonts w:ascii="Consolas" w:eastAsia="Times New Roman" w:hAnsi="Consolas" w:cs="Times New Roman"/>
+          <w:color w:val="000000"/>
+          <w:kern w:val="0"/>
+          <w:sz w:val="21"/>
+          <w:szCs w:val="21"/>
+          <w:lang w:eastAsia="hu-HU"/>
+          <w14:ligatures w14:val="none"/>
+        </w:rPr>
+      </w:pPr>
+      <w:r>
+        <w:rPr>
+          <w:rFonts w:ascii="Consolas" w:eastAsia="Times New Roman" w:hAnsi="Consolas" w:cs="Times New Roman"/>
+          <w:color w:val="000000"/>
+          <w:kern w:val="0"/>
+          <w:sz w:val="21"/>
+          <w:szCs w:val="21"/>
+          <w:lang w:eastAsia="hu-HU"/>
+          <w14:ligatures w14:val="none"/>
+        </w:rPr>
+        <w:t>        },</w:t>
+      </w:r>
+    </w:p>
+    <w:p>
+      <w:pPr>
+        <w:shd w:val="clear" w:color="auto" w:fill="FFFFFF"/>
+        <w:spacing w:after="0" w:line="285" w:lineRule="atLeast"/>
+        <w:rPr>
+          <w:rFonts w:ascii="Consolas" w:eastAsia="Times New Roman" w:hAnsi="Consolas" w:cs="Times New Roman"/>
+          <w:color w:val="000000"/>
+          <w:kern w:val="0"/>
+          <w:sz w:val="21"/>
+          <w:szCs w:val="21"/>
+          <w:lang w:eastAsia="hu-HU"/>
+          <w14:ligatures w14:val="none"/>
+        </w:rPr>
+      </w:pPr>
+      <w:r>
+        <w:rPr>
+          <w:rFonts w:ascii="Consolas" w:eastAsia="Times New Roman" w:hAnsi="Consolas" w:cs="Times New Roman"/>
+          <w:color w:val="000000"/>
+          <w:kern w:val="0"/>
+          <w:sz w:val="21"/>
+          <w:szCs w:val="21"/>
+          <w:lang w:eastAsia="hu-HU"/>
+          <w14:ligatures w14:val="none"/>
+        </w:rPr>
+        <w:t xml:space="preserve">        </w:t>
+      </w:r>
+      <w:proofErr w:type="spellStart"/>
+      <w:r>
+        <w:rPr>
+          <w:rFonts w:ascii="Consolas" w:eastAsia="Times New Roman" w:hAnsi="Consolas" w:cs="Times New Roman"/>
+          <w:color w:val="000000"/>
+          <w:kern w:val="0"/>
+          <w:sz w:val="21"/>
+          <w:szCs w:val="21"/>
+          <w:lang w:eastAsia="hu-HU"/>
+          <w14:ligatures w14:val="none"/>
+        </w:rPr>
+        <w:t>room</w:t>
+      </w:r>
+      <w:proofErr w:type="spellEnd"/>
+      <w:r>
+        <w:rPr>
+          <w:rFonts w:ascii="Consolas" w:eastAsia="Times New Roman" w:hAnsi="Consolas" w:cs="Times New Roman"/>
+          <w:color w:val="000000"/>
+          <w:kern w:val="0"/>
+          <w:sz w:val="21"/>
+          <w:szCs w:val="21"/>
+          <w:lang w:eastAsia="hu-HU"/>
+          <w14:ligatures w14:val="none"/>
+        </w:rPr>
+        <w:t>=</w:t>
+      </w:r>
+      <w:proofErr w:type="spellStart"/>
+      <w:r>
+        <w:rPr>
+          <w:rFonts w:ascii="Consolas" w:eastAsia="Times New Roman" w:hAnsi="Consolas" w:cs="Times New Roman"/>
+          <w:color w:val="000000"/>
+          <w:kern w:val="0"/>
+          <w:sz w:val="21"/>
+          <w:szCs w:val="21"/>
+          <w:lang w:eastAsia="hu-HU"/>
+          <w14:ligatures w14:val="none"/>
+        </w:rPr>
+        <w:t>room_id</w:t>
+      </w:r>
+      <w:proofErr w:type="spellEnd"/>
+      <w:r>
+        <w:rPr>
+          <w:rFonts w:ascii="Consolas" w:eastAsia="Times New Roman" w:hAnsi="Consolas" w:cs="Times New Roman"/>
+          <w:color w:val="000000"/>
+          <w:kern w:val="0"/>
+          <w:sz w:val="21"/>
+          <w:szCs w:val="21"/>
+          <w:lang w:eastAsia="hu-HU"/>
+          <w14:ligatures w14:val="none"/>
+        </w:rPr>
+        <w:t>,</w:t>
+      </w:r>
+    </w:p>
+    <w:p>
+      <w:pPr>
+        <w:shd w:val="clear" w:color="auto" w:fill="FFFFFF"/>
+        <w:spacing w:after="0" w:line="285" w:lineRule="atLeast"/>
+        <w:rPr>
+          <w:rFonts w:ascii="Consolas" w:eastAsia="Times New Roman" w:hAnsi="Consolas" w:cs="Times New Roman"/>
+          <w:color w:val="000000"/>
+          <w:kern w:val="0"/>
+          <w:sz w:val="21"/>
+          <w:szCs w:val="21"/>
+          <w:lang w:eastAsia="hu-HU"/>
+          <w14:ligatures w14:val="none"/>
+        </w:rPr>
+      </w:pPr>
+      <w:r>
+        <w:rPr>
+          <w:rFonts w:ascii="Consolas" w:eastAsia="Times New Roman" w:hAnsi="Consolas" w:cs="Times New Roman"/>
+          <w:color w:val="000000"/>
+          <w:kern w:val="0"/>
+          <w:sz w:val="21"/>
+          <w:szCs w:val="21"/>
+          <w:lang w:eastAsia="hu-HU"/>
+          <w14:ligatures w14:val="none"/>
+        </w:rPr>
+        <w:t>    )</w:t>
+      </w:r>
+    </w:p>
+    <w:p>
+      <w:pPr>
+        <w:shd w:val="clear" w:color="auto" w:fill="FFFFFF"/>
+        <w:spacing w:after="0" w:line="285" w:lineRule="atLeast"/>
+        <w:rPr>
+          <w:rFonts w:ascii="Consolas" w:eastAsia="Times New Roman" w:hAnsi="Consolas" w:cs="Times New Roman"/>
+          <w:b/>
+          <w:bCs/>
+          <w:color w:val="000000"/>
+          <w:kern w:val="0"/>
+          <w:sz w:val="21"/>
+          <w:szCs w:val="21"/>
+          <w:lang w:eastAsia="hu-HU"/>
+          <w14:ligatures w14:val="none"/>
+        </w:rPr>
+      </w:pPr>
+    </w:p>
+    <w:p>
+      <w:pPr>
+        <w:spacing w:line="360" w:lineRule="auto"/>
+        <w:jc w:val="both"/>
         <w:rPr>
           <w:rFonts w:ascii="Times New Roman" w:hAnsi="Times New Roman" w:cs="Times New Roman"/>
           <w:b/>
           <w:bCs/>
           <w:sz w:val="24"/>
         </w:rPr>
+      </w:pPr>
+      <w:r>
+        <w:rPr>
+          <w:rFonts w:ascii="Times New Roman" w:hAnsi="Times New Roman" w:cs="Times New Roman"/>
+          <w:b/>
+          <w:bCs/>
+          <w:sz w:val="24"/>
+        </w:rPr>
         <w:t>Mi az a session?</w:t>
       </w:r>
     </w:p>
@@ -8866,7 +9444,87 @@
           <w:rFonts w:ascii="Times New Roman" w:hAnsi="Times New Roman"/>
           <w:sz w:val="24"/>
         </w:rPr>
-        <w:t xml:space="preserve"> segítségével adatokat lehet tárolni egy kliensről például felhasználói adatokat. Ezekhez az adatokhoz gyorsan és egyszerűen hozzá férhetünk viszont ezek az adatok csak addig tarolódnak míg a kliens és a szerver között él a kapcsolat. Tehát ha a kliens kilép elvesznek az adatok. Ezért érdemes ezeket eltárolni egy adatbázisban.</w:t>
+        <w:t xml:space="preserve"> segítségével adatokat lehet tárolni egy kliensről</w:t>
+      </w:r>
+      <w:ins w:id="65" w:author="Ősz Olivér" w:date="2025-04-06T13:07:00Z" w16du:dateUtc="2025-04-06T11:07:00Z">
+        <w:r>
+          <w:rPr>
+            <w:rFonts w:ascii="Times New Roman" w:hAnsi="Times New Roman"/>
+            <w:sz w:val="24"/>
+          </w:rPr>
+          <w:t>,</w:t>
+        </w:r>
+      </w:ins>
+      <w:r>
+        <w:rPr>
+          <w:rFonts w:ascii="Times New Roman" w:hAnsi="Times New Roman"/>
+          <w:sz w:val="24"/>
+        </w:rPr>
+        <w:t xml:space="preserve"> például felhasználói adatokat. Ezekhez az adatokhoz gyorsan és egyszerűen hozzá</w:t>
+      </w:r>
+      <w:del w:id="66" w:author="Ősz Olivér" w:date="2025-04-06T13:07:00Z" w16du:dateUtc="2025-04-06T11:07:00Z">
+        <w:r>
+          <w:rPr>
+            <w:rFonts w:ascii="Times New Roman" w:hAnsi="Times New Roman"/>
+            <w:sz w:val="24"/>
+          </w:rPr>
+          <w:delText xml:space="preserve"> </w:delText>
+        </w:r>
+      </w:del>
+      <w:r>
+        <w:rPr>
+          <w:rFonts w:ascii="Times New Roman" w:hAnsi="Times New Roman"/>
+          <w:sz w:val="24"/>
+        </w:rPr>
+        <w:t>férhetünk</w:t>
+      </w:r>
+      <w:ins w:id="67" w:author="Ősz Olivér" w:date="2025-04-06T13:07:00Z" w16du:dateUtc="2025-04-06T11:07:00Z">
+        <w:r>
+          <w:rPr>
+            <w:rFonts w:ascii="Times New Roman" w:hAnsi="Times New Roman"/>
+            <w:sz w:val="24"/>
+          </w:rPr>
+          <w:t>,</w:t>
+        </w:r>
+      </w:ins>
+      <w:r>
+        <w:rPr>
+          <w:rFonts w:ascii="Times New Roman" w:hAnsi="Times New Roman"/>
+          <w:sz w:val="24"/>
+        </w:rPr>
+        <w:t xml:space="preserve"> viszont ezek az adatok csak addig tarolódnak</w:t>
+      </w:r>
+      <w:ins w:id="68" w:author="Ősz Olivér" w:date="2025-04-06T13:07:00Z" w16du:dateUtc="2025-04-06T11:07:00Z">
+        <w:r>
+          <w:rPr>
+            <w:rFonts w:ascii="Times New Roman" w:hAnsi="Times New Roman"/>
+            <w:sz w:val="24"/>
+          </w:rPr>
+          <w:t>,</w:t>
+        </w:r>
+      </w:ins>
+      <w:r>
+        <w:rPr>
+          <w:rFonts w:ascii="Times New Roman" w:hAnsi="Times New Roman"/>
+          <w:sz w:val="24"/>
+        </w:rPr>
+        <w:t xml:space="preserve"> míg a kliens és a szerver között él a kapcsolat. Tehát ha a kliens kilép</w:t>
+      </w:r>
+      <w:ins w:id="69" w:author="Ősz Olivér" w:date="2025-04-06T13:07:00Z" w16du:dateUtc="2025-04-06T11:07:00Z">
+        <w:r>
+          <w:rPr>
+            <w:rFonts w:ascii="Times New Roman" w:hAnsi="Times New Roman"/>
+            <w:sz w:val="24"/>
+          </w:rPr>
+          <w:t>,</w:t>
+        </w:r>
+      </w:ins>
+      <w:r>
+        <w:rPr>
+          <w:rFonts w:ascii="Times New Roman" w:hAnsi="Times New Roman"/>
+          <w:sz w:val="24"/>
+        </w:rPr>
+        <w:t xml:space="preserve"> elvesznek az adatok. Ezért érdemes ezeket eltárolni egy adatbázisban.</w:t>
       </w:r>
     </w:p>
     <w:p>
@@ -9142,7 +9800,30 @@
           <w:rFonts w:ascii="Times New Roman" w:hAnsi="Times New Roman"/>
           <w:sz w:val="24"/>
         </w:rPr>
-        <w:t xml:space="preserve"> használatával nincs szükség külön szálkezelésre a </w:t>
+        <w:t xml:space="preserve"> használatával </w:t>
+      </w:r>
+      <w:commentRangeStart w:id="70"/>
+      <w:r>
+        <w:rPr>
+          <w:rFonts w:ascii="Times New Roman" w:hAnsi="Times New Roman"/>
+          <w:sz w:val="24"/>
+        </w:rPr>
+        <w:t xml:space="preserve">nincs szükség külön szálkezelésre </w:t>
+      </w:r>
+      <w:commentRangeEnd w:id="70"/>
+      <w:r>
+        <w:rPr>
+          <w:rStyle w:val="CommentReference"/>
+          <w:rFonts w:ascii="Times New Roman" w:hAnsi="Times New Roman"/>
+        </w:rPr>
+        <w:commentReference w:id="70"/>
+      </w:r>
+      <w:r>
+        <w:rPr>
+          <w:rFonts w:ascii="Times New Roman" w:hAnsi="Times New Roman"/>
+          <w:sz w:val="24"/>
+        </w:rPr>
+        <w:t xml:space="preserve">a </w:t>
       </w:r>
       <w:proofErr w:type="spellStart"/>
       <w:r>
@@ -9200,6 +9881,15 @@
         </w:rPr>
         <w:t>Részletesen dokumentált</w:t>
       </w:r>
+      <w:ins w:id="71" w:author="Ősz Olivér" w:date="2025-04-06T13:07:00Z" w16du:dateUtc="2025-04-06T11:07:00Z">
+        <w:r>
+          <w:rPr>
+            <w:rFonts w:ascii="Times New Roman" w:hAnsi="Times New Roman"/>
+            <w:sz w:val="24"/>
+          </w:rPr>
+          <w:t>.</w:t>
+        </w:r>
+      </w:ins>
     </w:p>
     <w:p>
       <w:pPr>
@@ -9244,6 +9934,15 @@
         </w:rPr>
         <w:t>Alacsonyabb szintű, több manuális konfigurációt igényel</w:t>
       </w:r>
+      <w:ins w:id="72" w:author="Ősz Olivér" w:date="2025-04-06T13:07:00Z" w16du:dateUtc="2025-04-06T11:07:00Z">
+        <w:r>
+          <w:rPr>
+            <w:rFonts w:ascii="Times New Roman" w:hAnsi="Times New Roman" w:cs="Times New Roman"/>
+            <w:sz w:val="24"/>
+          </w:rPr>
+          <w:t>.</w:t>
+        </w:r>
+      </w:ins>
     </w:p>
     <w:p>
       <w:pPr>
@@ -10980,7 +11679,6 @@
         <w:t xml:space="preserve"> </w:t>
       </w:r>
       <w:proofErr w:type="spellStart"/>
-      <w:proofErr w:type="gramStart"/>
       <w:r>
         <w:rPr>
           <w:rFonts w:ascii="Times New Roman" w:hAnsi="Times New Roman"/>
@@ -10991,6 +11689,17 @@
         <w:t>id</w:t>
       </w:r>
       <w:proofErr w:type="spellEnd"/>
+      <w:del w:id="73" w:author="Ősz Olivér" w:date="2025-04-06T13:11:00Z" w16du:dateUtc="2025-04-06T11:11:00Z">
+        <w:r>
+          <w:rPr>
+            <w:rFonts w:ascii="Times New Roman" w:hAnsi="Times New Roman"/>
+            <w:i/>
+            <w:iCs/>
+            <w:sz w:val="24"/>
+          </w:rPr>
+          <w:delText xml:space="preserve"> </w:delText>
+        </w:r>
+      </w:del>
       <w:r>
         <w:rPr>
           <w:rFonts w:ascii="Times New Roman" w:hAnsi="Times New Roman"/>
@@ -10998,15 +11707,62 @@
           <w:iCs/>
           <w:sz w:val="24"/>
         </w:rPr>
-        <w:t xml:space="preserve"> )</w:t>
-      </w:r>
-      <w:proofErr w:type="gramEnd"/>
-      <w:r>
-        <w:rPr>
-          <w:rFonts w:ascii="Times New Roman" w:hAnsi="Times New Roman"/>
-          <w:sz w:val="24"/>
-        </w:rPr>
-        <w:t xml:space="preserve"> a kliensek egyedi azonosítója , s amely segítségével a szerver azonosítani tudja, hogy melyik kliens küldte az adott üzenetet. Ezután tovább küldi a klienseknek az </w:t>
+        <w:t>)</w:t>
+      </w:r>
+      <w:r>
+        <w:rPr>
+          <w:rFonts w:ascii="Times New Roman" w:hAnsi="Times New Roman"/>
+          <w:sz w:val="24"/>
+        </w:rPr>
+        <w:t xml:space="preserve"> a kliensek egyedi azonosítója</w:t>
+      </w:r>
+      <w:del w:id="74" w:author="Ősz Olivér" w:date="2025-04-06T13:11:00Z" w16du:dateUtc="2025-04-06T11:11:00Z">
+        <w:r>
+          <w:rPr>
+            <w:rFonts w:ascii="Times New Roman" w:hAnsi="Times New Roman"/>
+            <w:sz w:val="24"/>
+          </w:rPr>
+          <w:delText xml:space="preserve"> </w:delText>
+        </w:r>
+      </w:del>
+      <w:r>
+        <w:rPr>
+          <w:rFonts w:ascii="Times New Roman" w:hAnsi="Times New Roman"/>
+          <w:sz w:val="24"/>
+        </w:rPr>
+        <w:t xml:space="preserve">, </w:t>
+      </w:r>
+      <w:del w:id="75" w:author="Ősz Olivér" w:date="2025-04-06T13:11:00Z" w16du:dateUtc="2025-04-06T11:11:00Z">
+        <w:r>
+          <w:rPr>
+            <w:rFonts w:ascii="Times New Roman" w:hAnsi="Times New Roman"/>
+            <w:sz w:val="24"/>
+          </w:rPr>
+          <w:delText xml:space="preserve">s </w:delText>
+        </w:r>
+      </w:del>
+      <w:r>
+        <w:rPr>
+          <w:rFonts w:ascii="Times New Roman" w:hAnsi="Times New Roman"/>
+          <w:sz w:val="24"/>
+        </w:rPr>
+        <w:t>amely segítségével a szerver azonosítani tudja, hogy melyik kliens küldte az adott üzenetet. Ezután tovább küldi a klienseknek a</w:t>
+      </w:r>
+      <w:del w:id="76" w:author="Ősz Olivér" w:date="2025-04-06T13:11:00Z" w16du:dateUtc="2025-04-06T11:11:00Z">
+        <w:r>
+          <w:rPr>
+            <w:rFonts w:ascii="Times New Roman" w:hAnsi="Times New Roman"/>
+            <w:sz w:val="24"/>
+          </w:rPr>
+          <w:delText>z</w:delText>
+        </w:r>
+      </w:del>
+      <w:r>
+        <w:rPr>
+          <w:rFonts w:ascii="Times New Roman" w:hAnsi="Times New Roman"/>
+          <w:sz w:val="24"/>
+        </w:rPr>
+        <w:t xml:space="preserve"> </w:t>
       </w:r>
       <w:proofErr w:type="spellStart"/>
       <w:r>
@@ -12789,7 +13545,7 @@
           <w:szCs w:val="32"/>
         </w:rPr>
       </w:pPr>
-      <w:bookmarkStart w:id="6" w:name="_Toc194523608"/>
+      <w:bookmarkStart w:id="77" w:name="_Toc194523608"/>
       <w:r>
         <w:rPr>
           <w:rFonts w:ascii="Courier New" w:eastAsiaTheme="majorEastAsia" w:hAnsi="Courier New" w:cstheme="majorBidi"/>
@@ -12799,7 +13555,7 @@
         </w:rPr>
         <w:t>Konklúzió:</w:t>
       </w:r>
-      <w:bookmarkEnd w:id="6"/>
+      <w:bookmarkEnd w:id="77"/>
     </w:p>
     <w:p>
       <w:pPr>
@@ -12878,23 +13634,71 @@
           <w:rFonts w:ascii="Times New Roman" w:hAnsi="Times New Roman"/>
           <w:sz w:val="24"/>
         </w:rPr>
-        <w:t xml:space="preserve">(mint kliens) megfelelő eszközök. Számomra a kód átláthatósága, rövidsége volt szem elött és az esemény alapú </w:t>
-      </w:r>
-      <w:proofErr w:type="spellStart"/>
-      <w:r>
-        <w:rPr>
-          <w:rFonts w:ascii="Times New Roman" w:hAnsi="Times New Roman"/>
-          <w:sz w:val="24"/>
-        </w:rPr>
-        <w:t>kétirányú</w:t>
-      </w:r>
-      <w:proofErr w:type="spellEnd"/>
-      <w:r>
-        <w:rPr>
-          <w:rFonts w:ascii="Times New Roman" w:hAnsi="Times New Roman"/>
-          <w:sz w:val="24"/>
-        </w:rPr>
-        <w:t xml:space="preserve"> kommunikáció megvalósítása, ami játék fejlesztés szempontjából kulcsfontosságú.</w:t>
+        <w:t>(mint kliens) megfelelő eszközök. Számomra a kód átláthatósága, rövidsége volt szem el</w:t>
+      </w:r>
+      <w:del w:id="78" w:author="Ősz Olivér" w:date="2025-04-06T13:12:00Z" w16du:dateUtc="2025-04-06T11:12:00Z">
+        <w:r>
+          <w:rPr>
+            <w:rFonts w:ascii="Times New Roman" w:hAnsi="Times New Roman"/>
+            <w:sz w:val="24"/>
+          </w:rPr>
+          <w:delText>ö</w:delText>
+        </w:r>
+      </w:del>
+      <w:ins w:id="79" w:author="Ősz Olivér" w:date="2025-04-06T13:12:00Z" w16du:dateUtc="2025-04-06T11:12:00Z">
+        <w:r>
+          <w:rPr>
+            <w:rFonts w:ascii="Times New Roman" w:hAnsi="Times New Roman"/>
+            <w:sz w:val="24"/>
+          </w:rPr>
+          <w:t>ő</w:t>
+        </w:r>
+      </w:ins>
+      <w:r>
+        <w:rPr>
+          <w:rFonts w:ascii="Times New Roman" w:hAnsi="Times New Roman"/>
+          <w:sz w:val="24"/>
+        </w:rPr>
+        <w:t>tt</w:t>
+      </w:r>
+      <w:ins w:id="80" w:author="Ősz Olivér" w:date="2025-04-06T13:12:00Z" w16du:dateUtc="2025-04-06T11:12:00Z">
+        <w:r>
+          <w:rPr>
+            <w:rFonts w:ascii="Times New Roman" w:hAnsi="Times New Roman"/>
+            <w:sz w:val="24"/>
+          </w:rPr>
+          <w:t>,</w:t>
+        </w:r>
+      </w:ins>
+      <w:r>
+        <w:rPr>
+          <w:rFonts w:ascii="Times New Roman" w:hAnsi="Times New Roman"/>
+          <w:sz w:val="24"/>
+        </w:rPr>
+        <w:t xml:space="preserve"> és az esemény alapú kétirányú kommunikáció megvalósítása, ami játék fejlesztés szempontjából </w:t>
+      </w:r>
+      <w:commentRangeStart w:id="81"/>
+      <w:r>
+        <w:rPr>
+          <w:rFonts w:ascii="Times New Roman" w:hAnsi="Times New Roman"/>
+          <w:sz w:val="24"/>
+        </w:rPr>
+        <w:t>kulcsfontosságú</w:t>
+      </w:r>
+      <w:commentRangeEnd w:id="81"/>
+      <w:r>
+        <w:rPr>
+          <w:rStyle w:val="CommentReference"/>
+          <w:rFonts w:ascii="Times New Roman" w:hAnsi="Times New Roman"/>
+        </w:rPr>
+        <w:commentReference w:id="81"/>
+      </w:r>
+      <w:r>
+        <w:rPr>
+          <w:rFonts w:ascii="Times New Roman" w:hAnsi="Times New Roman"/>
+          <w:sz w:val="24"/>
+        </w:rPr>
+        <w:t>.</w:t>
       </w:r>
     </w:p>
     <w:p/>
@@ -12906,6 +13710,326 @@
     </w:sectPr>
   </w:body>
 </w:document>
+</file>
+
+<file path=word/comments.xml><?xml version="1.0" encoding="utf-8"?>
+<w:comments xmlns:wpc="http://schemas.microsoft.com/office/word/2010/wordprocessingCanvas" xmlns:cx="http://schemas.microsoft.com/office/drawing/2014/chartex" xmlns:cx1="http://schemas.microsoft.com/office/drawing/2015/9/8/chartex" xmlns:cx2="http://schemas.microsoft.com/office/drawing/2015/10/21/chartex" xmlns:cx3="http://schemas.microsoft.com/office/drawing/2016/5/9/chartex" xmlns:cx4="http://schemas.microsoft.com/office/drawing/2016/5/10/chartex" xmlns:cx5="http://schemas.microsoft.com/office/drawing/2016/5/11/chartex" xmlns:cx6="http://schemas.microsoft.com/office/drawing/2016/5/12/chartex" xmlns:cx7="http://schemas.microsoft.com/office/drawing/2016/5/13/chartex" xmlns:cx8="http://schemas.microsoft.com/office/drawing/2016/5/14/chartex" xmlns:mc="http://schemas.openxmlformats.org/markup-compatibility/2006" xmlns:aink="http://schemas.microsoft.com/office/drawing/2016/ink" xmlns:am3d="http://schemas.microsoft.com/office/drawing/2017/model3d" xmlns:o="urn:schemas-microsoft-com:office:office" xmlns:oel="http://schemas.microsoft.com/office/2019/extlst" xmlns:r="http://schemas.openxmlformats.org/officeDocument/2006/relationships" xmlns:m="http://schemas.openxmlformats.org/officeDocument/2006/math" xmlns:v="urn:schemas-microsoft-com:vml" xmlns:wp14="http://schemas.microsoft.com/office/word/2010/wordprocessingDrawing" xmlns:wp="http://schemas.openxmlformats.org/drawingml/2006/wordprocessingDrawing" xmlns:w10="urn:schemas-microsoft-com:office:word" xmlns:w="http://schemas.openxmlformats.org/wordprocessingml/2006/main" xmlns:w14="http://schemas.microsoft.com/office/word/2010/wordml" xmlns:w15="http://schemas.microsoft.com/office/word/2012/wordml" xmlns:w16cex="http://schemas.microsoft.com/office/word/2018/wordml/cex" xmlns:w16cid="http://schemas.microsoft.com/office/word/2016/wordml/cid" xmlns:w16="http://schemas.microsoft.com/office/word/2018/wordml" xmlns:w16du="http://schemas.microsoft.com/office/word/2023/wordml/word16du" xmlns:w16sdtdh="http://schemas.microsoft.com/office/word/2020/wordml/sdtdatahash" xmlns:w16sdtfl="http://schemas.microsoft.com/office/word/2024/wordml/sdtformatlock" xmlns:w16se="http://schemas.microsoft.com/office/word/2015/wordml/symex" xmlns:wpg="http://schemas.microsoft.com/office/word/2010/wordprocessingGroup" xmlns:wpi="http://schemas.microsoft.com/office/word/2010/wordprocessingInk" xmlns:wne="http://schemas.microsoft.com/office/word/2006/wordml" xmlns:wps="http://schemas.microsoft.com/office/word/2010/wordprocessingShape" mc:Ignorable="w14 w15 w16se w16cid w16 w16cex w16sdtdh w16sdtfl w16du wp14">
+  <w:comment w:id="3" w:author="Ősz Olivér" w:date="2025-04-06T12:47:00Z" w:initials="OŐ">
+    <w:p>
+      <w:pPr>
+        <w:pStyle w:val="CommentText"/>
+        <w:jc w:val="left"/>
+      </w:pPr>
+      <w:r>
+        <w:rPr>
+          <w:rStyle w:val="CommentReference"/>
+        </w:rPr>
+        <w:annotationRef/>
+      </w:r>
+      <w:r>
+        <w:t xml:space="preserve">A szerver-kliens architektúra mellett egy alternatíva a peer-to-peer network. Ezt is azért illik megemlíteni, aztán hogy ennél a játéknál ideálisabb a szerver-kliens architektúra. Kis olvasnivaló: </w:t>
+      </w:r>
+      <w:hyperlink r:id="rId1" w:history="1">
+        <w:r>
+          <w:rPr>
+            <w:rStyle w:val="Hyperlink"/>
+          </w:rPr>
+          <w:t>https://pvigier.github.io/2019/09/08/beginner-guide-game-networking.html</w:t>
+        </w:r>
+      </w:hyperlink>
+      <w:r>
+        <w:t xml:space="preserve"> Erre is hivatkozhatsz, hogy alátámaszd az állításaid.</w:t>
+      </w:r>
+    </w:p>
+  </w:comment>
+  <w:comment w:id="7" w:author="Ősz Olivér" w:date="2025-04-06T12:21:00Z" w:initials="OŐ">
+    <w:p>
+      <w:pPr>
+        <w:pStyle w:val="CommentText"/>
+        <w:jc w:val="left"/>
+      </w:pPr>
+      <w:r>
+        <w:rPr>
+          <w:rStyle w:val="CommentReference"/>
+        </w:rPr>
+        <w:annotationRef/>
+      </w:r>
+      <w:r>
+        <w:t>Az első említéseknél lábjegyzetben hivatkozz az oldalukra.</w:t>
+      </w:r>
+    </w:p>
+  </w:comment>
+  <w:comment w:id="14" w:author="Ősz Olivér" w:date="2025-04-06T12:29:00Z" w:initials="OŐ">
+    <w:p>
+      <w:pPr>
+        <w:pStyle w:val="CommentText"/>
+        <w:jc w:val="left"/>
+      </w:pPr>
+      <w:r>
+        <w:rPr>
+          <w:rStyle w:val="CommentReference"/>
+        </w:rPr>
+        <w:annotationRef/>
+      </w:r>
+      <w:r>
+        <w:t>Ha erről van szó (</w:t>
+      </w:r>
+      <w:hyperlink r:id="rId2" w:history="1">
+        <w:r>
+          <w:rPr>
+            <w:rStyle w:val="Hyperlink"/>
+          </w:rPr>
+          <w:t>https://github.com/unkn-one/pygnetic</w:t>
+        </w:r>
+      </w:hyperlink>
+      <w:r>
+        <w:t>), akkor ez valakinek egy nyári projektje, nincs mögötte community, vagy aktív fejlesztőcsapat, úgyhogy nem is érdemes megemlíteni.</w:t>
+      </w:r>
+    </w:p>
+  </w:comment>
+  <w:comment w:id="15" w:author="Ősz Olivér" w:date="2025-04-06T12:43:00Z" w:initials="OŐ">
+    <w:p>
+      <w:pPr>
+        <w:pStyle w:val="CommentText"/>
+        <w:jc w:val="left"/>
+      </w:pPr>
+      <w:r>
+        <w:rPr>
+          <w:rStyle w:val="CommentReference"/>
+        </w:rPr>
+        <w:annotationRef/>
+      </w:r>
+      <w:r>
+        <w:t>Ehelyett elég azt leírni, hogy a Pygame nem rendelkezik online multiplayer funkciókkal, sem erre széles körben elterjedt 3rd-party megoldással.</w:t>
+      </w:r>
+    </w:p>
+  </w:comment>
+  <w:comment w:id="16" w:author="Ősz Olivér" w:date="2025-04-06T12:45:00Z" w:initials="OŐ">
+    <w:p>
+      <w:pPr>
+        <w:pStyle w:val="CommentText"/>
+        <w:jc w:val="left"/>
+      </w:pPr>
+      <w:r>
+        <w:rPr>
+          <w:rStyle w:val="CommentReference"/>
+        </w:rPr>
+        <w:annotationRef/>
+      </w:r>
+      <w:r>
+        <w:t xml:space="preserve">Ha még további networking python csomagokat mutatnál be, ezeket nézd meg: </w:t>
+      </w:r>
+      <w:hyperlink r:id="rId3" w:history="1">
+        <w:r>
+          <w:rPr>
+            <w:rStyle w:val="Hyperlink"/>
+          </w:rPr>
+          <w:t>https://twisted.org/</w:t>
+        </w:r>
+      </w:hyperlink>
+      <w:r>
+        <w:t xml:space="preserve"> </w:t>
+      </w:r>
+      <w:hyperlink r:id="rId4" w:history="1">
+        <w:r>
+          <w:rPr>
+            <w:rStyle w:val="Hyperlink"/>
+          </w:rPr>
+          <w:t>https://pypi.org/project/Pyro5/</w:t>
+        </w:r>
+      </w:hyperlink>
+    </w:p>
+  </w:comment>
+  <w:comment w:id="33" w:author="Ősz Olivér" w:date="2025-04-06T12:58:00Z" w:initials="OŐ">
+    <w:p>
+      <w:pPr>
+        <w:pStyle w:val="CommentText"/>
+        <w:jc w:val="left"/>
+      </w:pPr>
+      <w:r>
+        <w:rPr>
+          <w:rStyle w:val="CommentReference"/>
+        </w:rPr>
+        <w:annotationRef/>
+      </w:r>
+      <w:r>
+        <w:t>select.select helyett inkább from select import select, és az import utasítást is írd bele a kód elejére.</w:t>
+      </w:r>
+    </w:p>
+  </w:comment>
+  <w:comment w:id="64" w:author="Ősz Olivér" w:date="2025-04-06T13:07:00Z" w:initials="OŐ">
+    <w:p>
+      <w:pPr>
+        <w:pStyle w:val="CommentText"/>
+        <w:jc w:val="left"/>
+      </w:pPr>
+      <w:r>
+        <w:rPr>
+          <w:rStyle w:val="CommentReference"/>
+        </w:rPr>
+        <w:annotationRef/>
+      </w:r>
+      <w:r>
+        <w:t>Az indentálást javítsd!</w:t>
+      </w:r>
+    </w:p>
+  </w:comment>
+  <w:comment w:id="70" w:author="Ősz Olivér" w:date="2025-04-06T13:10:00Z" w:initials="OŐ">
+    <w:p>
+      <w:pPr>
+        <w:pStyle w:val="CommentText"/>
+        <w:jc w:val="left"/>
+      </w:pPr>
+      <w:r>
+        <w:rPr>
+          <w:rStyle w:val="CommentReference"/>
+        </w:rPr>
+        <w:annotationRef/>
+      </w:r>
+      <w:r>
+        <w:t>Ez kicsit félreérthető. Van külön szál, csak azt ő kezeli.</w:t>
+      </w:r>
+    </w:p>
+  </w:comment>
+  <w:comment w:id="81" w:author="Ősz Olivér" w:date="2025-04-06T13:18:00Z" w:initials="OŐ">
+    <w:p>
+      <w:pPr>
+        <w:pStyle w:val="CommentText"/>
+        <w:jc w:val="left"/>
+      </w:pPr>
+      <w:r>
+        <w:rPr>
+          <w:rStyle w:val="CommentReference"/>
+        </w:rPr>
+        <w:annotationRef/>
+      </w:r>
+      <w:r>
+        <w:t xml:space="preserve">Az elején még a gyorsaságot és stabilitást is említetted szempontként. Ehhez itt megemlítheted, hogy a Flask development server helyett támogatja hatékonyabb szervermotorok használatát is, mint az nginx, gunicorn, vagy uWSGI. Forrás: </w:t>
+      </w:r>
+      <w:hyperlink r:id="rId5" w:history="1">
+        <w:r>
+          <w:rPr>
+            <w:rStyle w:val="Hyperlink"/>
+          </w:rPr>
+          <w:t>https://flask-socketio.readthedocs.io/en/latest/deployment.html</w:t>
+        </w:r>
+      </w:hyperlink>
+    </w:p>
+  </w:comment>
+</w:comments>
+</file>
+
+<file path=word/commentsExtended.xml><?xml version="1.0" encoding="utf-8"?>
+<w15:commentsEx xmlns:wpc="http://schemas.microsoft.com/office/word/2010/wordprocessingCanvas" xmlns:cx="http://schemas.microsoft.com/office/drawing/2014/chartex" xmlns:cx1="http://schemas.microsoft.com/office/drawing/2015/9/8/chartex" xmlns:cx2="http://schemas.microsoft.com/office/drawing/2015/10/21/chartex" xmlns:cx3="http://schemas.microsoft.com/office/drawing/2016/5/9/chartex" xmlns:cx4="http://schemas.microsoft.com/office/drawing/2016/5/10/chartex" xmlns:cx5="http://schemas.microsoft.com/office/drawing/2016/5/11/chartex" xmlns:cx6="http://schemas.microsoft.com/office/drawing/2016/5/12/chartex" xmlns:cx7="http://schemas.microsoft.com/office/drawing/2016/5/13/chartex" xmlns:cx8="http://schemas.microsoft.com/office/drawing/2016/5/14/chartex" xmlns:mc="http://schemas.openxmlformats.org/markup-compatibility/2006" xmlns:aink="http://schemas.microsoft.com/office/drawing/2016/ink" xmlns:am3d="http://schemas.microsoft.com/office/drawing/2017/model3d" xmlns:o="urn:schemas-microsoft-com:office:office" xmlns:oel="http://schemas.microsoft.com/office/2019/extlst" xmlns:r="http://schemas.openxmlformats.org/officeDocument/2006/relationships" xmlns:m="http://schemas.openxmlformats.org/officeDocument/2006/math" xmlns:v="urn:schemas-microsoft-com:vml" xmlns:wp14="http://schemas.microsoft.com/office/word/2010/wordprocessingDrawing" xmlns:wp="http://schemas.openxmlformats.org/drawingml/2006/wordprocessingDrawing" xmlns:w10="urn:schemas-microsoft-com:office:word" xmlns:w="http://schemas.openxmlformats.org/wordprocessingml/2006/main" xmlns:w14="http://schemas.microsoft.com/office/word/2010/wordml" xmlns:w15="http://schemas.microsoft.com/office/word/2012/wordml" xmlns:w16cex="http://schemas.microsoft.com/office/word/2018/wordml/cex" xmlns:w16cid="http://schemas.microsoft.com/office/word/2016/wordml/cid" xmlns:w16="http://schemas.microsoft.com/office/word/2018/wordml" xmlns:w16du="http://schemas.microsoft.com/office/word/2023/wordml/word16du" xmlns:w16sdtdh="http://schemas.microsoft.com/office/word/2020/wordml/sdtdatahash" xmlns:w16sdtfl="http://schemas.microsoft.com/office/word/2024/wordml/sdtformatlock" xmlns:w16se="http://schemas.microsoft.com/office/word/2015/wordml/symex" xmlns:wpg="http://schemas.microsoft.com/office/word/2010/wordprocessingGroup" xmlns:wpi="http://schemas.microsoft.com/office/word/2010/wordprocessingInk" xmlns:wne="http://schemas.microsoft.com/office/word/2006/wordml" xmlns:wps="http://schemas.microsoft.com/office/word/2010/wordprocessingShape" mc:Ignorable="w14 w15 w16se w16cid w16 w16cex w16sdtdh w16sdtfl w16du wp14">
+  <w15:commentEx w15:paraId="42425D91" w15:done="0"/>
+  <w15:commentEx w15:paraId="6F895847" w15:done="0"/>
+  <w15:commentEx w15:paraId="401DBB16" w15:done="0"/>
+  <w15:commentEx w15:paraId="17C0E3A7" w15:paraIdParent="401DBB16" w15:done="0"/>
+  <w15:commentEx w15:paraId="40D87296" w15:paraIdParent="401DBB16" w15:done="0"/>
+  <w15:commentEx w15:paraId="500B74CD" w15:done="0"/>
+  <w15:commentEx w15:paraId="04A5C287" w15:done="0"/>
+  <w15:commentEx w15:paraId="78DFB21F" w15:done="0"/>
+  <w15:commentEx w15:paraId="74967E99" w15:done="0"/>
+</w15:commentsEx>
+</file>
+
+<file path=word/commentsExtensible.xml><?xml version="1.0" encoding="utf-8"?>
+<w16cex:commentsExtensible xmlns:wpc="http://schemas.microsoft.com/office/word/2010/wordprocessingCanvas" xmlns:cx="http://schemas.microsoft.com/office/drawing/2014/chartex" xmlns:cx1="http://schemas.microsoft.com/office/drawing/2015/9/8/chartex" xmlns:cx2="http://schemas.microsoft.com/office/drawing/2015/10/21/chartex" xmlns:cx3="http://schemas.microsoft.com/office/drawing/2016/5/9/chartex" xmlns:cx4="http://schemas.microsoft.com/office/drawing/2016/5/10/chartex" xmlns:cx5="http://schemas.microsoft.com/office/drawing/2016/5/11/chartex" xmlns:cx6="http://schemas.microsoft.com/office/drawing/2016/5/12/chartex" xmlns:cx7="http://schemas.microsoft.com/office/drawing/2016/5/13/chartex" xmlns:cx8="http://schemas.microsoft.com/office/drawing/2016/5/14/chartex" xmlns:cr="http://schemas.microsoft.com/office/comments/2020/reactions" xmlns:mc="http://schemas.openxmlformats.org/markup-compatibility/2006" xmlns:aink="http://schemas.microsoft.com/office/drawing/2016/ink" xmlns:am3d="http://schemas.microsoft.com/office/drawing/2017/model3d" xmlns:o="urn:schemas-microsoft-com:office:office" xmlns:oel="http://schemas.microsoft.com/office/2019/extlst" xmlns:r="http://schemas.openxmlformats.org/officeDocument/2006/relationships" xmlns:m="http://schemas.openxmlformats.org/officeDocument/2006/math" xmlns:v="urn:schemas-microsoft-com:vml" xmlns:wp14="http://schemas.microsoft.com/office/word/2010/wordprocessingDrawing" xmlns:wp="http://schemas.openxmlformats.org/drawingml/2006/wordprocessingDrawing" xmlns:w10="urn:schemas-microsoft-com:office:word" xmlns:w="http://schemas.openxmlformats.org/wordprocessingml/2006/main" xmlns:w14="http://schemas.microsoft.com/office/word/2010/wordml" xmlns:w15="http://schemas.microsoft.com/office/word/2012/wordml" xmlns:w16cex="http://schemas.microsoft.com/office/word/2018/wordml/cex" xmlns:w16cid="http://schemas.microsoft.com/office/word/2016/wordml/cid" xmlns:w16="http://schemas.microsoft.com/office/word/2018/wordml" xmlns:w16du="http://schemas.microsoft.com/office/word/2023/wordml/word16du" xmlns:w16sdtdh="http://schemas.microsoft.com/office/word/2020/wordml/sdtdatahash" xmlns:w16sdtfl="http://schemas.microsoft.com/office/word/2024/wordml/sdtformatlock" xmlns:w16se="http://schemas.microsoft.com/office/word/2015/wordml/symex" xmlns:wpg="http://schemas.microsoft.com/office/word/2010/wordprocessingGroup" xmlns:wpi="http://schemas.microsoft.com/office/word/2010/wordprocessingInk" xmlns:wne="http://schemas.microsoft.com/office/word/2006/wordml" xmlns:wps="http://schemas.microsoft.com/office/word/2010/wordprocessingShape" mc:Ignorable="w14 w15 w16se w16cid w16 w16cex w16sdtdh w16sdtfl cr w16du wp14">
+  <w16cex:commentExtensible w16cex:durableId="11639DCF" w16cex:dateUtc="2025-04-06T10:47:00Z"/>
+  <w16cex:commentExtensible w16cex:durableId="4FF2C420" w16cex:dateUtc="2025-04-06T10:21:00Z"/>
+  <w16cex:commentExtensible w16cex:durableId="5843815F" w16cex:dateUtc="2025-04-06T10:29:00Z"/>
+  <w16cex:commentExtensible w16cex:durableId="7BAAF57C" w16cex:dateUtc="2025-04-06T10:43:00Z"/>
+  <w16cex:commentExtensible w16cex:durableId="7728355D" w16cex:dateUtc="2025-04-06T10:45:00Z"/>
+  <w16cex:commentExtensible w16cex:durableId="53565767" w16cex:dateUtc="2025-04-06T10:58:00Z"/>
+  <w16cex:commentExtensible w16cex:durableId="2DC25D34" w16cex:dateUtc="2025-04-06T11:07:00Z"/>
+  <w16cex:commentExtensible w16cex:durableId="501DF609" w16cex:dateUtc="2025-04-06T11:10:00Z"/>
+  <w16cex:commentExtensible w16cex:durableId="4A18D04A" w16cex:dateUtc="2025-04-06T11:18:00Z"/>
+</w16cex:commentsExtensible>
+</file>
+
+<file path=word/commentsIds.xml><?xml version="1.0" encoding="utf-8"?>
+<w16cid:commentsIds xmlns:wpc="http://schemas.microsoft.com/office/word/2010/wordprocessingCanvas" xmlns:cx="http://schemas.microsoft.com/office/drawing/2014/chartex" xmlns:cx1="http://schemas.microsoft.com/office/drawing/2015/9/8/chartex" xmlns:cx2="http://schemas.microsoft.com/office/drawing/2015/10/21/chartex" xmlns:cx3="http://schemas.microsoft.com/office/drawing/2016/5/9/chartex" xmlns:cx4="http://schemas.microsoft.com/office/drawing/2016/5/10/chartex" xmlns:cx5="http://schemas.microsoft.com/office/drawing/2016/5/11/chartex" xmlns:cx6="http://schemas.microsoft.com/office/drawing/2016/5/12/chartex" xmlns:cx7="http://schemas.microsoft.com/office/drawing/2016/5/13/chartex" xmlns:cx8="http://schemas.microsoft.com/office/drawing/2016/5/14/chartex" xmlns:mc="http://schemas.openxmlformats.org/markup-compatibility/2006" xmlns:aink="http://schemas.microsoft.com/office/drawing/2016/ink" xmlns:am3d="http://schemas.microsoft.com/office/drawing/2017/model3d" xmlns:o="urn:schemas-microsoft-com:office:office" xmlns:oel="http://schemas.microsoft.com/office/2019/extlst" xmlns:r="http://schemas.openxmlformats.org/officeDocument/2006/relationships" xmlns:m="http://schemas.openxmlformats.org/officeDocument/2006/math" xmlns:v="urn:schemas-microsoft-com:vml" xmlns:wp14="http://schemas.microsoft.com/office/word/2010/wordprocessingDrawing" xmlns:wp="http://schemas.openxmlformats.org/drawingml/2006/wordprocessingDrawing" xmlns:w10="urn:schemas-microsoft-com:office:word" xmlns:w="http://schemas.openxmlformats.org/wordprocessingml/2006/main" xmlns:w14="http://schemas.microsoft.com/office/word/2010/wordml" xmlns:w15="http://schemas.microsoft.com/office/word/2012/wordml" xmlns:w16cex="http://schemas.microsoft.com/office/word/2018/wordml/cex" xmlns:w16cid="http://schemas.microsoft.com/office/word/2016/wordml/cid" xmlns:w16="http://schemas.microsoft.com/office/word/2018/wordml" xmlns:w16du="http://schemas.microsoft.com/office/word/2023/wordml/word16du" xmlns:w16sdtdh="http://schemas.microsoft.com/office/word/2020/wordml/sdtdatahash" xmlns:w16sdtfl="http://schemas.microsoft.com/office/word/2024/wordml/sdtformatlock" xmlns:w16se="http://schemas.microsoft.com/office/word/2015/wordml/symex" xmlns:wpg="http://schemas.microsoft.com/office/word/2010/wordprocessingGroup" xmlns:wpi="http://schemas.microsoft.com/office/word/2010/wordprocessingInk" xmlns:wne="http://schemas.microsoft.com/office/word/2006/wordml" xmlns:wps="http://schemas.microsoft.com/office/word/2010/wordprocessingShape" mc:Ignorable="w14 w15 w16se w16cid w16 w16cex w16sdtdh w16sdtfl w16du wp14">
+  <w16cid:commentId w16cid:paraId="42425D91" w16cid:durableId="11639DCF"/>
+  <w16cid:commentId w16cid:paraId="6F895847" w16cid:durableId="4FF2C420"/>
+  <w16cid:commentId w16cid:paraId="401DBB16" w16cid:durableId="5843815F"/>
+  <w16cid:commentId w16cid:paraId="17C0E3A7" w16cid:durableId="7BAAF57C"/>
+  <w16cid:commentId w16cid:paraId="40D87296" w16cid:durableId="7728355D"/>
+  <w16cid:commentId w16cid:paraId="500B74CD" w16cid:durableId="53565767"/>
+  <w16cid:commentId w16cid:paraId="04A5C287" w16cid:durableId="2DC25D34"/>
+  <w16cid:commentId w16cid:paraId="78DFB21F" w16cid:durableId="501DF609"/>
+  <w16cid:commentId w16cid:paraId="74967E99" w16cid:durableId="4A18D04A"/>
+</w16cid:commentsIds>
+</file>
+
+<file path=word/endnotes.xml><?xml version="1.0" encoding="utf-8"?>
+<w:endnotes xmlns:wpc="http://schemas.microsoft.com/office/word/2010/wordprocessingCanvas" xmlns:cx="http://schemas.microsoft.com/office/drawing/2014/chartex" xmlns:cx1="http://schemas.microsoft.com/office/drawing/2015/9/8/chartex" xmlns:cx2="http://schemas.microsoft.com/office/drawing/2015/10/21/chartex" xmlns:cx3="http://schemas.microsoft.com/office/drawing/2016/5/9/chartex" xmlns:cx4="http://schemas.microsoft.com/office/drawing/2016/5/10/chartex" xmlns:cx5="http://schemas.microsoft.com/office/drawing/2016/5/11/chartex" xmlns:cx6="http://schemas.microsoft.com/office/drawing/2016/5/12/chartex" xmlns:cx7="http://schemas.microsoft.com/office/drawing/2016/5/13/chartex" xmlns:cx8="http://schemas.microsoft.com/office/drawing/2016/5/14/chartex" xmlns:mc="http://schemas.openxmlformats.org/markup-compatibility/2006" xmlns:aink="http://schemas.microsoft.com/office/drawing/2016/ink" xmlns:am3d="http://schemas.microsoft.com/office/drawing/2017/model3d" xmlns:o="urn:schemas-microsoft-com:office:office" xmlns:oel="http://schemas.microsoft.com/office/2019/extlst" xmlns:r="http://schemas.openxmlformats.org/officeDocument/2006/relationships" xmlns:m="http://schemas.openxmlformats.org/officeDocument/2006/math" xmlns:v="urn:schemas-microsoft-com:vml" xmlns:wp14="http://schemas.microsoft.com/office/word/2010/wordprocessingDrawing" xmlns:wp="http://schemas.openxmlformats.org/drawingml/2006/wordprocessingDrawing" xmlns:w10="urn:schemas-microsoft-com:office:word" xmlns:w="http://schemas.openxmlformats.org/wordprocessingml/2006/main" xmlns:w14="http://schemas.microsoft.com/office/word/2010/wordml" xmlns:w15="http://schemas.microsoft.com/office/word/2012/wordml" xmlns:w16cex="http://schemas.microsoft.com/office/word/2018/wordml/cex" xmlns:w16cid="http://schemas.microsoft.com/office/word/2016/wordml/cid" xmlns:w16="http://schemas.microsoft.com/office/word/2018/wordml" xmlns:w16du="http://schemas.microsoft.com/office/word/2023/wordml/word16du" xmlns:w16sdtdh="http://schemas.microsoft.com/office/word/2020/wordml/sdtdatahash" xmlns:w16sdtfl="http://schemas.microsoft.com/office/word/2024/wordml/sdtformatlock" xmlns:w16se="http://schemas.microsoft.com/office/word/2015/wordml/symex" xmlns:wpg="http://schemas.microsoft.com/office/word/2010/wordprocessingGroup" xmlns:wpi="http://schemas.microsoft.com/office/word/2010/wordprocessingInk" xmlns:wne="http://schemas.microsoft.com/office/word/2006/wordml" xmlns:wps="http://schemas.microsoft.com/office/word/2010/wordprocessingShape" mc:Ignorable="w14 w15 w16se w16cid w16 w16cex w16sdtdh w16sdtfl w16du wp14">
+  <w:endnote w:type="separator" w:id="-1">
+    <w:p>
+      <w:pPr>
+        <w:spacing w:after="0" w:line="240" w:lineRule="auto"/>
+      </w:pPr>
+      <w:r>
+        <w:separator/>
+      </w:r>
+    </w:p>
+  </w:endnote>
+  <w:endnote w:type="continuationSeparator" w:id="0">
+    <w:p>
+      <w:pPr>
+        <w:spacing w:after="0" w:line="240" w:lineRule="auto"/>
+      </w:pPr>
+      <w:r>
+        <w:continuationSeparator/>
+      </w:r>
+    </w:p>
+  </w:endnote>
+</w:endnotes>
+</file>
+
+<file path=word/footnotes.xml><?xml version="1.0" encoding="utf-8"?>
+<w:footnotes xmlns:wpc="http://schemas.microsoft.com/office/word/2010/wordprocessingCanvas" xmlns:cx="http://schemas.microsoft.com/office/drawing/2014/chartex" xmlns:cx1="http://schemas.microsoft.com/office/drawing/2015/9/8/chartex" xmlns:cx2="http://schemas.microsoft.com/office/drawing/2015/10/21/chartex" xmlns:cx3="http://schemas.microsoft.com/office/drawing/2016/5/9/chartex" xmlns:cx4="http://schemas.microsoft.com/office/drawing/2016/5/10/chartex" xmlns:cx5="http://schemas.microsoft.com/office/drawing/2016/5/11/chartex" xmlns:cx6="http://schemas.microsoft.com/office/drawing/2016/5/12/chartex" xmlns:cx7="http://schemas.microsoft.com/office/drawing/2016/5/13/chartex" xmlns:cx8="http://schemas.microsoft.com/office/drawing/2016/5/14/chartex" xmlns:mc="http://schemas.openxmlformats.org/markup-compatibility/2006" xmlns:aink="http://schemas.microsoft.com/office/drawing/2016/ink" xmlns:am3d="http://schemas.microsoft.com/office/drawing/2017/model3d" xmlns:o="urn:schemas-microsoft-com:office:office" xmlns:oel="http://schemas.microsoft.com/office/2019/extlst" xmlns:r="http://schemas.openxmlformats.org/officeDocument/2006/relationships" xmlns:m="http://schemas.openxmlformats.org/officeDocument/2006/math" xmlns:v="urn:schemas-microsoft-com:vml" xmlns:wp14="http://schemas.microsoft.com/office/word/2010/wordprocessingDrawing" xmlns:wp="http://schemas.openxmlformats.org/drawingml/2006/wordprocessingDrawing" xmlns:w10="urn:schemas-microsoft-com:office:word" xmlns:w="http://schemas.openxmlformats.org/wordprocessingml/2006/main" xmlns:w14="http://schemas.microsoft.com/office/word/2010/wordml" xmlns:w15="http://schemas.microsoft.com/office/word/2012/wordml" xmlns:w16cex="http://schemas.microsoft.com/office/word/2018/wordml/cex" xmlns:w16cid="http://schemas.microsoft.com/office/word/2016/wordml/cid" xmlns:w16="http://schemas.microsoft.com/office/word/2018/wordml" xmlns:w16du="http://schemas.microsoft.com/office/word/2023/wordml/word16du" xmlns:w16sdtdh="http://schemas.microsoft.com/office/word/2020/wordml/sdtdatahash" xmlns:w16sdtfl="http://schemas.microsoft.com/office/word/2024/wordml/sdtformatlock" xmlns:w16se="http://schemas.microsoft.com/office/word/2015/wordml/symex" xmlns:wpg="http://schemas.microsoft.com/office/word/2010/wordprocessingGroup" xmlns:wpi="http://schemas.microsoft.com/office/word/2010/wordprocessingInk" xmlns:wne="http://schemas.microsoft.com/office/word/2006/wordml" xmlns:wps="http://schemas.microsoft.com/office/word/2010/wordprocessingShape" mc:Ignorable="w14 w15 w16se w16cid w16 w16cex w16sdtdh w16sdtfl w16du wp14">
+  <w:footnote w:type="separator" w:id="-1">
+    <w:p>
+      <w:pPr>
+        <w:spacing w:after="0" w:line="240" w:lineRule="auto"/>
+      </w:pPr>
+      <w:r>
+        <w:separator/>
+      </w:r>
+    </w:p>
+  </w:footnote>
+  <w:footnote w:type="continuationSeparator" w:id="0">
+    <w:p>
+      <w:pPr>
+        <w:spacing w:after="0" w:line="240" w:lineRule="auto"/>
+      </w:pPr>
+      <w:r>
+        <w:continuationSeparator/>
+      </w:r>
+    </w:p>
+  </w:footnote>
+  <w:footnote w:id="1">
+    <w:p>
+      <w:pPr>
+        <w:pStyle w:val="FootnoteText"/>
+      </w:pPr>
+      <w:ins w:id="9" w:author="Ősz Olivér" w:date="2025-04-06T12:19:00Z" w16du:dateUtc="2025-04-06T10:19:00Z">
+        <w:r>
+          <w:rPr>
+            <w:rStyle w:val="FootnoteReference"/>
+          </w:rPr>
+          <w:footnoteRef/>
+        </w:r>
+        <w:r>
+          <w:t xml:space="preserve"> </w:t>
+        </w:r>
+        <w:r>
+          <w:t>https://github.com/miguelgrinberg/Flask-SocketIO</w:t>
+        </w:r>
+      </w:ins>
+    </w:p>
+  </w:footnote>
+</w:footnotes>
 </file>
 
 <file path=word/numbering.xml><?xml version="1.0" encoding="utf-8"?>
@@ -14259,6 +15383,14 @@
     <w:abstractNumId w:val="6"/>
   </w:num>
 </w:numbering>
+</file>
+
+<file path=word/people.xml><?xml version="1.0" encoding="utf-8"?>
+<w15:people xmlns:wpc="http://schemas.microsoft.com/office/word/2010/wordprocessingCanvas" xmlns:cx="http://schemas.microsoft.com/office/drawing/2014/chartex" xmlns:cx1="http://schemas.microsoft.com/office/drawing/2015/9/8/chartex" xmlns:cx2="http://schemas.microsoft.com/office/drawing/2015/10/21/chartex" xmlns:cx3="http://schemas.microsoft.com/office/drawing/2016/5/9/chartex" xmlns:cx4="http://schemas.microsoft.com/office/drawing/2016/5/10/chartex" xmlns:cx5="http://schemas.microsoft.com/office/drawing/2016/5/11/chartex" xmlns:cx6="http://schemas.microsoft.com/office/drawing/2016/5/12/chartex" xmlns:cx7="http://schemas.microsoft.com/office/drawing/2016/5/13/chartex" xmlns:cx8="http://schemas.microsoft.com/office/drawing/2016/5/14/chartex" xmlns:mc="http://schemas.openxmlformats.org/markup-compatibility/2006" xmlns:aink="http://schemas.microsoft.com/office/drawing/2016/ink" xmlns:am3d="http://schemas.microsoft.com/office/drawing/2017/model3d" xmlns:o="urn:schemas-microsoft-com:office:office" xmlns:oel="http://schemas.microsoft.com/office/2019/extlst" xmlns:r="http://schemas.openxmlformats.org/officeDocument/2006/relationships" xmlns:m="http://schemas.openxmlformats.org/officeDocument/2006/math" xmlns:v="urn:schemas-microsoft-com:vml" xmlns:wp14="http://schemas.microsoft.com/office/word/2010/wordprocessingDrawing" xmlns:wp="http://schemas.openxmlformats.org/drawingml/2006/wordprocessingDrawing" xmlns:w10="urn:schemas-microsoft-com:office:word" xmlns:w="http://schemas.openxmlformats.org/wordprocessingml/2006/main" xmlns:w14="http://schemas.microsoft.com/office/word/2010/wordml" xmlns:w15="http://schemas.microsoft.com/office/word/2012/wordml" xmlns:w16cex="http://schemas.microsoft.com/office/word/2018/wordml/cex" xmlns:w16cid="http://schemas.microsoft.com/office/word/2016/wordml/cid" xmlns:w16="http://schemas.microsoft.com/office/word/2018/wordml" xmlns:w16du="http://schemas.microsoft.com/office/word/2023/wordml/word16du" xmlns:w16sdtdh="http://schemas.microsoft.com/office/word/2020/wordml/sdtdatahash" xmlns:w16sdtfl="http://schemas.microsoft.com/office/word/2024/wordml/sdtformatlock" xmlns:w16se="http://schemas.microsoft.com/office/word/2015/wordml/symex" xmlns:wpg="http://schemas.microsoft.com/office/word/2010/wordprocessingGroup" xmlns:wpi="http://schemas.microsoft.com/office/word/2010/wordprocessingInk" xmlns:wne="http://schemas.microsoft.com/office/word/2006/wordml" xmlns:wps="http://schemas.microsoft.com/office/word/2010/wordprocessingShape" mc:Ignorable="w14 w15 w16se w16cid w16 w16cex w16sdtdh w16sdtfl w16du wp14">
+  <w15:person w15:author="Ősz Olivér">
+    <w15:presenceInfo w15:providerId="AD" w15:userId="S::osz.oliver@uni-sopron.hu::1d19cefb-20b7-4aac-956e-44821a417de0"/>
+  </w15:person>
+</w15:people>
 </file>
 
 <file path=word/styles.xml><?xml version="1.0" encoding="utf-8"?>
@@ -14658,15 +15790,15 @@
     <w:lsdException w:name="Unresolved Mention" w:semiHidden="1" w:unhideWhenUsed="1"/>
     <w:lsdException w:name="Smart Link" w:semiHidden="1" w:unhideWhenUsed="1"/>
   </w:latentStyles>
-  <w:style w:type="paragraph" w:default="1" w:styleId="Norml">
+  <w:style w:type="paragraph" w:default="1" w:styleId="Normal">
     <w:name w:val="Normal"/>
     <w:qFormat/>
   </w:style>
-  <w:style w:type="paragraph" w:styleId="Cmsor1">
+  <w:style w:type="paragraph" w:styleId="Heading1">
     <w:name w:val="heading 1"/>
-    <w:basedOn w:val="Norml"/>
-    <w:next w:val="Norml"/>
-    <w:link w:val="Cmsor1Char"/>
+    <w:basedOn w:val="Normal"/>
+    <w:next w:val="Normal"/>
+    <w:link w:val="Heading1Char"/>
     <w:uiPriority w:val="9"/>
     <w:qFormat/>
     <w:rsid w:val="00FE4DA5"/>
@@ -14683,11 +15815,11 @@
       <w:szCs w:val="40"/>
     </w:rPr>
   </w:style>
-  <w:style w:type="paragraph" w:styleId="Cmsor2">
+  <w:style w:type="paragraph" w:styleId="Heading2">
     <w:name w:val="heading 2"/>
-    <w:basedOn w:val="Norml"/>
-    <w:next w:val="Norml"/>
-    <w:link w:val="Cmsor2Char"/>
+    <w:basedOn w:val="Normal"/>
+    <w:next w:val="Normal"/>
+    <w:link w:val="Heading2Char"/>
     <w:uiPriority w:val="9"/>
     <w:semiHidden/>
     <w:unhideWhenUsed/>
@@ -14706,11 +15838,11 @@
       <w:szCs w:val="32"/>
     </w:rPr>
   </w:style>
-  <w:style w:type="paragraph" w:styleId="Cmsor3">
+  <w:style w:type="paragraph" w:styleId="Heading3">
     <w:name w:val="heading 3"/>
-    <w:basedOn w:val="Norml"/>
-    <w:next w:val="Norml"/>
-    <w:link w:val="Cmsor3Char"/>
+    <w:basedOn w:val="Normal"/>
+    <w:next w:val="Normal"/>
+    <w:link w:val="Heading3Char"/>
     <w:uiPriority w:val="9"/>
     <w:semiHidden/>
     <w:unhideWhenUsed/>
@@ -14729,11 +15861,11 @@
       <w:szCs w:val="28"/>
     </w:rPr>
   </w:style>
-  <w:style w:type="paragraph" w:styleId="Cmsor4">
+  <w:style w:type="paragraph" w:styleId="Heading4">
     <w:name w:val="heading 4"/>
-    <w:basedOn w:val="Norml"/>
-    <w:next w:val="Norml"/>
-    <w:link w:val="Cmsor4Char"/>
+    <w:basedOn w:val="Normal"/>
+    <w:next w:val="Normal"/>
+    <w:link w:val="Heading4Char"/>
     <w:uiPriority w:val="9"/>
     <w:semiHidden/>
     <w:unhideWhenUsed/>
@@ -14752,11 +15884,11 @@
       <w:color w:val="0F4761" w:themeColor="accent1" w:themeShade="BF"/>
     </w:rPr>
   </w:style>
-  <w:style w:type="paragraph" w:styleId="Cmsor5">
+  <w:style w:type="paragraph" w:styleId="Heading5">
     <w:name w:val="heading 5"/>
-    <w:basedOn w:val="Norml"/>
-    <w:next w:val="Norml"/>
-    <w:link w:val="Cmsor5Char"/>
+    <w:basedOn w:val="Normal"/>
+    <w:next w:val="Normal"/>
+    <w:link w:val="Heading5Char"/>
     <w:uiPriority w:val="9"/>
     <w:semiHidden/>
     <w:unhideWhenUsed/>
@@ -14773,11 +15905,11 @@
       <w:color w:val="0F4761" w:themeColor="accent1" w:themeShade="BF"/>
     </w:rPr>
   </w:style>
-  <w:style w:type="paragraph" w:styleId="Cmsor6">
+  <w:style w:type="paragraph" w:styleId="Heading6">
     <w:name w:val="heading 6"/>
-    <w:basedOn w:val="Norml"/>
-    <w:next w:val="Norml"/>
-    <w:link w:val="Cmsor6Char"/>
+    <w:basedOn w:val="Normal"/>
+    <w:next w:val="Normal"/>
+    <w:link w:val="Heading6Char"/>
     <w:uiPriority w:val="9"/>
     <w:semiHidden/>
     <w:unhideWhenUsed/>
@@ -14796,11 +15928,11 @@
       <w:color w:val="595959" w:themeColor="text1" w:themeTint="A6"/>
     </w:rPr>
   </w:style>
-  <w:style w:type="paragraph" w:styleId="Cmsor7">
+  <w:style w:type="paragraph" w:styleId="Heading7">
     <w:name w:val="heading 7"/>
-    <w:basedOn w:val="Norml"/>
-    <w:next w:val="Norml"/>
-    <w:link w:val="Cmsor7Char"/>
+    <w:basedOn w:val="Normal"/>
+    <w:next w:val="Normal"/>
+    <w:link w:val="Heading7Char"/>
     <w:uiPriority w:val="9"/>
     <w:semiHidden/>
     <w:unhideWhenUsed/>
@@ -14817,11 +15949,11 @@
       <w:color w:val="595959" w:themeColor="text1" w:themeTint="A6"/>
     </w:rPr>
   </w:style>
-  <w:style w:type="paragraph" w:styleId="Cmsor8">
+  <w:style w:type="paragraph" w:styleId="Heading8">
     <w:name w:val="heading 8"/>
-    <w:basedOn w:val="Norml"/>
-    <w:next w:val="Norml"/>
-    <w:link w:val="Cmsor8Char"/>
+    <w:basedOn w:val="Normal"/>
+    <w:next w:val="Normal"/>
+    <w:link w:val="Heading8Char"/>
     <w:uiPriority w:val="9"/>
     <w:semiHidden/>
     <w:unhideWhenUsed/>
@@ -14840,11 +15972,11 @@
       <w:color w:val="272727" w:themeColor="text1" w:themeTint="D8"/>
     </w:rPr>
   </w:style>
-  <w:style w:type="paragraph" w:styleId="Cmsor9">
+  <w:style w:type="paragraph" w:styleId="Heading9">
     <w:name w:val="heading 9"/>
-    <w:basedOn w:val="Norml"/>
-    <w:next w:val="Norml"/>
-    <w:link w:val="Cmsor9Char"/>
+    <w:basedOn w:val="Normal"/>
+    <w:next w:val="Normal"/>
+    <w:link w:val="Heading9Char"/>
     <w:uiPriority w:val="9"/>
     <w:semiHidden/>
     <w:unhideWhenUsed/>
@@ -14861,13 +15993,13 @@
       <w:color w:val="272727" w:themeColor="text1" w:themeTint="D8"/>
     </w:rPr>
   </w:style>
-  <w:style w:type="character" w:default="1" w:styleId="Bekezdsalapbettpusa">
+  <w:style w:type="character" w:default="1" w:styleId="DefaultParagraphFont">
     <w:name w:val="Default Paragraph Font"/>
     <w:uiPriority w:val="1"/>
     <w:semiHidden/>
     <w:unhideWhenUsed/>
   </w:style>
-  <w:style w:type="table" w:default="1" w:styleId="Normltblzat">
+  <w:style w:type="table" w:default="1" w:styleId="TableNormal">
     <w:name w:val="Normal Table"/>
     <w:uiPriority w:val="99"/>
     <w:semiHidden/>
@@ -14882,16 +16014,16 @@
       </w:tblCellMar>
     </w:tblPr>
   </w:style>
-  <w:style w:type="numbering" w:default="1" w:styleId="Nemlista">
+  <w:style w:type="numbering" w:default="1" w:styleId="NoList">
     <w:name w:val="No List"/>
     <w:uiPriority w:val="99"/>
     <w:semiHidden/>
     <w:unhideWhenUsed/>
   </w:style>
-  <w:style w:type="character" w:customStyle="1" w:styleId="Cmsor1Char">
-    <w:name w:val="Címsor 1 Char"/>
-    <w:basedOn w:val="Bekezdsalapbettpusa"/>
-    <w:link w:val="Cmsor1"/>
+  <w:style w:type="character" w:customStyle="1" w:styleId="Heading1Char">
+    <w:name w:val="Heading 1 Char"/>
+    <w:basedOn w:val="DefaultParagraphFont"/>
+    <w:link w:val="Heading1"/>
     <w:uiPriority w:val="9"/>
     <w:rsid w:val="00FE4DA5"/>
     <w:rPr>
@@ -14901,10 +16033,10 @@
       <w:szCs w:val="40"/>
     </w:rPr>
   </w:style>
-  <w:style w:type="character" w:customStyle="1" w:styleId="Cmsor2Char">
-    <w:name w:val="Címsor 2 Char"/>
-    <w:basedOn w:val="Bekezdsalapbettpusa"/>
-    <w:link w:val="Cmsor2"/>
+  <w:style w:type="character" w:customStyle="1" w:styleId="Heading2Char">
+    <w:name w:val="Heading 2 Char"/>
+    <w:basedOn w:val="DefaultParagraphFont"/>
+    <w:link w:val="Heading2"/>
     <w:uiPriority w:val="9"/>
     <w:semiHidden/>
     <w:rsid w:val="00FE4DA5"/>
@@ -14915,10 +16047,10 @@
       <w:szCs w:val="32"/>
     </w:rPr>
   </w:style>
-  <w:style w:type="character" w:customStyle="1" w:styleId="Cmsor3Char">
-    <w:name w:val="Címsor 3 Char"/>
-    <w:basedOn w:val="Bekezdsalapbettpusa"/>
-    <w:link w:val="Cmsor3"/>
+  <w:style w:type="character" w:customStyle="1" w:styleId="Heading3Char">
+    <w:name w:val="Heading 3 Char"/>
+    <w:basedOn w:val="DefaultParagraphFont"/>
+    <w:link w:val="Heading3"/>
     <w:uiPriority w:val="9"/>
     <w:semiHidden/>
     <w:rsid w:val="00FE4DA5"/>
@@ -14929,10 +16061,10 @@
       <w:szCs w:val="28"/>
     </w:rPr>
   </w:style>
-  <w:style w:type="character" w:customStyle="1" w:styleId="Cmsor4Char">
-    <w:name w:val="Címsor 4 Char"/>
-    <w:basedOn w:val="Bekezdsalapbettpusa"/>
-    <w:link w:val="Cmsor4"/>
+  <w:style w:type="character" w:customStyle="1" w:styleId="Heading4Char">
+    <w:name w:val="Heading 4 Char"/>
+    <w:basedOn w:val="DefaultParagraphFont"/>
+    <w:link w:val="Heading4"/>
     <w:uiPriority w:val="9"/>
     <w:semiHidden/>
     <w:rsid w:val="00FE4DA5"/>
@@ -14943,10 +16075,10 @@
       <w:color w:val="0F4761" w:themeColor="accent1" w:themeShade="BF"/>
     </w:rPr>
   </w:style>
-  <w:style w:type="character" w:customStyle="1" w:styleId="Cmsor5Char">
-    <w:name w:val="Címsor 5 Char"/>
-    <w:basedOn w:val="Bekezdsalapbettpusa"/>
-    <w:link w:val="Cmsor5"/>
+  <w:style w:type="character" w:customStyle="1" w:styleId="Heading5Char">
+    <w:name w:val="Heading 5 Char"/>
+    <w:basedOn w:val="DefaultParagraphFont"/>
+    <w:link w:val="Heading5"/>
     <w:uiPriority w:val="9"/>
     <w:semiHidden/>
     <w:rsid w:val="00FE4DA5"/>
@@ -14955,10 +16087,10 @@
       <w:color w:val="0F4761" w:themeColor="accent1" w:themeShade="BF"/>
     </w:rPr>
   </w:style>
-  <w:style w:type="character" w:customStyle="1" w:styleId="Cmsor6Char">
-    <w:name w:val="Címsor 6 Char"/>
-    <w:basedOn w:val="Bekezdsalapbettpusa"/>
-    <w:link w:val="Cmsor6"/>
+  <w:style w:type="character" w:customStyle="1" w:styleId="Heading6Char">
+    <w:name w:val="Heading 6 Char"/>
+    <w:basedOn w:val="DefaultParagraphFont"/>
+    <w:link w:val="Heading6"/>
     <w:uiPriority w:val="9"/>
     <w:semiHidden/>
     <w:rsid w:val="00FE4DA5"/>
@@ -14969,10 +16101,10 @@
       <w:color w:val="595959" w:themeColor="text1" w:themeTint="A6"/>
     </w:rPr>
   </w:style>
-  <w:style w:type="character" w:customStyle="1" w:styleId="Cmsor7Char">
-    <w:name w:val="Címsor 7 Char"/>
-    <w:basedOn w:val="Bekezdsalapbettpusa"/>
-    <w:link w:val="Cmsor7"/>
+  <w:style w:type="character" w:customStyle="1" w:styleId="Heading7Char">
+    <w:name w:val="Heading 7 Char"/>
+    <w:basedOn w:val="DefaultParagraphFont"/>
+    <w:link w:val="Heading7"/>
     <w:uiPriority w:val="9"/>
     <w:semiHidden/>
     <w:rsid w:val="00FE4DA5"/>
@@ -14981,10 +16113,10 @@
       <w:color w:val="595959" w:themeColor="text1" w:themeTint="A6"/>
     </w:rPr>
   </w:style>
-  <w:style w:type="character" w:customStyle="1" w:styleId="Cmsor8Char">
-    <w:name w:val="Címsor 8 Char"/>
-    <w:basedOn w:val="Bekezdsalapbettpusa"/>
-    <w:link w:val="Cmsor8"/>
+  <w:style w:type="character" w:customStyle="1" w:styleId="Heading8Char">
+    <w:name w:val="Heading 8 Char"/>
+    <w:basedOn w:val="DefaultParagraphFont"/>
+    <w:link w:val="Heading8"/>
     <w:uiPriority w:val="9"/>
     <w:semiHidden/>
     <w:rsid w:val="00FE4DA5"/>
@@ -14995,10 +16127,10 @@
       <w:color w:val="272727" w:themeColor="text1" w:themeTint="D8"/>
     </w:rPr>
   </w:style>
-  <w:style w:type="character" w:customStyle="1" w:styleId="Cmsor9Char">
-    <w:name w:val="Címsor 9 Char"/>
-    <w:basedOn w:val="Bekezdsalapbettpusa"/>
-    <w:link w:val="Cmsor9"/>
+  <w:style w:type="character" w:customStyle="1" w:styleId="Heading9Char">
+    <w:name w:val="Heading 9 Char"/>
+    <w:basedOn w:val="DefaultParagraphFont"/>
+    <w:link w:val="Heading9"/>
     <w:uiPriority w:val="9"/>
     <w:semiHidden/>
     <w:rsid w:val="00FE4DA5"/>
@@ -15007,11 +16139,11 @@
       <w:color w:val="272727" w:themeColor="text1" w:themeTint="D8"/>
     </w:rPr>
   </w:style>
-  <w:style w:type="paragraph" w:styleId="Cm">
+  <w:style w:type="paragraph" w:styleId="Title">
     <w:name w:val="Title"/>
-    <w:basedOn w:val="Norml"/>
-    <w:next w:val="Norml"/>
-    <w:link w:val="CmChar"/>
+    <w:basedOn w:val="Normal"/>
+    <w:next w:val="Normal"/>
+    <w:link w:val="TitleChar"/>
     <w:uiPriority w:val="10"/>
     <w:qFormat/>
     <w:rsid w:val="00FE4DA5"/>
@@ -15027,10 +16159,10 @@
       <w:szCs w:val="56"/>
     </w:rPr>
   </w:style>
-  <w:style w:type="character" w:customStyle="1" w:styleId="CmChar">
-    <w:name w:val="Cím Char"/>
-    <w:basedOn w:val="Bekezdsalapbettpusa"/>
-    <w:link w:val="Cm"/>
+  <w:style w:type="character" w:customStyle="1" w:styleId="TitleChar">
+    <w:name w:val="Title Char"/>
+    <w:basedOn w:val="DefaultParagraphFont"/>
+    <w:link w:val="Title"/>
     <w:uiPriority w:val="10"/>
     <w:rsid w:val="00FE4DA5"/>
     <w:rPr>
@@ -15041,11 +16173,11 @@
       <w:szCs w:val="56"/>
     </w:rPr>
   </w:style>
-  <w:style w:type="paragraph" w:styleId="Alcm">
+  <w:style w:type="paragraph" w:styleId="Subtitle">
     <w:name w:val="Subtitle"/>
-    <w:basedOn w:val="Norml"/>
-    <w:next w:val="Norml"/>
-    <w:link w:val="AlcmChar"/>
+    <w:basedOn w:val="Normal"/>
+    <w:next w:val="Normal"/>
+    <w:link w:val="SubtitleChar"/>
     <w:uiPriority w:val="11"/>
     <w:qFormat/>
     <w:rsid w:val="00FE4DA5"/>
@@ -15062,10 +16194,10 @@
       <w:szCs w:val="28"/>
     </w:rPr>
   </w:style>
-  <w:style w:type="character" w:customStyle="1" w:styleId="AlcmChar">
-    <w:name w:val="Alcím Char"/>
-    <w:basedOn w:val="Bekezdsalapbettpusa"/>
-    <w:link w:val="Alcm"/>
+  <w:style w:type="character" w:customStyle="1" w:styleId="SubtitleChar">
+    <w:name w:val="Subtitle Char"/>
+    <w:basedOn w:val="DefaultParagraphFont"/>
+    <w:link w:val="Subtitle"/>
     <w:uiPriority w:val="11"/>
     <w:rsid w:val="00FE4DA5"/>
     <w:rPr>
@@ -15076,11 +16208,11 @@
       <w:szCs w:val="28"/>
     </w:rPr>
   </w:style>
-  <w:style w:type="paragraph" w:styleId="Idzet">
+  <w:style w:type="paragraph" w:styleId="Quote">
     <w:name w:val="Quote"/>
-    <w:basedOn w:val="Norml"/>
-    <w:next w:val="Norml"/>
-    <w:link w:val="IdzetChar"/>
+    <w:basedOn w:val="Normal"/>
+    <w:next w:val="Normal"/>
+    <w:link w:val="QuoteChar"/>
     <w:uiPriority w:val="29"/>
     <w:qFormat/>
     <w:rsid w:val="00FE4DA5"/>
@@ -15094,10 +16226,10 @@
       <w:color w:val="404040" w:themeColor="text1" w:themeTint="BF"/>
     </w:rPr>
   </w:style>
-  <w:style w:type="character" w:customStyle="1" w:styleId="IdzetChar">
-    <w:name w:val="Idézet Char"/>
-    <w:basedOn w:val="Bekezdsalapbettpusa"/>
-    <w:link w:val="Idzet"/>
+  <w:style w:type="character" w:customStyle="1" w:styleId="QuoteChar">
+    <w:name w:val="Quote Char"/>
+    <w:basedOn w:val="DefaultParagraphFont"/>
+    <w:link w:val="Quote"/>
     <w:uiPriority w:val="29"/>
     <w:rsid w:val="00FE4DA5"/>
     <w:rPr>
@@ -15106,9 +16238,9 @@
       <w:color w:val="404040" w:themeColor="text1" w:themeTint="BF"/>
     </w:rPr>
   </w:style>
-  <w:style w:type="paragraph" w:styleId="Listaszerbekezds">
+  <w:style w:type="paragraph" w:styleId="ListParagraph">
     <w:name w:val="List Paragraph"/>
-    <w:basedOn w:val="Norml"/>
+    <w:basedOn w:val="Normal"/>
     <w:uiPriority w:val="34"/>
     <w:qFormat/>
     <w:rsid w:val="00FE4DA5"/>
@@ -15117,9 +16249,9 @@
       <w:contextualSpacing/>
     </w:pPr>
   </w:style>
-  <w:style w:type="character" w:styleId="Erskiemels">
+  <w:style w:type="character" w:styleId="IntenseEmphasis">
     <w:name w:val="Intense Emphasis"/>
-    <w:basedOn w:val="Bekezdsalapbettpusa"/>
+    <w:basedOn w:val="DefaultParagraphFont"/>
     <w:uiPriority w:val="21"/>
     <w:qFormat/>
     <w:rsid w:val="00FE4DA5"/>
@@ -15129,11 +16261,11 @@
       <w:color w:val="0F4761" w:themeColor="accent1" w:themeShade="BF"/>
     </w:rPr>
   </w:style>
-  <w:style w:type="paragraph" w:styleId="Kiemeltidzet">
+  <w:style w:type="paragraph" w:styleId="IntenseQuote">
     <w:name w:val="Intense Quote"/>
-    <w:basedOn w:val="Norml"/>
-    <w:next w:val="Norml"/>
-    <w:link w:val="KiemeltidzetChar"/>
+    <w:basedOn w:val="Normal"/>
+    <w:next w:val="Normal"/>
+    <w:link w:val="IntenseQuoteChar"/>
     <w:uiPriority w:val="30"/>
     <w:qFormat/>
     <w:rsid w:val="00FE4DA5"/>
@@ -15152,10 +16284,10 @@
       <w:color w:val="0F4761" w:themeColor="accent1" w:themeShade="BF"/>
     </w:rPr>
   </w:style>
-  <w:style w:type="character" w:customStyle="1" w:styleId="KiemeltidzetChar">
-    <w:name w:val="Kiemelt idézet Char"/>
-    <w:basedOn w:val="Bekezdsalapbettpusa"/>
-    <w:link w:val="Kiemeltidzet"/>
+  <w:style w:type="character" w:customStyle="1" w:styleId="IntenseQuoteChar">
+    <w:name w:val="Intense Quote Char"/>
+    <w:basedOn w:val="DefaultParagraphFont"/>
+    <w:link w:val="IntenseQuote"/>
     <w:uiPriority w:val="30"/>
     <w:rsid w:val="00FE4DA5"/>
     <w:rPr>
@@ -15164,9 +16296,9 @@
       <w:color w:val="0F4761" w:themeColor="accent1" w:themeShade="BF"/>
     </w:rPr>
   </w:style>
-  <w:style w:type="character" w:styleId="Ershivatkozs">
+  <w:style w:type="character" w:styleId="IntenseReference">
     <w:name w:val="Intense Reference"/>
-    <w:basedOn w:val="Bekezdsalapbettpusa"/>
+    <w:basedOn w:val="DefaultParagraphFont"/>
     <w:uiPriority w:val="32"/>
     <w:qFormat/>
     <w:rsid w:val="00FE4DA5"/>
@@ -15178,9 +16310,9 @@
       <w:spacing w:val="5"/>
     </w:rPr>
   </w:style>
-  <w:style w:type="character" w:styleId="Jegyzethivatkozs">
+  <w:style w:type="character" w:styleId="CommentReference">
     <w:name w:val="annotation reference"/>
-    <w:basedOn w:val="Bekezdsalapbettpusa"/>
+    <w:basedOn w:val="DefaultParagraphFont"/>
     <w:uiPriority w:val="99"/>
     <w:semiHidden/>
     <w:unhideWhenUsed/>
@@ -15190,10 +16322,10 @@
       <w:szCs w:val="16"/>
     </w:rPr>
   </w:style>
-  <w:style w:type="paragraph" w:styleId="Jegyzetszveg">
+  <w:style w:type="paragraph" w:styleId="CommentText">
     <w:name w:val="annotation text"/>
-    <w:basedOn w:val="Norml"/>
-    <w:link w:val="JegyzetszvegChar"/>
+    <w:basedOn w:val="Normal"/>
+    <w:link w:val="CommentTextChar"/>
     <w:uiPriority w:val="99"/>
     <w:unhideWhenUsed/>
     <w:rsid w:val="00224D70"/>
@@ -15207,10 +16339,10 @@
       <w:szCs w:val="20"/>
     </w:rPr>
   </w:style>
-  <w:style w:type="character" w:customStyle="1" w:styleId="JegyzetszvegChar">
-    <w:name w:val="Jegyzetszöveg Char"/>
-    <w:basedOn w:val="Bekezdsalapbettpusa"/>
-    <w:link w:val="Jegyzetszveg"/>
+  <w:style w:type="character" w:customStyle="1" w:styleId="CommentTextChar">
+    <w:name w:val="Comment Text Char"/>
+    <w:basedOn w:val="DefaultParagraphFont"/>
+    <w:link w:val="CommentText"/>
     <w:uiPriority w:val="99"/>
     <w:rsid w:val="00224D70"/>
     <w:rPr>
@@ -15219,10 +16351,10 @@
       <w:szCs w:val="20"/>
     </w:rPr>
   </w:style>
-  <w:style w:type="paragraph" w:styleId="TJ1">
+  <w:style w:type="paragraph" w:styleId="TOC1">
     <w:name w:val="toc 1"/>
-    <w:basedOn w:val="Norml"/>
-    <w:next w:val="Norml"/>
+    <w:basedOn w:val="Normal"/>
+    <w:next w:val="Normal"/>
     <w:autoRedefine/>
     <w:uiPriority w:val="39"/>
     <w:unhideWhenUsed/>
@@ -15231,10 +16363,10 @@
       <w:spacing w:after="100"/>
     </w:pPr>
   </w:style>
-  <w:style w:type="paragraph" w:styleId="TJ2">
+  <w:style w:type="paragraph" w:styleId="TOC2">
     <w:name w:val="toc 2"/>
-    <w:basedOn w:val="Norml"/>
-    <w:next w:val="Norml"/>
+    <w:basedOn w:val="Normal"/>
+    <w:next w:val="Normal"/>
     <w:autoRedefine/>
     <w:uiPriority w:val="39"/>
     <w:unhideWhenUsed/>
@@ -15244,15 +16376,109 @@
       <w:ind w:left="220"/>
     </w:pPr>
   </w:style>
-  <w:style w:type="character" w:styleId="Hiperhivatkozs">
+  <w:style w:type="character" w:styleId="Hyperlink">
     <w:name w:val="Hyperlink"/>
-    <w:basedOn w:val="Bekezdsalapbettpusa"/>
+    <w:basedOn w:val="DefaultParagraphFont"/>
     <w:uiPriority w:val="99"/>
     <w:unhideWhenUsed/>
     <w:rsid w:val="00224D70"/>
     <w:rPr>
       <w:color w:val="467886" w:themeColor="hyperlink"/>
       <w:u w:val="single"/>
+    </w:rPr>
+  </w:style>
+  <w:style w:type="paragraph" w:styleId="Revision">
+    <w:name w:val="Revision"/>
+    <w:hidden/>
+    <w:uiPriority w:val="99"/>
+    <w:semiHidden/>
+    <w:rsid w:val="002C7E9B"/>
+    <w:pPr>
+      <w:spacing w:after="0" w:line="240" w:lineRule="auto"/>
+    </w:pPr>
+  </w:style>
+  <w:style w:type="paragraph" w:styleId="FootnoteText">
+    <w:name w:val="footnote text"/>
+    <w:basedOn w:val="Normal"/>
+    <w:link w:val="FootnoteTextChar"/>
+    <w:uiPriority w:val="99"/>
+    <w:semiHidden/>
+    <w:unhideWhenUsed/>
+    <w:rsid w:val="00EE1EC2"/>
+    <w:pPr>
+      <w:spacing w:after="0" w:line="240" w:lineRule="auto"/>
+    </w:pPr>
+    <w:rPr>
+      <w:sz w:val="20"/>
+      <w:szCs w:val="20"/>
+    </w:rPr>
+  </w:style>
+  <w:style w:type="character" w:customStyle="1" w:styleId="FootnoteTextChar">
+    <w:name w:val="Footnote Text Char"/>
+    <w:basedOn w:val="DefaultParagraphFont"/>
+    <w:link w:val="FootnoteText"/>
+    <w:uiPriority w:val="99"/>
+    <w:semiHidden/>
+    <w:rsid w:val="00EE1EC2"/>
+    <w:rPr>
+      <w:sz w:val="20"/>
+      <w:szCs w:val="20"/>
+    </w:rPr>
+  </w:style>
+  <w:style w:type="character" w:styleId="FootnoteReference">
+    <w:name w:val="footnote reference"/>
+    <w:basedOn w:val="DefaultParagraphFont"/>
+    <w:uiPriority w:val="99"/>
+    <w:semiHidden/>
+    <w:unhideWhenUsed/>
+    <w:rsid w:val="00EE1EC2"/>
+    <w:rPr>
+      <w:vertAlign w:val="superscript"/>
+    </w:rPr>
+  </w:style>
+  <w:style w:type="paragraph" w:styleId="CommentSubject">
+    <w:name w:val="annotation subject"/>
+    <w:basedOn w:val="CommentText"/>
+    <w:next w:val="CommentText"/>
+    <w:link w:val="CommentSubjectChar"/>
+    <w:uiPriority w:val="99"/>
+    <w:semiHidden/>
+    <w:unhideWhenUsed/>
+    <w:rsid w:val="002F73EF"/>
+    <w:pPr>
+      <w:jc w:val="left"/>
+    </w:pPr>
+    <w:rPr>
+      <w:rFonts w:asciiTheme="minorHAnsi" w:hAnsiTheme="minorHAnsi"/>
+      <w:b/>
+      <w:bCs/>
+    </w:rPr>
+  </w:style>
+  <w:style w:type="character" w:customStyle="1" w:styleId="CommentSubjectChar">
+    <w:name w:val="Comment Subject Char"/>
+    <w:basedOn w:val="CommentTextChar"/>
+    <w:link w:val="CommentSubject"/>
+    <w:uiPriority w:val="99"/>
+    <w:semiHidden/>
+    <w:rsid w:val="002F73EF"/>
+    <w:rPr>
+      <w:rFonts w:ascii="Times New Roman" w:hAnsi="Times New Roman"/>
+      <w:b/>
+      <w:bCs/>
+      <w:sz w:val="20"/>
+      <w:szCs w:val="20"/>
+    </w:rPr>
+  </w:style>
+  <w:style w:type="character" w:styleId="UnresolvedMention">
+    <w:name w:val="Unresolved Mention"/>
+    <w:basedOn w:val="DefaultParagraphFont"/>
+    <w:uiPriority w:val="99"/>
+    <w:semiHidden/>
+    <w:unhideWhenUsed/>
+    <w:rsid w:val="00907806"/>
+    <w:rPr>
+      <w:color w:val="605E5C"/>
+      <w:shd w:val="clear" w:color="auto" w:fill="E1DFDD"/>
     </w:rPr>
   </w:style>
 </w:styles>
@@ -15551,4 +16777,16 @@
     </a:ext>
   </a:extLst>
 </a:theme>
+</file>
+
+<file path=customXml/item1.xml><?xml version="1.0" encoding="utf-8"?>
+<b:Sources xmlns:b="http://schemas.openxmlformats.org/officeDocument/2006/bibliography" xmlns="http://schemas.openxmlformats.org/officeDocument/2006/bibliography" SelectedStyle="\APASixthEditionOfficeOnline.xsl" StyleName="APA" Version="6"/>
+</file>
+
+<file path=customXml/itemProps1.xml><?xml version="1.0" encoding="utf-8"?>
+<ds:datastoreItem xmlns:ds="http://schemas.openxmlformats.org/officeDocument/2006/customXml" ds:itemID="{C559AAE1-2615-49B7-8949-3358734CF026}">
+  <ds:schemaRefs>
+    <ds:schemaRef ds:uri="http://schemas.openxmlformats.org/officeDocument/2006/bibliography"/>
+  </ds:schemaRefs>
+</ds:datastoreItem>
 </file>
</xml_diff>